<commit_message>
Rebuild MAT282 midterm: 40 points / 40 minutes, LINEST layout table, small t-test dataset, no z-scores
Replaces the earlier package. Practice plus Versions A and B as PDF and DOCX with keys and a guide.

Co-Authored-By: Claude Sonnet 5.5 <noreply@anthropic.com>
Claude-Session: https://claude.ai/code/session_01GnALAqXrg6eVpGEYyKo1Pf
</commit_message>
<xml_diff>
--- a/mat282_midterm/MAT282_PRACTICE_Midterm_KEY.docx
+++ b/mat282_midterm/MAT282_PRACTICE_Midterm_KEY.docx
@@ -13,7 +13,7 @@
           <w:sz w:val="17"/>
           <w:szCs w:val="17"/>
         </w:rPr>
-        <w:t xml:space="preserve">MAT282 · INTERMEDIATE STATISTICS · FALL 2026 · PRACTICE ANSWER KEY</w:t>
+        <w:t xml:space="preserve">MAT282 · INTERMEDIATE STATISTICS · FALL 2026 · FORM P · PRACTICE</w:t>
       </w:r>
     </w:p>
     <w:p>
@@ -56,7 +56,7 @@
           <w:sz w:val="18"/>
           <w:szCs w:val="18"/>
         </w:rPr>
-        <w:t xml:space="preserve">Marking guide and worked solutions · 50 points · may be shared with students after the review</w:t>
+        <w:t xml:space="preserve">Marking guide and worked solutions · 40 points · may be shared with students after the review</w:t>
       </w:r>
     </w:p>
     <w:tbl>
@@ -104,15 +104,15 @@
                 <w:sz w:val="18"/>
                 <w:szCs w:val="18"/>
               </w:rPr>
-              <w:t xml:space="preserve">Read this first.</w:t>
-            </w:r>
-            <w:r>
-              <w:rPr>
-                <w:rFonts w:ascii="Arial" w:cs="Arial" w:eastAsia="Arial" w:hAnsi="Arial"/>
-                <w:sz w:val="18"/>
-                <w:szCs w:val="18"/>
-              </w:rPr>
-              <w:t xml:space="preserve"> This practice trains the same skills as the real midterm through different questions and a different kind of result (a surprising sign, two variables that cannot be separated, an extreme day the model cannot explain). Aim to understand why each step works. Stages 1, 6 and parts of the others reward </w:t>
+              <w:t xml:space="preserve">How to mark.</w:t>
+            </w:r>
+            <w:r>
+              <w:rPr>
+                <w:rFonts w:ascii="Arial" w:cs="Arial" w:eastAsia="Arial" w:hAnsi="Arial"/>
+                <w:sz w:val="18"/>
+                <w:szCs w:val="18"/>
+              </w:rPr>
+              <w:t xml:space="preserve"> Sections 1 and 5 and the explanation parts of the others reward </w:t>
             </w:r>
             <w:r>
               <w:rPr>
@@ -122,15 +122,69 @@
                 <w:sz w:val="18"/>
                 <w:szCs w:val="18"/>
               </w:rPr>
-              <w:t xml:space="preserve">reasoning defended with a reason or a number</w:t>
-            </w:r>
-            <w:r>
-              <w:rPr>
-                <w:rFonts w:ascii="Arial" w:cs="Arial" w:eastAsia="Arial" w:hAnsi="Arial"/>
-                <w:sz w:val="18"/>
-                <w:szCs w:val="18"/>
-              </w:rPr>
-              <w:t xml:space="preserve">; apply follow-through. Rules of thumb on the reference sheet: |z| &gt; 2 unusual, |t| &gt; 2 significant, |r| &gt; 0.7 heavy overlap. Objective: </w:t>
+              <w:t xml:space="preserve">sensible reasoning that is defended with a reason or a number</w:t>
+            </w:r>
+            <w:r>
+              <w:rPr>
+                <w:rFonts w:ascii="Arial" w:cs="Arial" w:eastAsia="Arial" w:hAnsi="Arial"/>
+                <w:sz w:val="18"/>
+                <w:szCs w:val="18"/>
+              </w:rPr>
+              <w:t xml:space="preserve">; there is no single right model. Apply </w:t>
+            </w:r>
+            <w:r>
+              <w:rPr>
+                <w:rFonts w:ascii="Arial" w:cs="Arial" w:eastAsia="Arial" w:hAnsi="Arial"/>
+                <w:b/>
+                <w:bCs/>
+                <w:sz w:val="18"/>
+                <w:szCs w:val="18"/>
+              </w:rPr>
+              <w:t xml:space="preserve">follow-through</w:t>
+            </w:r>
+            <w:r>
+              <w:rPr>
+                <w:rFonts w:ascii="Arial" w:cs="Arial" w:eastAsia="Arial" w:hAnsi="Arial"/>
+                <w:sz w:val="18"/>
+                <w:szCs w:val="18"/>
+              </w:rPr>
+              <w:t xml:space="preserve"> from earlier answers. Accept rounding differences of ±0.02 in s and t and ±0.5 in forecasts. Rules used in this paper: a coefficient is </w:t>
+            </w:r>
+            <w:r>
+              <w:rPr>
+                <w:rFonts w:ascii="Arial" w:cs="Arial" w:eastAsia="Arial" w:hAnsi="Arial"/>
+                <w:b/>
+                <w:bCs/>
+                <w:sz w:val="18"/>
+                <w:szCs w:val="18"/>
+              </w:rPr>
+              <w:t xml:space="preserve">clearly different from zero if it is more than 2 standard errors from zero</w:t>
+            </w:r>
+            <w:r>
+              <w:rPr>
+                <w:rFonts w:ascii="Arial" w:cs="Arial" w:eastAsia="Arial" w:hAnsi="Arial"/>
+                <w:sz w:val="18"/>
+                <w:szCs w:val="18"/>
+              </w:rPr>
+              <w:t xml:space="preserve">; a t-test is </w:t>
+            </w:r>
+            <w:r>
+              <w:rPr>
+                <w:rFonts w:ascii="Arial" w:cs="Arial" w:eastAsia="Arial" w:hAnsi="Arial"/>
+                <w:b/>
+                <w:bCs/>
+                <w:sz w:val="18"/>
+                <w:szCs w:val="18"/>
+              </w:rPr>
+              <w:t xml:space="preserve">significant if p &lt; 0.05</w:t>
+            </w:r>
+            <w:r>
+              <w:rPr>
+                <w:rFonts w:ascii="Arial" w:cs="Arial" w:eastAsia="Arial" w:hAnsi="Arial"/>
+                <w:sz w:val="18"/>
+                <w:szCs w:val="18"/>
+              </w:rPr>
+              <w:t xml:space="preserve"> (two-tailed, T.TEST type 2); critical t for df = 8 is 2.31. Objective column: syllabus learning outcome (LO) and your category, </w:t>
             </w:r>
             <w:r>
               <w:rPr>
@@ -226,9 +280,9 @@
         </w:tblBorders>
       </w:tblPr>
       <w:tblGrid>
-        <w:gridCol w:w="500"/>
+        <w:gridCol w:w="700"/>
         <w:gridCol w:w="1500"/>
-        <w:gridCol w:w="5700"/>
+        <w:gridCol w:w="5500"/>
         <w:gridCol w:w="500"/>
         <w:gridCol w:w="2000"/>
       </w:tblGrid>
@@ -238,7 +292,7 @@
         </w:trPr>
         <w:tc>
           <w:tcPr>
-            <w:tcW w:type="dxa" w:w="500"/>
+            <w:tcW w:type="dxa" w:w="700"/>
             <w:tcBorders>
               <w:top w:val="single" w:color="808080" w:sz="4"/>
               <w:left w:val="single" w:color="808080" w:sz="4"/>
@@ -308,7 +362,7 @@
         </w:tc>
         <w:tc>
           <w:tcPr>
-            <w:tcW w:type="dxa" w:w="5700"/>
+            <w:tcW w:type="dxa" w:w="5500"/>
             <w:tcBorders>
               <w:top w:val="single" w:color="808080" w:sz="4"/>
               <w:left w:val="single" w:color="808080" w:sz="4"/>
@@ -418,7 +472,7 @@
         </w:trPr>
         <w:tc>
           <w:tcPr>
-            <w:tcW w:type="dxa" w:w="500"/>
+            <w:tcW w:type="dxa" w:w="700"/>
             <w:tcBorders>
               <w:top w:val="single" w:color="808080" w:sz="4"/>
               <w:left w:val="single" w:color="808080" w:sz="4"/>
@@ -446,7 +500,7 @@
                 <w:sz w:val="18"/>
                 <w:szCs w:val="18"/>
               </w:rPr>
-              <w:t xml:space="preserve">1</w:t>
+              <w:t xml:space="preserve">1a</w:t>
             </w:r>
           </w:p>
         </w:tc>
@@ -486,35 +540,35 @@
         </w:tc>
         <w:tc>
           <w:tcPr>
-            <w:tcW w:type="dxa" w:w="5700"/>
-            <w:tcBorders>
-              <w:top w:val="single" w:color="808080" w:sz="4"/>
-              <w:left w:val="single" w:color="808080" w:sz="4"/>
-              <w:bottom w:val="single" w:color="808080" w:sz="4"/>
-              <w:right w:val="single" w:color="808080" w:sz="4"/>
-            </w:tcBorders>
-            <w:tcMar>
-              <w:top w:type="dxa" w:w="40"/>
-              <w:left w:type="dxa" w:w="80"/>
-              <w:bottom w:type="dxa" w:w="40"/>
-              <w:right w:type="dxa" w:w="80"/>
-            </w:tcMar>
-            <w:vAlign w:val="center"/>
-          </w:tcPr>
-          <w:p>
-            <w:pPr>
-              <w:spacing w:after="0" w:before="0"/>
-              <w:jc w:val="left"/>
-            </w:pPr>
-            <w:r>
-              <w:rPr>
-                <w:rFonts w:ascii="Arial" w:cs="Arial" w:eastAsia="Arial" w:hAnsi="Arial"/>
-                <w:b w:val="false"/>
-                <w:bCs w:val="false"/>
-                <w:sz w:val="18"/>
-                <w:szCs w:val="18"/>
-              </w:rPr>
-              <w:t xml:space="preserve">gelato_units: </w:t>
+            <w:tcW w:type="dxa" w:w="5500"/>
+            <w:tcBorders>
+              <w:top w:val="single" w:color="808080" w:sz="4"/>
+              <w:left w:val="single" w:color="808080" w:sz="4"/>
+              <w:bottom w:val="single" w:color="808080" w:sz="4"/>
+              <w:right w:val="single" w:color="808080" w:sz="4"/>
+            </w:tcBorders>
+            <w:tcMar>
+              <w:top w:type="dxa" w:w="40"/>
+              <w:left w:type="dxa" w:w="80"/>
+              <w:bottom w:type="dxa" w:w="40"/>
+              <w:right w:type="dxa" w:w="80"/>
+            </w:tcMar>
+            <w:vAlign w:val="center"/>
+          </w:tcPr>
+          <w:p>
+            <w:pPr>
+              <w:spacing w:after="0" w:before="0"/>
+              <w:jc w:val="left"/>
+            </w:pPr>
+            <w:r>
+              <w:rPr>
+                <w:rFonts w:ascii="Arial" w:cs="Arial" w:eastAsia="Arial" w:hAnsi="Arial"/>
+                <w:b w:val="false"/>
+                <w:bCs w:val="false"/>
+                <w:sz w:val="18"/>
+                <w:szCs w:val="18"/>
+              </w:rPr>
+              <w:t xml:space="preserve">Any three sensible inputs with a direction and a reason: weekend (up: more visitors), beach event (up), planned price (down), temperature (either direction with a reason: warm-weather customers may buy cold items instead; the data show </w:t>
             </w:r>
             <w:r>
               <w:rPr>
@@ -524,57 +578,17 @@
                 <w:sz w:val="18"/>
                 <w:szCs w:val="18"/>
               </w:rPr>
-              <w:t xml:space="preserve">DROP</w:t>
-            </w:r>
-            <w:r>
-              <w:rPr>
-                <w:rFonts w:ascii="Arial" w:cs="Arial" w:eastAsia="Arial" w:hAnsi="Arial"/>
-                <w:b w:val="false"/>
-                <w:bCs w:val="false"/>
-                <w:sz w:val="18"/>
-                <w:szCs w:val="18"/>
-              </w:rPr>
-              <w:t xml:space="preserve"> (known only at closing; caused by the same weather: a symptom, not a cause). pastry_revenue_eur: </w:t>
-            </w:r>
-            <w:r>
-              <w:rPr>
-                <w:rFonts w:ascii="Arial" w:cs="Arial" w:eastAsia="Arial" w:hAnsi="Arial"/>
-                <w:b/>
-                <w:bCs/>
-                <w:sz w:val="18"/>
-                <w:szCs w:val="18"/>
-              </w:rPr>
-              <w:t xml:space="preserve">DROP</w:t>
-            </w:r>
-            <w:r>
-              <w:rPr>
-                <w:rFonts w:ascii="Arial" w:cs="Arial" w:eastAsia="Arial" w:hAnsi="Arial"/>
-                <w:b w:val="false"/>
-                <w:bCs w:val="false"/>
-                <w:sz w:val="18"/>
-                <w:szCs w:val="18"/>
-              </w:rPr>
-              <w:t xml:space="preserve"> (price × units contains the outcome). beach_event: </w:t>
-            </w:r>
-            <w:r>
-              <w:rPr>
-                <w:rFonts w:ascii="Arial" w:cs="Arial" w:eastAsia="Arial" w:hAnsi="Arial"/>
-                <w:b/>
-                <w:bCs/>
-                <w:sz w:val="18"/>
-                <w:szCs w:val="18"/>
-              </w:rPr>
-              <w:t xml:space="preserve">KEEP</w:t>
-            </w:r>
-            <w:r>
-              <w:rPr>
-                <w:rFonts w:ascii="Arial" w:cs="Arial" w:eastAsia="Arial" w:hAnsi="Arial"/>
-                <w:b w:val="false"/>
-                <w:bCs w:val="false"/>
-                <w:sz w:val="18"/>
-                <w:szCs w:val="18"/>
-              </w:rPr>
-              <w:t xml:space="preserve"> (crowds nearby buy pastries; known from the calendar). humidity_pct: either, with a reason (weak mechanism for pastries and it overlaps with temperature and rain, or damp days drive indoor comfort food).</w:t>
+              <w:t xml:space="preserve">down</w:t>
+            </w:r>
+            <w:r>
+              <w:rPr>
+                <w:rFonts w:ascii="Arial" w:cs="Arial" w:eastAsia="Arial" w:hAnsi="Arial"/>
+                <w:b w:val="false"/>
+                <w:bCs w:val="false"/>
+                <w:sz w:val="18"/>
+                <w:szCs w:val="18"/>
+              </w:rPr>
+              <w:t xml:space="preserve">), wind (down: fewer outdoor customers).</w:t>
             </w:r>
           </w:p>
         </w:tc>
@@ -608,7 +622,7 @@
                 <w:sz w:val="18"/>
                 <w:szCs w:val="18"/>
               </w:rPr>
-              <w:t xml:space="preserve">4</w:t>
+              <w:t xml:space="preserve">3</w:t>
             </w:r>
           </w:p>
         </w:tc>
@@ -642,7 +656,7 @@
                 <w:sz w:val="18"/>
                 <w:szCs w:val="18"/>
               </w:rPr>
-              <w:t xml:space="preserve">1 per row: decision with a reason from how the café works.</w:t>
+              <w:t xml:space="preserve">1 per input: direction and a coherent reason. Either direction for temperature scores if defended.</w:t>
             </w:r>
           </w:p>
         </w:tc>
@@ -653,7 +667,7 @@
         </w:trPr>
         <w:tc>
           <w:tcPr>
-            <w:tcW w:type="dxa" w:w="500"/>
+            <w:tcW w:type="dxa" w:w="700"/>
             <w:tcBorders>
               <w:top w:val="single" w:color="808080" w:sz="4"/>
               <w:left w:val="single" w:color="808080" w:sz="4"/>
@@ -681,114 +695,124 @@
                 <w:sz w:val="18"/>
                 <w:szCs w:val="18"/>
               </w:rPr>
+              <w:t xml:space="preserve">1b</w:t>
+            </w:r>
+          </w:p>
+        </w:tc>
+        <w:tc>
+          <w:tcPr>
+            <w:tcW w:type="dxa" w:w="1500"/>
+            <w:tcBorders>
+              <w:top w:val="single" w:color="808080" w:sz="4"/>
+              <w:left w:val="single" w:color="808080" w:sz="4"/>
+              <w:bottom w:val="single" w:color="808080" w:sz="4"/>
+              <w:right w:val="single" w:color="808080" w:sz="4"/>
+            </w:tcBorders>
+            <w:tcMar>
+              <w:top w:type="dxa" w:w="40"/>
+              <w:left w:type="dxa" w:w="80"/>
+              <w:bottom w:type="dxa" w:w="40"/>
+              <w:right w:type="dxa" w:w="80"/>
+            </w:tcMar>
+            <w:vAlign w:val="center"/>
+          </w:tcPr>
+          <w:p>
+            <w:pPr>
+              <w:spacing w:after="0" w:before="0"/>
+              <w:jc w:val="left"/>
+            </w:pPr>
+            <w:r>
+              <w:rPr>
+                <w:rFonts w:ascii="Arial" w:cs="Arial" w:eastAsia="Arial" w:hAnsi="Arial"/>
+                <w:b w:val="false"/>
+                <w:bCs w:val="false"/>
+                <w:sz w:val="18"/>
+                <w:szCs w:val="18"/>
+              </w:rPr>
+              <w:t xml:space="preserve">LO5 · Con</w:t>
+            </w:r>
+          </w:p>
+        </w:tc>
+        <w:tc>
+          <w:tcPr>
+            <w:tcW w:type="dxa" w:w="5500"/>
+            <w:tcBorders>
+              <w:top w:val="single" w:color="808080" w:sz="4"/>
+              <w:left w:val="single" w:color="808080" w:sz="4"/>
+              <w:bottom w:val="single" w:color="808080" w:sz="4"/>
+              <w:right w:val="single" w:color="808080" w:sz="4"/>
+            </w:tcBorders>
+            <w:tcMar>
+              <w:top w:type="dxa" w:w="40"/>
+              <w:left w:type="dxa" w:w="80"/>
+              <w:bottom w:type="dxa" w:w="40"/>
+              <w:right w:type="dxa" w:w="80"/>
+            </w:tcMar>
+            <w:vAlign w:val="center"/>
+          </w:tcPr>
+          <w:p>
+            <w:pPr>
+              <w:spacing w:after="0" w:before="0"/>
+              <w:jc w:val="left"/>
+            </w:pPr>
+            <w:r>
+              <w:rPr>
+                <w:rFonts w:ascii="Arial" w:cs="Arial" w:eastAsia="Arial" w:hAnsi="Arial"/>
+                <w:b/>
+                <w:bCs/>
+                <w:sz w:val="18"/>
+                <w:szCs w:val="18"/>
+              </w:rPr>
+              <w:t xml:space="preserve">Item 7</w:t>
+            </w:r>
+            <w:r>
+              <w:rPr>
+                <w:rFonts w:ascii="Arial" w:cs="Arial" w:eastAsia="Arial" w:hAnsi="Arial"/>
+                <w:b w:val="false"/>
+                <w:bCs w:val="false"/>
+                <w:sz w:val="18"/>
+                <w:szCs w:val="18"/>
+              </w:rPr>
+              <w:t xml:space="preserve">, gelato sales counted at closing time: it is not known before opening and it is driven by the same weather and day type, so it cannot be used to forecast.</w:t>
+            </w:r>
+          </w:p>
+        </w:tc>
+        <w:tc>
+          <w:tcPr>
+            <w:tcW w:type="dxa" w:w="500"/>
+            <w:tcBorders>
+              <w:top w:val="single" w:color="808080" w:sz="4"/>
+              <w:left w:val="single" w:color="808080" w:sz="4"/>
+              <w:bottom w:val="single" w:color="808080" w:sz="4"/>
+              <w:right w:val="single" w:color="808080" w:sz="4"/>
+            </w:tcBorders>
+            <w:tcMar>
+              <w:top w:type="dxa" w:w="40"/>
+              <w:left w:type="dxa" w:w="80"/>
+              <w:bottom w:type="dxa" w:w="40"/>
+              <w:right w:type="dxa" w:w="80"/>
+            </w:tcMar>
+            <w:vAlign w:val="center"/>
+          </w:tcPr>
+          <w:p>
+            <w:pPr>
+              <w:spacing w:after="0" w:before="0"/>
+              <w:jc w:val="center"/>
+            </w:pPr>
+            <w:r>
+              <w:rPr>
+                <w:rFonts w:ascii="Arial" w:cs="Arial" w:eastAsia="Arial" w:hAnsi="Arial"/>
+                <w:b w:val="false"/>
+                <w:bCs w:val="false"/>
+                <w:sz w:val="18"/>
+                <w:szCs w:val="18"/>
+              </w:rPr>
               <w:t xml:space="preserve">2</w:t>
             </w:r>
           </w:p>
         </w:tc>
         <w:tc>
           <w:tcPr>
-            <w:tcW w:type="dxa" w:w="1500"/>
-            <w:tcBorders>
-              <w:top w:val="single" w:color="808080" w:sz="4"/>
-              <w:left w:val="single" w:color="808080" w:sz="4"/>
-              <w:bottom w:val="single" w:color="808080" w:sz="4"/>
-              <w:right w:val="single" w:color="808080" w:sz="4"/>
-            </w:tcBorders>
-            <w:tcMar>
-              <w:top w:type="dxa" w:w="40"/>
-              <w:left w:type="dxa" w:w="80"/>
-              <w:bottom w:type="dxa" w:w="40"/>
-              <w:right w:type="dxa" w:w="80"/>
-            </w:tcMar>
-            <w:vAlign w:val="center"/>
-          </w:tcPr>
-          <w:p>
-            <w:pPr>
-              <w:spacing w:after="0" w:before="0"/>
-              <w:jc w:val="left"/>
-            </w:pPr>
-            <w:r>
-              <w:rPr>
-                <w:rFonts w:ascii="Arial" w:cs="Arial" w:eastAsia="Arial" w:hAnsi="Arial"/>
-                <w:b w:val="false"/>
-                <w:bCs w:val="false"/>
-                <w:sz w:val="18"/>
-                <w:szCs w:val="18"/>
-              </w:rPr>
-              <w:t xml:space="preserve">LO1 · Con</w:t>
-            </w:r>
-          </w:p>
-        </w:tc>
-        <w:tc>
-          <w:tcPr>
-            <w:tcW w:type="dxa" w:w="5700"/>
-            <w:tcBorders>
-              <w:top w:val="single" w:color="808080" w:sz="4"/>
-              <w:left w:val="single" w:color="808080" w:sz="4"/>
-              <w:bottom w:val="single" w:color="808080" w:sz="4"/>
-              <w:right w:val="single" w:color="808080" w:sz="4"/>
-            </w:tcBorders>
-            <w:tcMar>
-              <w:top w:type="dxa" w:w="40"/>
-              <w:left w:type="dxa" w:w="80"/>
-              <w:bottom w:type="dxa" w:w="40"/>
-              <w:right w:type="dxa" w:w="80"/>
-            </w:tcMar>
-            <w:vAlign w:val="center"/>
-          </w:tcPr>
-          <w:p>
-            <w:pPr>
-              <w:spacing w:after="0" w:before="0"/>
-              <w:jc w:val="left"/>
-            </w:pPr>
-            <w:r>
-              <w:rPr>
-                <w:rFonts w:ascii="Arial" w:cs="Arial" w:eastAsia="Arial" w:hAnsi="Arial"/>
-                <w:b w:val="false"/>
-                <w:bCs w:val="false"/>
-                <w:sz w:val="18"/>
-                <w:szCs w:val="18"/>
-              </w:rPr>
-              <w:t xml:space="preserve">Two directional, falsifiable hypotheses on different variables (e.g. “pastry sales are higher on weekends”, “on days with a beach event”, “on cooler days”) and a falsifying LINEST result (opposite sign with |t| &gt; 2, or |t| &lt; 2).</w:t>
-            </w:r>
-          </w:p>
-        </w:tc>
-        <w:tc>
-          <w:tcPr>
-            <w:tcW w:type="dxa" w:w="500"/>
-            <w:tcBorders>
-              <w:top w:val="single" w:color="808080" w:sz="4"/>
-              <w:left w:val="single" w:color="808080" w:sz="4"/>
-              <w:bottom w:val="single" w:color="808080" w:sz="4"/>
-              <w:right w:val="single" w:color="808080" w:sz="4"/>
-            </w:tcBorders>
-            <w:tcMar>
-              <w:top w:type="dxa" w:w="40"/>
-              <w:left w:type="dxa" w:w="80"/>
-              <w:bottom w:type="dxa" w:w="40"/>
-              <w:right w:type="dxa" w:w="80"/>
-            </w:tcMar>
-            <w:vAlign w:val="center"/>
-          </w:tcPr>
-          <w:p>
-            <w:pPr>
-              <w:spacing w:after="0" w:before="0"/>
-              <w:jc w:val="center"/>
-            </w:pPr>
-            <w:r>
-              <w:rPr>
-                <w:rFonts w:ascii="Arial" w:cs="Arial" w:eastAsia="Arial" w:hAnsi="Arial"/>
-                <w:b w:val="false"/>
-                <w:bCs w:val="false"/>
-                <w:sz w:val="18"/>
-                <w:szCs w:val="18"/>
-              </w:rPr>
-              <w:t xml:space="preserve">3</w:t>
-            </w:r>
-          </w:p>
-        </w:tc>
-        <w:tc>
-          <w:tcPr>
             <w:tcW w:type="dxa" w:w="2000"/>
             <w:tcBorders>
               <w:top w:val="single" w:color="808080" w:sz="4"/>
@@ -817,7 +841,7 @@
                 <w:sz w:val="18"/>
                 <w:szCs w:val="18"/>
               </w:rPr>
-              <w:t xml:space="preserve">1 + 1 hypotheses (variable, direction, falsifiable) + 1 falsifying result.</w:t>
+              <w:t xml:space="preserve">1 identifies item 7 + 1 the problem.</w:t>
             </w:r>
           </w:p>
         </w:tc>
@@ -828,7 +852,7 @@
         </w:trPr>
         <w:tc>
           <w:tcPr>
-            <w:tcW w:type="dxa" w:w="500"/>
+            <w:tcW w:type="dxa" w:w="700"/>
             <w:tcBorders>
               <w:top w:val="single" w:color="808080" w:sz="4"/>
               <w:left w:val="single" w:color="808080" w:sz="4"/>
@@ -856,7 +880,7 @@
                 <w:sz w:val="18"/>
                 <w:szCs w:val="18"/>
               </w:rPr>
-              <w:t xml:space="preserve">3</w:t>
+              <w:t xml:space="preserve">1c</w:t>
             </w:r>
           </w:p>
         </w:tc>
@@ -890,41 +914,71 @@
                 <w:sz w:val="18"/>
                 <w:szCs w:val="18"/>
               </w:rPr>
-              <w:t xml:space="preserve">LO2 · Con</w:t>
-            </w:r>
-          </w:p>
-        </w:tc>
-        <w:tc>
-          <w:tcPr>
-            <w:tcW w:type="dxa" w:w="5700"/>
-            <w:tcBorders>
-              <w:top w:val="single" w:color="808080" w:sz="4"/>
-              <w:left w:val="single" w:color="808080" w:sz="4"/>
-              <w:bottom w:val="single" w:color="808080" w:sz="4"/>
-              <w:right w:val="single" w:color="808080" w:sz="4"/>
-            </w:tcBorders>
-            <w:tcMar>
-              <w:top w:type="dxa" w:w="40"/>
-              <w:left w:type="dxa" w:w="80"/>
-              <w:bottom w:type="dxa" w:w="40"/>
-              <w:right w:type="dxa" w:w="80"/>
-            </w:tcMar>
-            <w:vAlign w:val="center"/>
-          </w:tcPr>
-          <w:p>
-            <w:pPr>
-              <w:spacing w:after="0" w:before="0"/>
-              <w:jc w:val="left"/>
-            </w:pPr>
-            <w:r>
-              <w:rPr>
-                <w:rFonts w:ascii="Arial" w:cs="Arial" w:eastAsia="Arial" w:hAnsi="Arial"/>
-                <w:b w:val="false"/>
-                <w:bCs w:val="false"/>
-                <w:sz w:val="18"/>
-                <w:szCs w:val="18"/>
-              </w:rPr>
-              <w:t xml:space="preserve">(i) reliability / comparability (the sensor’s conditions changed, so the readings are not comparable); (ii) reliability (repeat counts differ); (iii) validity (pastries sold is not enjoyment).</w:t>
+              <w:t xml:space="preserve">LO3, LO5, LO6 · Con</w:t>
+            </w:r>
+          </w:p>
+        </w:tc>
+        <w:tc>
+          <w:tcPr>
+            <w:tcW w:type="dxa" w:w="5500"/>
+            <w:tcBorders>
+              <w:top w:val="single" w:color="808080" w:sz="4"/>
+              <w:left w:val="single" w:color="808080" w:sz="4"/>
+              <w:bottom w:val="single" w:color="808080" w:sz="4"/>
+              <w:right w:val="single" w:color="808080" w:sz="4"/>
+            </w:tcBorders>
+            <w:tcMar>
+              <w:top w:type="dxa" w:w="40"/>
+              <w:left w:type="dxa" w:w="80"/>
+              <w:bottom w:type="dxa" w:w="40"/>
+              <w:right w:type="dxa" w:w="80"/>
+            </w:tcMar>
+            <w:vAlign w:val="center"/>
+          </w:tcPr>
+          <w:p>
+            <w:pPr>
+              <w:spacing w:after="0" w:before="0"/>
+              <w:jc w:val="left"/>
+            </w:pPr>
+            <w:r>
+              <w:rPr>
+                <w:rFonts w:ascii="Arial" w:cs="Arial" w:eastAsia="Arial" w:hAnsi="Arial"/>
+                <w:b/>
+                <w:bCs/>
+                <w:sz w:val="18"/>
+                <w:szCs w:val="18"/>
+              </w:rPr>
+              <w:t xml:space="preserve">Not both.</w:t>
+            </w:r>
+            <w:r>
+              <w:rPr>
+                <w:rFonts w:ascii="Arial" w:cs="Arial" w:eastAsia="Arial" w:hAnsi="Arial"/>
+                <w:b w:val="false"/>
+                <w:bCs w:val="false"/>
+                <w:sz w:val="18"/>
+                <w:szCs w:val="18"/>
+              </w:rPr>
+              <w:t xml:space="preserve"> r = 1.00: they are the same information (the price changed once, on the day the flag switches), so LINEST cannot separate them. Keep the </w:t>
+            </w:r>
+            <w:r>
+              <w:rPr>
+                <w:rFonts w:ascii="Arial" w:cs="Arial" w:eastAsia="Arial" w:hAnsi="Arial"/>
+                <w:b/>
+                <w:bCs/>
+                <w:sz w:val="18"/>
+                <w:szCs w:val="18"/>
+              </w:rPr>
+              <w:t xml:space="preserve">price</w:t>
+            </w:r>
+            <w:r>
+              <w:rPr>
+                <w:rFonts w:ascii="Arial" w:cs="Arial" w:eastAsia="Arial" w:hAnsi="Arial"/>
+                <w:b w:val="false"/>
+                <w:bCs w:val="false"/>
+                <w:sz w:val="18"/>
+                <w:szCs w:val="18"/>
+              </w:rPr>
+              <w:t xml:space="preserve"> (the thing the café controls) or the flag, not both.</w:t>
             </w:r>
           </w:p>
         </w:tc>
@@ -992,7 +1046,7 @@
                 <w:sz w:val="18"/>
                 <w:szCs w:val="18"/>
               </w:rPr>
-              <w:t xml:space="preserve">1 for ≥ 2 of 3 correct + 1 correct explanation of one.</w:t>
+              <w:t xml:space="preserve">1 identical/overlapping information and why it is a problem + 1 a choice.</w:t>
             </w:r>
           </w:p>
         </w:tc>
@@ -1003,7 +1057,7 @@
         </w:trPr>
         <w:tc>
           <w:tcPr>
-            <w:tcW w:type="dxa" w:w="500"/>
+            <w:tcW w:type="dxa" w:w="700"/>
             <w:tcBorders>
               <w:top w:val="single" w:color="808080" w:sz="4"/>
               <w:left w:val="single" w:color="808080" w:sz="4"/>
@@ -1031,7 +1085,7 @@
                 <w:sz w:val="18"/>
                 <w:szCs w:val="18"/>
               </w:rPr>
-              <w:t xml:space="preserve">4</w:t>
+              <w:t xml:space="preserve">1d</w:t>
             </w:r>
           </w:p>
         </w:tc>
@@ -1065,61 +1119,41 @@
                 <w:sz w:val="18"/>
                 <w:szCs w:val="18"/>
               </w:rPr>
-              <w:t xml:space="preserve">LO3, LO4 · Con + Cal</w:t>
-            </w:r>
-          </w:p>
-        </w:tc>
-        <w:tc>
-          <w:tcPr>
-            <w:tcW w:type="dxa" w:w="5700"/>
-            <w:tcBorders>
-              <w:top w:val="single" w:color="808080" w:sz="4"/>
-              <w:left w:val="single" w:color="808080" w:sz="4"/>
-              <w:bottom w:val="single" w:color="808080" w:sz="4"/>
-              <w:right w:val="single" w:color="808080" w:sz="4"/>
-            </w:tcBorders>
-            <w:tcMar>
-              <w:top w:type="dxa" w:w="40"/>
-              <w:left w:type="dxa" w:w="80"/>
-              <w:bottom w:type="dxa" w:w="40"/>
-              <w:right w:type="dxa" w:w="80"/>
-            </w:tcMar>
-            <w:vAlign w:val="center"/>
-          </w:tcPr>
-          <w:p>
-            <w:pPr>
-              <w:spacing w:after="0" w:before="0"/>
-              <w:jc w:val="left"/>
-            </w:pPr>
-            <w:r>
-              <w:rPr>
-                <w:rFonts w:ascii="Arial" w:cs="Arial" w:eastAsia="Arial" w:hAnsi="Arial"/>
-                <w:b w:val="false"/>
-                <w:bCs w:val="false"/>
-                <w:sz w:val="18"/>
-                <w:szCs w:val="18"/>
-              </w:rPr>
-              <w:t xml:space="preserve">(a) A weekly cycle: the red weekend dots are the high points. Variable: </w:t>
-            </w:r>
-            <w:r>
-              <w:rPr>
-                <w:rFonts w:ascii="Arial" w:cs="Arial" w:eastAsia="Arial" w:hAnsi="Arial"/>
-                <w:b/>
-                <w:bCs/>
-                <w:sz w:val="18"/>
-                <w:szCs w:val="18"/>
-              </w:rPr>
-              <w:t xml:space="preserve">weekend</w:t>
-            </w:r>
-            <w:r>
-              <w:rPr>
-                <w:rFonts w:ascii="Arial" w:cs="Arial" w:eastAsia="Arial" w:hAnsi="Arial"/>
-                <w:b w:val="false"/>
-                <w:bCs w:val="false"/>
-                <w:sz w:val="18"/>
-                <w:szCs w:val="18"/>
-              </w:rPr>
-              <w:t xml:space="preserve">. (b) z = (103 − 67.07) ÷ 10.80 = 3.33.</w:t>
+              <w:t xml:space="preserve">LO6 · Con</w:t>
+            </w:r>
+          </w:p>
+        </w:tc>
+        <w:tc>
+          <w:tcPr>
+            <w:tcW w:type="dxa" w:w="5500"/>
+            <w:tcBorders>
+              <w:top w:val="single" w:color="808080" w:sz="4"/>
+              <w:left w:val="single" w:color="808080" w:sz="4"/>
+              <w:bottom w:val="single" w:color="808080" w:sz="4"/>
+              <w:right w:val="single" w:color="808080" w:sz="4"/>
+            </w:tcBorders>
+            <w:tcMar>
+              <w:top w:type="dxa" w:w="40"/>
+              <w:left w:type="dxa" w:w="80"/>
+              <w:bottom w:type="dxa" w:w="40"/>
+              <w:right w:type="dxa" w:w="80"/>
+            </w:tcMar>
+            <w:vAlign w:val="center"/>
+          </w:tcPr>
+          <w:p>
+            <w:pPr>
+              <w:spacing w:after="0" w:before="0"/>
+              <w:jc w:val="left"/>
+            </w:pPr>
+            <w:r>
+              <w:rPr>
+                <w:rFonts w:ascii="Arial" w:cs="Arial" w:eastAsia="Arial" w:hAnsi="Arial"/>
+                <w:b w:val="false"/>
+                <w:bCs w:val="false"/>
+                <w:sz w:val="18"/>
+                <w:szCs w:val="18"/>
+              </w:rPr>
+              <w:t xml:space="preserve">Hold back some days, fit the model on the rest, predict the held-back days, then calculate their residuals and MAE.</w:t>
             </w:r>
           </w:p>
         </w:tc>
@@ -1153,7 +1187,7 @@
                 <w:sz w:val="18"/>
                 <w:szCs w:val="18"/>
               </w:rPr>
-              <w:t xml:space="preserve">2</w:t>
+              <w:t xml:space="preserve">1</w:t>
             </w:r>
           </w:p>
         </w:tc>
@@ -1187,7 +1221,7 @@
                 <w:sz w:val="18"/>
                 <w:szCs w:val="18"/>
               </w:rPr>
-              <w:t xml:space="preserve">1 pattern and variable + 1 z-score.</w:t>
+              <w:t xml:space="preserve">1: a hold-out check with residuals/MAE (names the idea of unseen days).</w:t>
             </w:r>
           </w:p>
         </w:tc>
@@ -1198,7 +1232,7 @@
         </w:trPr>
         <w:tc>
           <w:tcPr>
-            <w:tcW w:type="dxa" w:w="500"/>
+            <w:tcW w:type="dxa" w:w="700"/>
             <w:tcBorders>
               <w:top w:val="single" w:color="808080" w:sz="4"/>
               <w:left w:val="single" w:color="808080" w:sz="4"/>
@@ -1226,7 +1260,7 @@
                 <w:sz w:val="18"/>
                 <w:szCs w:val="18"/>
               </w:rPr>
-              <w:t xml:space="preserve">5</w:t>
+              <w:t xml:space="preserve">2a</w:t>
             </w:r>
           </w:p>
         </w:tc>
@@ -1260,41 +1294,41 @@
                 <w:sz w:val="18"/>
                 <w:szCs w:val="18"/>
               </w:rPr>
-              <w:t xml:space="preserve">LO3, LO5 · Cal + Com</w:t>
-            </w:r>
-          </w:p>
-        </w:tc>
-        <w:tc>
-          <w:tcPr>
-            <w:tcW w:type="dxa" w:w="5700"/>
-            <w:tcBorders>
-              <w:top w:val="single" w:color="808080" w:sz="4"/>
-              <w:left w:val="single" w:color="808080" w:sz="4"/>
-              <w:bottom w:val="single" w:color="808080" w:sz="4"/>
-              <w:right w:val="single" w:color="808080" w:sz="4"/>
-            </w:tcBorders>
-            <w:tcMar>
-              <w:top w:type="dxa" w:w="40"/>
-              <w:left w:type="dxa" w:w="80"/>
-              <w:bottom w:type="dxa" w:w="40"/>
-              <w:right w:type="dxa" w:w="80"/>
-            </w:tcMar>
-            <w:vAlign w:val="center"/>
-          </w:tcPr>
-          <w:p>
-            <w:pPr>
-              <w:spacing w:after="0" w:before="0"/>
-              <w:jc w:val="left"/>
-            </w:pPr>
-            <w:r>
-              <w:rPr>
-                <w:rFonts w:ascii="Arial" w:cs="Arial" w:eastAsia="Arial" w:hAnsi="Arial"/>
-                <w:b w:val="false"/>
-                <w:bCs w:val="false"/>
-                <w:sz w:val="18"/>
-                <w:szCs w:val="18"/>
-              </w:rPr>
-              <w:t xml:space="preserve">(a) rainfall_mm (mean 0.76 vs median 0.00: strongly right-skewed) and pastry_units (mean 67.07 vs median 65.00: mildly right-skewed; a few high days pull the mean up). (b) Rainfall is a weak predictor (r² = 0.01); its significance rests on the storm days: without them |t| &lt; 2. It is a fragile predictor of everyday sales. (c) =IF(OR(B2="Saturday",B2="Sunday"),1,0).</w:t>
+              <w:t xml:space="preserve">LO5, LO6 · Com</w:t>
+            </w:r>
+          </w:p>
+        </w:tc>
+        <w:tc>
+          <w:tcPr>
+            <w:tcW w:type="dxa" w:w="5500"/>
+            <w:tcBorders>
+              <w:top w:val="single" w:color="808080" w:sz="4"/>
+              <w:left w:val="single" w:color="808080" w:sz="4"/>
+              <w:bottom w:val="single" w:color="808080" w:sz="4"/>
+              <w:right w:val="single" w:color="808080" w:sz="4"/>
+            </w:tcBorders>
+            <w:tcMar>
+              <w:top w:type="dxa" w:w="40"/>
+              <w:left w:type="dxa" w:w="80"/>
+              <w:bottom w:type="dxa" w:w="40"/>
+              <w:right w:type="dxa" w:w="80"/>
+            </w:tcMar>
+            <w:vAlign w:val="center"/>
+          </w:tcPr>
+          <w:p>
+            <w:pPr>
+              <w:spacing w:after="0" w:before="0"/>
+              <w:jc w:val="left"/>
+            </w:pPr>
+            <w:r>
+              <w:rPr>
+                <w:rFonts w:ascii="Arial" w:cs="Arial" w:eastAsia="Arial" w:hAnsi="Arial"/>
+                <w:b w:val="false"/>
+                <w:bCs w:val="false"/>
+                <w:sz w:val="18"/>
+                <w:szCs w:val="18"/>
+              </w:rPr>
+              <w:t xml:space="preserve">Sales = 84.76 − 0.81 × temperature − 0.18 × wind + 11.53 × weekend  (ŷ = b + m₁x₁ + m₂x₂ + m₃x₃; the table shows Col A = m₃, Col B = m₂, Col C = m₁, Col D = b).</w:t>
             </w:r>
           </w:p>
         </w:tc>
@@ -1328,7 +1362,7 @@
                 <w:sz w:val="18"/>
                 <w:szCs w:val="18"/>
               </w:rPr>
-              <w:t xml:space="preserve">3</w:t>
+              <w:t xml:space="preserve">2</w:t>
             </w:r>
           </w:p>
         </w:tc>
@@ -1362,7 +1396,7 @@
                 <w:sz w:val="18"/>
                 <w:szCs w:val="18"/>
               </w:rPr>
-              <w:t xml:space="preserve">1 two variables with the mean/median evidence + 1 reading of the check + 1 formula.</w:t>
+              <w:t xml:space="preserve">1 correct numbers matched to the right variables + 1 correct equation form.</w:t>
             </w:r>
           </w:p>
         </w:tc>
@@ -1373,7 +1407,7 @@
         </w:trPr>
         <w:tc>
           <w:tcPr>
-            <w:tcW w:type="dxa" w:w="500"/>
+            <w:tcW w:type="dxa" w:w="700"/>
             <w:tcBorders>
               <w:top w:val="single" w:color="808080" w:sz="4"/>
               <w:left w:val="single" w:color="808080" w:sz="4"/>
@@ -1401,7 +1435,7 @@
                 <w:sz w:val="18"/>
                 <w:szCs w:val="18"/>
               </w:rPr>
-              <w:t xml:space="preserve">6</w:t>
+              <w:t xml:space="preserve">2b</w:t>
             </w:r>
           </w:p>
         </w:tc>
@@ -1435,41 +1469,41 @@
                 <w:sz w:val="18"/>
                 <w:szCs w:val="18"/>
               </w:rPr>
-              <w:t xml:space="preserve">LO3, LO6 · Cal + Con</w:t>
-            </w:r>
-          </w:p>
-        </w:tc>
-        <w:tc>
-          <w:tcPr>
-            <w:tcW w:type="dxa" w:w="5700"/>
-            <w:tcBorders>
-              <w:top w:val="single" w:color="808080" w:sz="4"/>
-              <w:left w:val="single" w:color="808080" w:sz="4"/>
-              <w:bottom w:val="single" w:color="808080" w:sz="4"/>
-              <w:right w:val="single" w:color="808080" w:sz="4"/>
-            </w:tcBorders>
-            <w:tcMar>
-              <w:top w:type="dxa" w:w="40"/>
-              <w:left w:type="dxa" w:w="80"/>
-              <w:bottom w:type="dxa" w:w="40"/>
-              <w:right w:type="dxa" w:w="80"/>
-            </w:tcMar>
-            <w:vAlign w:val="center"/>
-          </w:tcPr>
-          <w:p>
-            <w:pPr>
-              <w:spacing w:after="0" w:before="0"/>
-              <w:jc w:val="left"/>
-            </w:pPr>
-            <w:r>
-              <w:rPr>
-                <w:rFonts w:ascii="Arial" w:cs="Arial" w:eastAsia="Arial" w:hAnsi="Arial"/>
-                <w:b w:val="false"/>
-                <w:bCs w:val="false"/>
-                <w:sz w:val="18"/>
-                <w:szCs w:val="18"/>
-              </w:rPr>
-              <w:t xml:space="preserve">(a) Residual = 103 − 84 = +19, about 2.3 SE: the model cannot explain it. (b) Do not delete without a reason: investigate (a festival tie-in, a promotion, a recording error). Keeping it hardly changes the model (weekend 11.30 vs 10.91); report results with and without. One such day in 168 is not alarming.</w:t>
+              <w:t xml:space="preserve">LO6, LO7 · Con</w:t>
+            </w:r>
+          </w:p>
+        </w:tc>
+        <w:tc>
+          <w:tcPr>
+            <w:tcW w:type="dxa" w:w="5500"/>
+            <w:tcBorders>
+              <w:top w:val="single" w:color="808080" w:sz="4"/>
+              <w:left w:val="single" w:color="808080" w:sz="4"/>
+              <w:bottom w:val="single" w:color="808080" w:sz="4"/>
+              <w:right w:val="single" w:color="808080" w:sz="4"/>
+            </w:tcBorders>
+            <w:tcMar>
+              <w:top w:type="dxa" w:w="40"/>
+              <w:left w:type="dxa" w:w="80"/>
+              <w:bottom w:type="dxa" w:w="40"/>
+              <w:right w:type="dxa" w:w="80"/>
+            </w:tcMar>
+            <w:vAlign w:val="center"/>
+          </w:tcPr>
+          <w:p>
+            <w:pPr>
+              <w:spacing w:after="0" w:before="0"/>
+              <w:jc w:val="left"/>
+            </w:pPr>
+            <w:r>
+              <w:rPr>
+                <w:rFonts w:ascii="Arial" w:cs="Arial" w:eastAsia="Arial" w:hAnsi="Arial"/>
+                <w:b w:val="false"/>
+                <w:bCs w:val="false"/>
+                <w:sz w:val="18"/>
+                <w:szCs w:val="18"/>
+              </w:rPr>
+              <w:t xml:space="preserve">(i) Each extra °C goes with about 0.81 fewer pastries a day, holding wind and weekend fixed; pastries still sell on warm days (predictions stay positive). (ii) −0.18 is per km/h: a 10 km/h stronger wind goes with about 1.8 fewer pastries; it is less than 2 × 0.10 from zero, so the evidence is weak either way: it is not “no effect”. (iii) About 33% of the variation in daily sales is explained; R² does not say how often the model is wrong; a typical error is about 9 pastries.</w:t>
             </w:r>
           </w:p>
         </w:tc>
@@ -1503,7 +1537,7 @@
                 <w:sz w:val="18"/>
                 <w:szCs w:val="18"/>
               </w:rPr>
-              <w:t xml:space="preserve">2</w:t>
+              <w:t xml:space="preserve">3</w:t>
             </w:r>
           </w:p>
         </w:tc>
@@ -1537,7 +1571,7 @@
                 <w:sz w:val="18"/>
                 <w:szCs w:val="18"/>
               </w:rPr>
-              <w:t xml:space="preserve">1 residual in SE + 1 defended decision.</w:t>
+              <w:t xml:space="preserve">1 each: corrected statement with units and conditions.</w:t>
             </w:r>
           </w:p>
         </w:tc>
@@ -1548,7 +1582,7 @@
         </w:trPr>
         <w:tc>
           <w:tcPr>
-            <w:tcW w:type="dxa" w:w="500"/>
+            <w:tcW w:type="dxa" w:w="700"/>
             <w:tcBorders>
               <w:top w:val="single" w:color="808080" w:sz="4"/>
               <w:left w:val="single" w:color="808080" w:sz="4"/>
@@ -1576,7 +1610,7 @@
                 <w:sz w:val="18"/>
                 <w:szCs w:val="18"/>
               </w:rPr>
-              <w:t xml:space="preserve">7</w:t>
+              <w:t xml:space="preserve">2c</w:t>
             </w:r>
           </w:p>
         </w:tc>
@@ -1610,41 +1644,61 @@
                 <w:sz w:val="18"/>
                 <w:szCs w:val="18"/>
               </w:rPr>
-              <w:t xml:space="preserve">LO3 · Com</w:t>
-            </w:r>
-          </w:p>
-        </w:tc>
-        <w:tc>
-          <w:tcPr>
-            <w:tcW w:type="dxa" w:w="5700"/>
-            <w:tcBorders>
-              <w:top w:val="single" w:color="808080" w:sz="4"/>
-              <w:left w:val="single" w:color="808080" w:sz="4"/>
-              <w:bottom w:val="single" w:color="808080" w:sz="4"/>
-              <w:right w:val="single" w:color="808080" w:sz="4"/>
-            </w:tcBorders>
-            <w:tcMar>
-              <w:top w:type="dxa" w:w="40"/>
-              <w:left w:type="dxa" w:w="80"/>
-              <w:bottom w:type="dxa" w:w="40"/>
-              <w:right w:type="dxa" w:w="80"/>
-            </w:tcMar>
-            <w:vAlign w:val="center"/>
-          </w:tcPr>
-          <w:p>
-            <w:pPr>
-              <w:spacing w:after="0" w:before="0"/>
-              <w:jc w:val="left"/>
-            </w:pPr>
-            <w:r>
-              <w:rPr>
-                <w:rFonts w:ascii="Arial" w:cs="Arial" w:eastAsia="Arial" w:hAnsi="Arial"/>
-                <w:b w:val="false"/>
-                <w:bCs w:val="false"/>
-                <w:sz w:val="18"/>
-                <w:szCs w:val="18"/>
-              </w:rPr>
-              <w:t xml:space="preserve">(a) weekend, r = 0.50. (b) temperature_c and sunshine_hours (r = 0.78); pastry_price_eur and post_change (r = 1.00).</w:t>
+              <w:t xml:space="preserve">LO6 · Cal + Con</w:t>
+            </w:r>
+          </w:p>
+        </w:tc>
+        <w:tc>
+          <w:tcPr>
+            <w:tcW w:type="dxa" w:w="5500"/>
+            <w:tcBorders>
+              <w:top w:val="single" w:color="808080" w:sz="4"/>
+              <w:left w:val="single" w:color="808080" w:sz="4"/>
+              <w:bottom w:val="single" w:color="808080" w:sz="4"/>
+              <w:right w:val="single" w:color="808080" w:sz="4"/>
+            </w:tcBorders>
+            <w:tcMar>
+              <w:top w:type="dxa" w:w="40"/>
+              <w:left w:type="dxa" w:w="80"/>
+              <w:bottom w:type="dxa" w:w="40"/>
+              <w:right w:type="dxa" w:w="80"/>
+            </w:tcMar>
+            <w:vAlign w:val="center"/>
+          </w:tcPr>
+          <w:p>
+            <w:pPr>
+              <w:spacing w:after="0" w:before="0"/>
+              <w:jc w:val="left"/>
+            </w:pPr>
+            <w:r>
+              <w:rPr>
+                <w:rFonts w:ascii="Arial" w:cs="Arial" w:eastAsia="Arial" w:hAnsi="Arial"/>
+                <w:b w:val="false"/>
+                <w:bCs w:val="false"/>
+                <w:sz w:val="18"/>
+                <w:szCs w:val="18"/>
+              </w:rPr>
+              <w:t xml:space="preserve">(a) Temperature (|−0.81| vs 2 × 0.20 = 0.40) and weekend (11.53 vs 3.06) are clearly different from zero; </w:t>
+            </w:r>
+            <w:r>
+              <w:rPr>
+                <w:rFonts w:ascii="Arial" w:cs="Arial" w:eastAsia="Arial" w:hAnsi="Arial"/>
+                <w:b/>
+                <w:bCs/>
+                <w:sz w:val="18"/>
+                <w:szCs w:val="18"/>
+              </w:rPr>
+              <w:t xml:space="preserve">wind</w:t>
+            </w:r>
+            <w:r>
+              <w:rPr>
+                <w:rFonts w:ascii="Arial" w:cs="Arial" w:eastAsia="Arial" w:hAnsi="Arial"/>
+                <w:b w:val="false"/>
+                <w:bCs w:val="false"/>
+                <w:sz w:val="18"/>
+                <w:szCs w:val="18"/>
+              </w:rPr>
+              <w:t xml:space="preserve"> (|−0.18| vs 2 × 0.10 = 0.20) is not (borderline). (b) Warmer days go with fewer pastries (about 0.8 per °C). Possible reasons: customers switch to cold items in the heat; temperature stands in for something else that changed over the summer. (c) Keep it only if it earns its place on unseen days (the evidence is borderline); otherwise drop and refit.</w:t>
             </w:r>
           </w:p>
         </w:tc>
@@ -1678,7 +1732,7 @@
                 <w:sz w:val="18"/>
                 <w:szCs w:val="18"/>
               </w:rPr>
-              <w:t xml:space="preserve">2</w:t>
+              <w:t xml:space="preserve">3</w:t>
             </w:r>
           </w:p>
         </w:tc>
@@ -1712,7 +1766,7 @@
                 <w:sz w:val="18"/>
                 <w:szCs w:val="18"/>
               </w:rPr>
-              <w:t xml:space="preserve">1 + 1 (both pairs).</w:t>
+              <w:t xml:space="preserve">1 + 1 + 1.</w:t>
             </w:r>
           </w:p>
         </w:tc>
@@ -1723,7 +1777,7 @@
         </w:trPr>
         <w:tc>
           <w:tcPr>
-            <w:tcW w:type="dxa" w:w="500"/>
+            <w:tcW w:type="dxa" w:w="700"/>
             <w:tcBorders>
               <w:top w:val="single" w:color="808080" w:sz="4"/>
               <w:left w:val="single" w:color="808080" w:sz="4"/>
@@ -1751,7 +1805,7 @@
                 <w:sz w:val="18"/>
                 <w:szCs w:val="18"/>
               </w:rPr>
-              <w:t xml:space="preserve">8</w:t>
+              <w:t xml:space="preserve">2d</w:t>
             </w:r>
           </w:p>
         </w:tc>
@@ -1785,41 +1839,41 @@
                 <w:sz w:val="18"/>
                 <w:szCs w:val="18"/>
               </w:rPr>
-              <w:t xml:space="preserve">LO3, LO5, LO6 · Con</w:t>
-            </w:r>
-          </w:p>
-        </w:tc>
-        <w:tc>
-          <w:tcPr>
-            <w:tcW w:type="dxa" w:w="5700"/>
-            <w:tcBorders>
-              <w:top w:val="single" w:color="808080" w:sz="4"/>
-              <w:left w:val="single" w:color="808080" w:sz="4"/>
-              <w:bottom w:val="single" w:color="808080" w:sz="4"/>
-              <w:right w:val="single" w:color="808080" w:sz="4"/>
-            </w:tcBorders>
-            <w:tcMar>
-              <w:top w:type="dxa" w:w="40"/>
-              <w:left w:type="dxa" w:w="80"/>
-              <w:bottom w:type="dxa" w:w="40"/>
-              <w:right w:type="dxa" w:w="80"/>
-            </w:tcMar>
-            <w:vAlign w:val="center"/>
-          </w:tcPr>
-          <w:p>
-            <w:pPr>
-              <w:spacing w:after="0" w:before="0"/>
-              <w:jc w:val="left"/>
-            </w:pPr>
-            <w:r>
-              <w:rPr>
-                <w:rFonts w:ascii="Arial" w:cs="Arial" w:eastAsia="Arial" w:hAnsi="Arial"/>
-                <w:b w:val="false"/>
-                <w:bCs w:val="false"/>
-                <w:sz w:val="18"/>
-                <w:szCs w:val="18"/>
-              </w:rPr>
-              <w:t xml:space="preserve">(a) The pastry price changed only once, on 30 June (no price trials), so price is essentially the date flag. (b) The price effect cannot be separated from anything else that changed on 30 June (season, temperature, events): LINEST cannot tell them apart, so a price coefficient is unstable and imprecise. To estimate it you would need price variation </w:t>
+              <w:t xml:space="preserve">LO5, LO6 · Cal</w:t>
+            </w:r>
+          </w:p>
+        </w:tc>
+        <w:tc>
+          <w:tcPr>
+            <w:tcW w:type="dxa" w:w="5500"/>
+            <w:tcBorders>
+              <w:top w:val="single" w:color="808080" w:sz="4"/>
+              <w:left w:val="single" w:color="808080" w:sz="4"/>
+              <w:bottom w:val="single" w:color="808080" w:sz="4"/>
+              <w:right w:val="single" w:color="808080" w:sz="4"/>
+            </w:tcBorders>
+            <w:tcMar>
+              <w:top w:type="dxa" w:w="40"/>
+              <w:left w:type="dxa" w:w="80"/>
+              <w:bottom w:type="dxa" w:w="40"/>
+              <w:right w:type="dxa" w:w="80"/>
+            </w:tcMar>
+            <w:vAlign w:val="center"/>
+          </w:tcPr>
+          <w:p>
+            <w:pPr>
+              <w:spacing w:after="0" w:before="0"/>
+              <w:jc w:val="left"/>
+            </w:pPr>
+            <w:r>
+              <w:rPr>
+                <w:rFonts w:ascii="Arial" w:cs="Arial" w:eastAsia="Arial" w:hAnsi="Arial"/>
+                <w:b w:val="false"/>
+                <w:bCs w:val="false"/>
+                <w:sz w:val="18"/>
+                <w:szCs w:val="18"/>
+              </w:rPr>
+              <w:t xml:space="preserve">(a) ŷ = 84.76 − 0.81(20) − 0.18(12) + 11.53(1) = </w:t>
             </w:r>
             <w:r>
               <w:rPr>
@@ -1829,17 +1883,37 @@
                 <w:sz w:val="18"/>
                 <w:szCs w:val="18"/>
               </w:rPr>
-              <w:t xml:space="preserve">within</w:t>
-            </w:r>
-            <w:r>
-              <w:rPr>
-                <w:rFonts w:ascii="Arial" w:cs="Arial" w:eastAsia="Arial" w:hAnsi="Arial"/>
-                <w:b w:val="false"/>
-                <w:bCs w:val="false"/>
-                <w:sz w:val="18"/>
-                <w:szCs w:val="18"/>
-              </w:rPr>
-              <w:t xml:space="preserve"> a period. (c) Keep temperature (stronger |r| with pastry_units and a direct mechanism), drop sunshine.</w:t>
+              <w:t xml:space="preserve">77.9</w:t>
+            </w:r>
+            <w:r>
+              <w:rPr>
+                <w:rFonts w:ascii="Arial" w:cs="Arial" w:eastAsia="Arial" w:hAnsi="Arial"/>
+                <w:b w:val="false"/>
+                <w:bCs w:val="false"/>
+                <w:sz w:val="18"/>
+                <w:szCs w:val="18"/>
+              </w:rPr>
+              <w:t xml:space="preserve"> pastries. (b) 2 × 8.95 = 17.90, so about </w:t>
+            </w:r>
+            <w:r>
+              <w:rPr>
+                <w:rFonts w:ascii="Arial" w:cs="Arial" w:eastAsia="Arial" w:hAnsi="Arial"/>
+                <w:b/>
+                <w:bCs/>
+                <w:sz w:val="18"/>
+                <w:szCs w:val="18"/>
+              </w:rPr>
+              <w:t xml:space="preserve">60 to 96</w:t>
+            </w:r>
+            <w:r>
+              <w:rPr>
+                <w:rFonts w:ascii="Arial" w:cs="Arial" w:eastAsia="Arial" w:hAnsi="Arial"/>
+                <w:b w:val="false"/>
+                <w:bCs w:val="false"/>
+                <w:sz w:val="18"/>
+                <w:szCs w:val="18"/>
+              </w:rPr>
+              <w:t xml:space="preserve"> pastries. (c) 98 is outside the range, so it is surprising: more than 2 SE − Y from the prediction (a storm, a closure, a stock-out or a special event?); investigate.</w:t>
             </w:r>
           </w:p>
         </w:tc>
@@ -1873,7 +1947,7 @@
                 <w:sz w:val="18"/>
                 <w:szCs w:val="18"/>
               </w:rPr>
-              <w:t xml:space="preserve">3</w:t>
+              <w:t xml:space="preserve">4</w:t>
             </w:r>
           </w:p>
         </w:tc>
@@ -1907,7 +1981,7 @@
                 <w:sz w:val="18"/>
                 <w:szCs w:val="18"/>
               </w:rPr>
-              <w:t xml:space="preserve">1 + 1 + 1.</w:t>
+              <w:t xml:space="preserve">2 prediction (1 substitution, 1 value) + 1 range + 1 judgement with a reason.</w:t>
             </w:r>
           </w:p>
         </w:tc>
@@ -1918,7 +1992,7 @@
         </w:trPr>
         <w:tc>
           <w:tcPr>
-            <w:tcW w:type="dxa" w:w="500"/>
+            <w:tcW w:type="dxa" w:w="700"/>
             <w:tcBorders>
               <w:top w:val="single" w:color="808080" w:sz="4"/>
               <w:left w:val="single" w:color="808080" w:sz="4"/>
@@ -1946,7 +2020,7 @@
                 <w:sz w:val="18"/>
                 <w:szCs w:val="18"/>
               </w:rPr>
-              <w:t xml:space="preserve">9</w:t>
+              <w:t xml:space="preserve">3a-i</w:t>
             </w:r>
           </w:p>
         </w:tc>
@@ -1980,41 +2054,41 @@
                 <w:sz w:val="18"/>
                 <w:szCs w:val="18"/>
               </w:rPr>
-              <w:t xml:space="preserve">LO3, LO5 · Cal</w:t>
-            </w:r>
-          </w:p>
-        </w:tc>
-        <w:tc>
-          <w:tcPr>
-            <w:tcW w:type="dxa" w:w="5700"/>
-            <w:tcBorders>
-              <w:top w:val="single" w:color="808080" w:sz="4"/>
-              <w:left w:val="single" w:color="808080" w:sz="4"/>
-              <w:bottom w:val="single" w:color="808080" w:sz="4"/>
-              <w:right w:val="single" w:color="808080" w:sz="4"/>
-            </w:tcBorders>
-            <w:tcMar>
-              <w:top w:type="dxa" w:w="40"/>
-              <w:left w:type="dxa" w:w="80"/>
-              <w:bottom w:type="dxa" w:w="40"/>
-              <w:right w:type="dxa" w:w="80"/>
-            </w:tcMar>
-            <w:vAlign w:val="center"/>
-          </w:tcPr>
-          <w:p>
-            <w:pPr>
-              <w:spacing w:after="0" w:before="0"/>
-              <w:jc w:val="left"/>
-            </w:pPr>
-            <w:r>
-              <w:rPr>
-                <w:rFonts w:ascii="Arial" w:cs="Arial" w:eastAsia="Arial" w:hAnsi="Arial"/>
-                <w:b w:val="false"/>
-                <w:bCs w:val="false"/>
-                <w:sz w:val="18"/>
-                <w:szCs w:val="18"/>
-              </w:rPr>
-              <w:t xml:space="preserve">b = 0.50 × 10.80 ÷ 0.45 = 11.9; a = 67.07 − 11.9 × 0.29 = 63.7. Slope: weekend days sell about 12 more pastries than weekdays on average (it equals the difference between the group means, 75.6 − 63.7 = 11.9). Intercept: the weekday average (≈ 63.7).</w:t>
+              <w:t xml:space="preserve">LO3, LO6 · Cal</w:t>
+            </w:r>
+          </w:p>
+        </w:tc>
+        <w:tc>
+          <w:tcPr>
+            <w:tcW w:type="dxa" w:w="5500"/>
+            <w:tcBorders>
+              <w:top w:val="single" w:color="808080" w:sz="4"/>
+              <w:left w:val="single" w:color="808080" w:sz="4"/>
+              <w:bottom w:val="single" w:color="808080" w:sz="4"/>
+              <w:right w:val="single" w:color="808080" w:sz="4"/>
+            </w:tcBorders>
+            <w:tcMar>
+              <w:top w:type="dxa" w:w="40"/>
+              <w:left w:type="dxa" w:w="80"/>
+              <w:bottom w:type="dxa" w:w="40"/>
+              <w:right w:type="dxa" w:w="80"/>
+            </w:tcMar>
+            <w:vAlign w:val="center"/>
+          </w:tcPr>
+          <w:p>
+            <w:pPr>
+              <w:spacing w:after="0" w:before="0"/>
+              <w:jc w:val="left"/>
+            </w:pPr>
+            <w:r>
+              <w:rPr>
+                <w:rFonts w:ascii="Arial" w:cs="Arial" w:eastAsia="Arial" w:hAnsi="Arial"/>
+                <w:b w:val="false"/>
+                <w:bCs w:val="false"/>
+                <w:sz w:val="18"/>
+                <w:szCs w:val="18"/>
+              </w:rPr>
+              <w:t xml:space="preserve">Filled table: Mon actual 62, predicted 66, residual −4; Sat actual 84, predicted 74, residual +10; Wed actual 58, predicted 60, residual −2; Fri actual 65, predicted 69, residual −4.</w:t>
             </w:r>
           </w:p>
         </w:tc>
@@ -2048,7 +2122,7 @@
                 <w:sz w:val="18"/>
                 <w:szCs w:val="18"/>
               </w:rPr>
-              <w:t xml:space="preserve">2</w:t>
+              <w:t xml:space="preserve">1</w:t>
             </w:r>
           </w:p>
         </w:tc>
@@ -2082,7 +2156,7 @@
                 <w:sz w:val="18"/>
                 <w:szCs w:val="18"/>
               </w:rPr>
-              <w:t xml:space="preserve">1 slope and intercept + 1 meaning.</w:t>
+              <w:t xml:space="preserve">1 all blanks correct (follow-through on a single slip).</w:t>
             </w:r>
           </w:p>
         </w:tc>
@@ -2093,7 +2167,7 @@
         </w:trPr>
         <w:tc>
           <w:tcPr>
-            <w:tcW w:type="dxa" w:w="500"/>
+            <w:tcW w:type="dxa" w:w="700"/>
             <w:tcBorders>
               <w:top w:val="single" w:color="808080" w:sz="4"/>
               <w:left w:val="single" w:color="808080" w:sz="4"/>
@@ -2121,7 +2195,7 @@
                 <w:sz w:val="18"/>
                 <w:szCs w:val="18"/>
               </w:rPr>
-              <w:t xml:space="preserve">10</w:t>
+              <w:t xml:space="preserve">3a-ii</w:t>
             </w:r>
           </w:p>
         </w:tc>
@@ -2155,41 +2229,61 @@
                 <w:sz w:val="18"/>
                 <w:szCs w:val="18"/>
               </w:rPr>
-              <w:t xml:space="preserve">LO5, LO6 · Com</w:t>
-            </w:r>
-          </w:p>
-        </w:tc>
-        <w:tc>
-          <w:tcPr>
-            <w:tcW w:type="dxa" w:w="5700"/>
-            <w:tcBorders>
-              <w:top w:val="single" w:color="808080" w:sz="4"/>
-              <w:left w:val="single" w:color="808080" w:sz="4"/>
-              <w:bottom w:val="single" w:color="808080" w:sz="4"/>
-              <w:right w:val="single" w:color="808080" w:sz="4"/>
-            </w:tcBorders>
-            <w:tcMar>
-              <w:top w:type="dxa" w:w="40"/>
-              <w:left w:type="dxa" w:w="80"/>
-              <w:bottom w:type="dxa" w:w="40"/>
-              <w:right w:type="dxa" w:w="80"/>
-            </w:tcMar>
-            <w:vAlign w:val="center"/>
-          </w:tcPr>
-          <w:p>
-            <w:pPr>
-              <w:spacing w:after="0" w:before="0"/>
-              <w:jc w:val="left"/>
-            </w:pPr>
-            <w:r>
-              <w:rPr>
-                <w:rFonts w:ascii="Arial" w:cs="Arial" w:eastAsia="Arial" w:hAnsi="Arial"/>
-                <w:b w:val="false"/>
-                <w:bCs w:val="false"/>
-                <w:sz w:val="18"/>
-                <w:szCs w:val="18"/>
-              </w:rPr>
-              <w:t xml:space="preserve">(a) Row 1 reversed: Col 1 = wind_kmh (−0.26), Col 2 = beach_event (7.67), Col 3 = weekend (11.30), Col 4 = temperature_c (−1.00), Col 5 = intercept (88.43). (b) t = −1.00 ÷ 0.19 = −5.3: significant; each +1 °C goes with about 1 fewer pastry a day, holding the others constant. Reason: on hot days customers switch to cold items (gelato, iced coffee) or want fewer warm, heavy foods. (c) df = 163 in Row 4: n = df + k + 1 = 163 + 4 + 1 = 168.</w:t>
+              <w:t xml:space="preserve">LO3, LO6 · Cal</w:t>
+            </w:r>
+          </w:p>
+        </w:tc>
+        <w:tc>
+          <w:tcPr>
+            <w:tcW w:type="dxa" w:w="5500"/>
+            <w:tcBorders>
+              <w:top w:val="single" w:color="808080" w:sz="4"/>
+              <w:left w:val="single" w:color="808080" w:sz="4"/>
+              <w:bottom w:val="single" w:color="808080" w:sz="4"/>
+              <w:right w:val="single" w:color="808080" w:sz="4"/>
+            </w:tcBorders>
+            <w:tcMar>
+              <w:top w:type="dxa" w:w="40"/>
+              <w:left w:type="dxa" w:w="80"/>
+              <w:bottom w:type="dxa" w:w="40"/>
+              <w:right w:type="dxa" w:w="80"/>
+            </w:tcMar>
+            <w:vAlign w:val="center"/>
+          </w:tcPr>
+          <w:p>
+            <w:pPr>
+              <w:spacing w:after="0" w:before="0"/>
+              <w:jc w:val="left"/>
+            </w:pPr>
+            <w:r>
+              <w:rPr>
+                <w:rFonts w:ascii="Arial" w:cs="Arial" w:eastAsia="Arial" w:hAnsi="Arial"/>
+                <w:b w:val="false"/>
+                <w:bCs w:val="false"/>
+                <w:sz w:val="18"/>
+                <w:szCs w:val="18"/>
+              </w:rPr>
+              <w:t xml:space="preserve">MAE = (4 + 10 + 2 + 4) ÷ 4 = </w:t>
+            </w:r>
+            <w:r>
+              <w:rPr>
+                <w:rFonts w:ascii="Arial" w:cs="Arial" w:eastAsia="Arial" w:hAnsi="Arial"/>
+                <w:b/>
+                <w:bCs/>
+                <w:sz w:val="18"/>
+                <w:szCs w:val="18"/>
+              </w:rPr>
+              <w:t xml:space="preserve">5</w:t>
+            </w:r>
+            <w:r>
+              <w:rPr>
+                <w:rFonts w:ascii="Arial" w:cs="Arial" w:eastAsia="Arial" w:hAnsi="Arial"/>
+                <w:b w:val="false"/>
+                <w:bCs w:val="false"/>
+                <w:sz w:val="18"/>
+                <w:szCs w:val="18"/>
+              </w:rPr>
+              <w:t xml:space="preserve"> pastries.</w:t>
             </w:r>
           </w:p>
         </w:tc>
@@ -2223,7 +2317,7 @@
                 <w:sz w:val="18"/>
                 <w:szCs w:val="18"/>
               </w:rPr>
-              <w:t xml:space="preserve">3</w:t>
+              <w:t xml:space="preserve">1</w:t>
             </w:r>
           </w:p>
         </w:tc>
@@ -2257,7 +2351,7 @@
                 <w:sz w:val="18"/>
                 <w:szCs w:val="18"/>
               </w:rPr>
-              <w:t xml:space="preserve">1 matching + 1 t and interpretation with a reason + 1 n from df.</w:t>
+              <w:t xml:space="preserve">1 correct (absolute values used).</w:t>
             </w:r>
           </w:p>
         </w:tc>
@@ -2268,7 +2362,7 @@
         </w:trPr>
         <w:tc>
           <w:tcPr>
-            <w:tcW w:type="dxa" w:w="500"/>
+            <w:tcW w:type="dxa" w:w="700"/>
             <w:tcBorders>
               <w:top w:val="single" w:color="808080" w:sz="4"/>
               <w:left w:val="single" w:color="808080" w:sz="4"/>
@@ -2296,7 +2390,7 @@
                 <w:sz w:val="18"/>
                 <w:szCs w:val="18"/>
               </w:rPr>
-              <w:t xml:space="preserve">11</w:t>
+              <w:t xml:space="preserve">3a-iii</w:t>
             </w:r>
           </w:p>
         </w:tc>
@@ -2330,41 +2424,61 @@
                 <w:sz w:val="18"/>
                 <w:szCs w:val="18"/>
               </w:rPr>
-              <w:t xml:space="preserve">LO6 · Cal + Con</w:t>
-            </w:r>
-          </w:p>
-        </w:tc>
-        <w:tc>
-          <w:tcPr>
-            <w:tcW w:type="dxa" w:w="5700"/>
-            <w:tcBorders>
-              <w:top w:val="single" w:color="808080" w:sz="4"/>
-              <w:left w:val="single" w:color="808080" w:sz="4"/>
-              <w:bottom w:val="single" w:color="808080" w:sz="4"/>
-              <w:right w:val="single" w:color="808080" w:sz="4"/>
-            </w:tcBorders>
-            <w:tcMar>
-              <w:top w:type="dxa" w:w="40"/>
-              <w:left w:type="dxa" w:w="80"/>
-              <w:bottom w:type="dxa" w:w="40"/>
-              <w:right w:type="dxa" w:w="80"/>
-            </w:tcMar>
-            <w:vAlign w:val="center"/>
-          </w:tcPr>
-          <w:p>
-            <w:pPr>
-              <w:spacing w:after="0" w:before="0"/>
-              <w:jc w:val="left"/>
-            </w:pPr>
-            <w:r>
-              <w:rPr>
-                <w:rFonts w:ascii="Arial" w:cs="Arial" w:eastAsia="Arial" w:hAnsi="Arial"/>
-                <w:b w:val="false"/>
-                <w:bCs w:val="false"/>
-                <w:sz w:val="18"/>
-                <w:szCs w:val="18"/>
-              </w:rPr>
-              <w:t xml:space="preserve">(a) t = −0.26 ÷ 0.10 = −2.6. (b) Adjusted R²: M3 = 1 − (1 − 0.379) × 167 ÷ 164 = 0.368; M4 = 1 − (1 − 0.407) × 167 ÷ 163 = 0.392. (c) Test it on days the model has not seen: refit with and without wind on the first 112 days and compare the MAE on later days; check the sign is stable in another period; ask whether there is a mechanism (windy days, fewer outdoor customers). Keep it only if it earns its place.</w:t>
+              <w:t xml:space="preserve">LO6 · Con</w:t>
+            </w:r>
+          </w:p>
+        </w:tc>
+        <w:tc>
+          <w:tcPr>
+            <w:tcW w:type="dxa" w:w="5500"/>
+            <w:tcBorders>
+              <w:top w:val="single" w:color="808080" w:sz="4"/>
+              <w:left w:val="single" w:color="808080" w:sz="4"/>
+              <w:bottom w:val="single" w:color="808080" w:sz="4"/>
+              <w:right w:val="single" w:color="808080" w:sz="4"/>
+            </w:tcBorders>
+            <w:tcMar>
+              <w:top w:type="dxa" w:w="40"/>
+              <w:left w:type="dxa" w:w="80"/>
+              <w:bottom w:type="dxa" w:w="40"/>
+              <w:right w:type="dxa" w:w="80"/>
+            </w:tcMar>
+            <w:vAlign w:val="center"/>
+          </w:tcPr>
+          <w:p>
+            <w:pPr>
+              <w:spacing w:after="0" w:before="0"/>
+              <w:jc w:val="left"/>
+            </w:pPr>
+            <w:r>
+              <w:rPr>
+                <w:rFonts w:ascii="Arial" w:cs="Arial" w:eastAsia="Arial" w:hAnsi="Arial"/>
+                <w:b w:val="false"/>
+                <w:bCs w:val="false"/>
+                <w:sz w:val="18"/>
+                <w:szCs w:val="18"/>
+              </w:rPr>
+              <w:t xml:space="preserve">Model Z has the </w:t>
+            </w:r>
+            <w:r>
+              <w:rPr>
+                <w:rFonts w:ascii="Arial" w:cs="Arial" w:eastAsia="Arial" w:hAnsi="Arial"/>
+                <w:b/>
+                <w:bCs/>
+                <w:sz w:val="18"/>
+                <w:szCs w:val="18"/>
+              </w:rPr>
+              <w:t xml:space="preserve">lower MAE</w:t>
+            </w:r>
+            <w:r>
+              <w:rPr>
+                <w:rFonts w:ascii="Arial" w:cs="Arial" w:eastAsia="Arial" w:hAnsi="Arial"/>
+                <w:b w:val="false"/>
+                <w:bCs w:val="false"/>
+                <w:sz w:val="18"/>
+                <w:szCs w:val="18"/>
+              </w:rPr>
+              <w:t xml:space="preserve"> (3 vs 5). But every residual has the same sign: Z over-predicts every day by 3 (systematic bias). A simple correction (subtract 3) would remove it. Model X’s errors are larger but not one-sided.</w:t>
             </w:r>
           </w:p>
         </w:tc>
@@ -2398,7 +2512,7 @@
                 <w:sz w:val="18"/>
                 <w:szCs w:val="18"/>
               </w:rPr>
-              <w:t xml:space="preserve">3</w:t>
+              <w:t xml:space="preserve">2</w:t>
             </w:r>
           </w:p>
         </w:tc>
@@ -2432,7 +2546,7 @@
                 <w:sz w:val="18"/>
                 <w:szCs w:val="18"/>
               </w:rPr>
-              <w:t xml:space="preserve">1 t + 1 adjusted R² values + 1 sensible check against chance.</w:t>
+              <w:t xml:space="preserve">1 lower MAE with numbers + 1 identical signs = bias.</w:t>
             </w:r>
           </w:p>
         </w:tc>
@@ -2443,7 +2557,7 @@
         </w:trPr>
         <w:tc>
           <w:tcPr>
-            <w:tcW w:type="dxa" w:w="500"/>
+            <w:tcW w:type="dxa" w:w="700"/>
             <w:tcBorders>
               <w:top w:val="single" w:color="808080" w:sz="4"/>
               <w:left w:val="single" w:color="808080" w:sz="4"/>
@@ -2471,7 +2585,7 @@
                 <w:sz w:val="18"/>
                 <w:szCs w:val="18"/>
               </w:rPr>
-              <w:t xml:space="preserve">12</w:t>
+              <w:t xml:space="preserve">3b</w:t>
             </w:r>
           </w:p>
         </w:tc>
@@ -2505,41 +2619,61 @@
                 <w:sz w:val="18"/>
                 <w:szCs w:val="18"/>
               </w:rPr>
-              <w:t xml:space="preserve">LO3, LO6, LO7 · Cal + Con</w:t>
-            </w:r>
-          </w:p>
-        </w:tc>
-        <w:tc>
-          <w:tcPr>
-            <w:tcW w:type="dxa" w:w="5700"/>
-            <w:tcBorders>
-              <w:top w:val="single" w:color="808080" w:sz="4"/>
-              <w:left w:val="single" w:color="808080" w:sz="4"/>
-              <w:bottom w:val="single" w:color="808080" w:sz="4"/>
-              <w:right w:val="single" w:color="808080" w:sz="4"/>
-            </w:tcBorders>
-            <w:tcMar>
-              <w:top w:type="dxa" w:w="40"/>
-              <w:left w:type="dxa" w:w="80"/>
-              <w:bottom w:type="dxa" w:w="40"/>
-              <w:right w:type="dxa" w:w="80"/>
-            </w:tcMar>
-            <w:vAlign w:val="center"/>
-          </w:tcPr>
-          <w:p>
-            <w:pPr>
-              <w:spacing w:after="0" w:before="0"/>
-              <w:jc w:val="left"/>
-            </w:pPr>
-            <w:r>
-              <w:rPr>
-                <w:rFonts w:ascii="Arial" w:cs="Arial" w:eastAsia="Arial" w:hAnsi="Arial"/>
-                <w:b w:val="false"/>
-                <w:bCs w:val="false"/>
-                <w:sz w:val="18"/>
-                <w:szCs w:val="18"/>
-              </w:rPr>
-              <w:t xml:space="preserve">(a) SE = √(10.9²/84 + 10.5²/84) = 1.66; difference = −2.9; t = −1.75: not significant. (b) No. “Not significant” means the data cannot distinguish a price effect from chance (absence of evidence is not evidence of absence). (c) Price overlaps almost perfectly with post_change (r = 1.00) and moves with the season, so LINEST cannot separate them: the SE (6.48) is larger than the coefficient (−5.61).</w:t>
+              <w:t xml:space="preserve">LO3, LO4, LO6 · Con</w:t>
+            </w:r>
+          </w:p>
+        </w:tc>
+        <w:tc>
+          <w:tcPr>
+            <w:tcW w:type="dxa" w:w="5500"/>
+            <w:tcBorders>
+              <w:top w:val="single" w:color="808080" w:sz="4"/>
+              <w:left w:val="single" w:color="808080" w:sz="4"/>
+              <w:bottom w:val="single" w:color="808080" w:sz="4"/>
+              <w:right w:val="single" w:color="808080" w:sz="4"/>
+            </w:tcBorders>
+            <w:tcMar>
+              <w:top w:type="dxa" w:w="40"/>
+              <w:left w:type="dxa" w:w="80"/>
+              <w:bottom w:type="dxa" w:w="40"/>
+              <w:right w:type="dxa" w:w="80"/>
+            </w:tcMar>
+            <w:vAlign w:val="center"/>
+          </w:tcPr>
+          <w:p>
+            <w:pPr>
+              <w:spacing w:after="0" w:before="0"/>
+              <w:jc w:val="left"/>
+            </w:pPr>
+            <w:r>
+              <w:rPr>
+                <w:rFonts w:ascii="Arial" w:cs="Arial" w:eastAsia="Arial" w:hAnsi="Arial"/>
+                <w:b w:val="false"/>
+                <w:bCs w:val="false"/>
+                <w:sz w:val="18"/>
+                <w:szCs w:val="18"/>
+              </w:rPr>
+              <w:t xml:space="preserve">(i) </w:t>
+            </w:r>
+            <w:r>
+              <w:rPr>
+                <w:rFonts w:ascii="Arial" w:cs="Arial" w:eastAsia="Arial" w:hAnsi="Arial"/>
+                <w:b/>
+                <w:bCs/>
+                <w:sz w:val="18"/>
+                <w:szCs w:val="18"/>
+              </w:rPr>
+              <w:t xml:space="preserve">Day 4</w:t>
+            </w:r>
+            <w:r>
+              <w:rPr>
+                <w:rFonts w:ascii="Arial" w:cs="Arial" w:eastAsia="Arial" w:hAnsi="Arial"/>
+                <w:b w:val="false"/>
+                <w:bCs w:val="false"/>
+                <w:sz w:val="18"/>
+                <w:szCs w:val="18"/>
+              </w:rPr>
+              <w:t xml:space="preserve">: sales far above the others at a middling temperature. (ii) The slope barely changes (−1.14 with it, −0.98 without) but R² jumps from 0.26 to 0.96 (SE − Y 10.3 to 1.2): the spike spoils the fit and the intercept, not the trend. (iii) Find out why (a festival tie-in, a promotion, a recording error). Delete only with a documented reason; otherwise keep it, flag it and report both.</w:t>
             </w:r>
           </w:p>
         </w:tc>
@@ -2573,7 +2707,7 @@
                 <w:sz w:val="18"/>
                 <w:szCs w:val="18"/>
               </w:rPr>
-              <w:t xml:space="preserve">3</w:t>
+              <w:t xml:space="preserve">4</w:t>
             </w:r>
           </w:p>
         </w:tc>
@@ -2607,7 +2741,7 @@
                 <w:sz w:val="18"/>
                 <w:szCs w:val="18"/>
               </w:rPr>
-              <w:t xml:space="preserve">1 SE and t with decision + 1 + 1.</w:t>
+              <w:t xml:space="preserve">1 day + 2 impact (slope barely changes; R² changes a lot) + 1 sensible next step.</w:t>
             </w:r>
           </w:p>
         </w:tc>
@@ -2618,7 +2752,7 @@
         </w:trPr>
         <w:tc>
           <w:tcPr>
-            <w:tcW w:type="dxa" w:w="500"/>
+            <w:tcW w:type="dxa" w:w="700"/>
             <w:tcBorders>
               <w:top w:val="single" w:color="808080" w:sz="4"/>
               <w:left w:val="single" w:color="808080" w:sz="4"/>
@@ -2646,7 +2780,7 @@
                 <w:sz w:val="18"/>
                 <w:szCs w:val="18"/>
               </w:rPr>
-              <w:t xml:space="preserve">13</w:t>
+              <w:t xml:space="preserve">4a</w:t>
             </w:r>
           </w:p>
         </w:tc>
@@ -2680,41 +2814,41 @@
                 <w:sz w:val="18"/>
                 <w:szCs w:val="18"/>
               </w:rPr>
-              <w:t xml:space="preserve">LO6 · Cal</w:t>
-            </w:r>
-          </w:p>
-        </w:tc>
-        <w:tc>
-          <w:tcPr>
-            <w:tcW w:type="dxa" w:w="5700"/>
-            <w:tcBorders>
-              <w:top w:val="single" w:color="808080" w:sz="4"/>
-              <w:left w:val="single" w:color="808080" w:sz="4"/>
-              <w:bottom w:val="single" w:color="808080" w:sz="4"/>
-              <w:right w:val="single" w:color="808080" w:sz="4"/>
-            </w:tcBorders>
-            <w:tcMar>
-              <w:top w:type="dxa" w:w="40"/>
-              <w:left w:type="dxa" w:w="80"/>
-              <w:bottom w:type="dxa" w:w="40"/>
-              <w:right w:type="dxa" w:w="80"/>
-            </w:tcMar>
-            <w:vAlign w:val="center"/>
-          </w:tcPr>
-          <w:p>
-            <w:pPr>
-              <w:spacing w:after="0" w:before="0"/>
-              <w:jc w:val="left"/>
-            </w:pPr>
-            <w:r>
-              <w:rPr>
-                <w:rFonts w:ascii="Arial" w:cs="Arial" w:eastAsia="Arial" w:hAnsi="Arial"/>
-                <w:b w:val="false"/>
-                <w:bCs w:val="false"/>
-                <w:sz w:val="18"/>
-                <w:szCs w:val="18"/>
-              </w:rPr>
-              <w:t xml:space="preserve">Jul 16: predicted 63.5, residual −2.5, |res| &lt; 16.8: ordinary. Jun 26: predicted 63.3, residual −18.3, |res| &gt; 16.8: unusual. Investigate before deleting; about 1 day in 20 is beyond 2 SE even if the model is fine.</w:t>
+              <w:t xml:space="preserve">LO3 · Cal</w:t>
+            </w:r>
+          </w:p>
+        </w:tc>
+        <w:tc>
+          <w:tcPr>
+            <w:tcW w:type="dxa" w:w="5500"/>
+            <w:tcBorders>
+              <w:top w:val="single" w:color="808080" w:sz="4"/>
+              <w:left w:val="single" w:color="808080" w:sz="4"/>
+              <w:bottom w:val="single" w:color="808080" w:sz="4"/>
+              <w:right w:val="single" w:color="808080" w:sz="4"/>
+            </w:tcBorders>
+            <w:tcMar>
+              <w:top w:type="dxa" w:w="40"/>
+              <w:left w:type="dxa" w:w="80"/>
+              <w:bottom w:type="dxa" w:w="40"/>
+              <w:right w:type="dxa" w:w="80"/>
+            </w:tcMar>
+            <w:vAlign w:val="center"/>
+          </w:tcPr>
+          <w:p>
+            <w:pPr>
+              <w:spacing w:after="0" w:before="0"/>
+              <w:jc w:val="left"/>
+            </w:pPr>
+            <w:r>
+              <w:rPr>
+                <w:rFonts w:ascii="Arial" w:cs="Arial" w:eastAsia="Arial" w:hAnsi="Arial"/>
+                <w:b w:val="false"/>
+                <w:bCs w:val="false"/>
+                <w:sz w:val="18"/>
+                <w:szCs w:val="18"/>
+              </w:rPr>
+              <w:t xml:space="preserve">Means 66 and 63; Σ(x − x̄)² = 40 and 40; s₁ = √(40 ÷ 4) = 3.16, s₂ = √(40 ÷ 4) = 3.16 (deviations in the worked table below).</w:t>
             </w:r>
           </w:p>
         </w:tc>
@@ -2748,7 +2882,7 @@
                 <w:sz w:val="18"/>
                 <w:szCs w:val="18"/>
               </w:rPr>
-              <w:t xml:space="preserve">2</w:t>
+              <w:t xml:space="preserve">3</w:t>
             </w:r>
           </w:p>
         </w:tc>
@@ -2782,7 +2916,7 @@
                 <w:sz w:val="18"/>
                 <w:szCs w:val="18"/>
               </w:rPr>
-              <w:t xml:space="preserve">1 predictions and residuals + 1 classification and action.</w:t>
+              <w:t xml:space="preserve">1 means + 1 sums of squares + 1 s values.</w:t>
             </w:r>
           </w:p>
         </w:tc>
@@ -2793,7 +2927,7 @@
         </w:trPr>
         <w:tc>
           <w:tcPr>
-            <w:tcW w:type="dxa" w:w="500"/>
+            <w:tcW w:type="dxa" w:w="700"/>
             <w:tcBorders>
               <w:top w:val="single" w:color="808080" w:sz="4"/>
               <w:left w:val="single" w:color="808080" w:sz="4"/>
@@ -2821,7 +2955,7 @@
                 <w:sz w:val="18"/>
                 <w:szCs w:val="18"/>
               </w:rPr>
-              <w:t xml:space="preserve">14</w:t>
+              <w:t xml:space="preserve">4b</w:t>
             </w:r>
           </w:p>
         </w:tc>
@@ -2855,41 +2989,41 @@
                 <w:sz w:val="18"/>
                 <w:szCs w:val="18"/>
               </w:rPr>
-              <w:t xml:space="preserve">LO4, LO6 · Con</w:t>
-            </w:r>
-          </w:p>
-        </w:tc>
-        <w:tc>
-          <w:tcPr>
-            <w:tcW w:type="dxa" w:w="5700"/>
-            <w:tcBorders>
-              <w:top w:val="single" w:color="808080" w:sz="4"/>
-              <w:left w:val="single" w:color="808080" w:sz="4"/>
-              <w:bottom w:val="single" w:color="808080" w:sz="4"/>
-              <w:right w:val="single" w:color="808080" w:sz="4"/>
-            </w:tcBorders>
-            <w:tcMar>
-              <w:top w:type="dxa" w:w="40"/>
-              <w:left w:type="dxa" w:w="80"/>
-              <w:bottom w:type="dxa" w:w="40"/>
-              <w:right w:type="dxa" w:w="80"/>
-            </w:tcMar>
-            <w:vAlign w:val="center"/>
-          </w:tcPr>
-          <w:p>
-            <w:pPr>
-              <w:spacing w:after="0" w:before="0"/>
-              <w:jc w:val="left"/>
-            </w:pPr>
-            <w:r>
-              <w:rPr>
-                <w:rFonts w:ascii="Arial" w:cs="Arial" w:eastAsia="Arial" w:hAnsi="Arial"/>
-                <w:b w:val="false"/>
-                <w:bCs w:val="false"/>
-                <w:sz w:val="18"/>
-                <w:szCs w:val="18"/>
-              </w:rPr>
-              <w:t xml:space="preserve">(a) The biggest miss is Aug 9: actual 103, predicted 82 (under-prediction by about 21). (b) Dots mostly below the line mean the model </w:t>
+              <w:t xml:space="preserve">LO3 · Cal</w:t>
+            </w:r>
+          </w:p>
+        </w:tc>
+        <w:tc>
+          <w:tcPr>
+            <w:tcW w:type="dxa" w:w="5500"/>
+            <w:tcBorders>
+              <w:top w:val="single" w:color="808080" w:sz="4"/>
+              <w:left w:val="single" w:color="808080" w:sz="4"/>
+              <w:bottom w:val="single" w:color="808080" w:sz="4"/>
+              <w:right w:val="single" w:color="808080" w:sz="4"/>
+            </w:tcBorders>
+            <w:tcMar>
+              <w:top w:type="dxa" w:w="40"/>
+              <w:left w:type="dxa" w:w="80"/>
+              <w:bottom w:type="dxa" w:w="40"/>
+              <w:right w:type="dxa" w:w="80"/>
+            </w:tcMar>
+            <w:vAlign w:val="center"/>
+          </w:tcPr>
+          <w:p>
+            <w:pPr>
+              <w:spacing w:after="0" w:before="0"/>
+              <w:jc w:val="left"/>
+            </w:pPr>
+            <w:r>
+              <w:rPr>
+                <w:rFonts w:ascii="Arial" w:cs="Arial" w:eastAsia="Arial" w:hAnsi="Arial"/>
+                <w:b w:val="false"/>
+                <w:bCs w:val="false"/>
+                <w:sz w:val="18"/>
+                <w:szCs w:val="18"/>
+              </w:rPr>
+              <w:t xml:space="preserve">s_p = √[(4 × 10 + 4 × 10) ÷ 8] = √10 = 3.16; t = (66 − 63) ÷ [3.16 × √(1/5 + 1/5)] = 3 ÷ 2.00 = </w:t>
             </w:r>
             <w:r>
               <w:rPr>
@@ -2899,17 +3033,17 @@
                 <w:sz w:val="18"/>
                 <w:szCs w:val="18"/>
               </w:rPr>
-              <w:t xml:space="preserve">over-predicts</w:t>
-            </w:r>
-            <w:r>
-              <w:rPr>
-                <w:rFonts w:ascii="Arial" w:cs="Arial" w:eastAsia="Arial" w:hAnsi="Arial"/>
-                <w:b w:val="false"/>
-                <w:bCs w:val="false"/>
-                <w:sz w:val="18"/>
-                <w:szCs w:val="18"/>
-              </w:rPr>
-              <w:t xml:space="preserve">: systematic bias, so something that matters has been left out or has changed since the fitting period.</w:t>
+              <w:t xml:space="preserve">1.50</w:t>
+            </w:r>
+            <w:r>
+              <w:rPr>
+                <w:rFonts w:ascii="Arial" w:cs="Arial" w:eastAsia="Arial" w:hAnsi="Arial"/>
+                <w:b w:val="false"/>
+                <w:bCs w:val="false"/>
+                <w:sz w:val="18"/>
+                <w:szCs w:val="18"/>
+              </w:rPr>
+              <w:t xml:space="preserve">.</w:t>
             </w:r>
           </w:p>
         </w:tc>
@@ -2977,7 +3111,7 @@
                 <w:sz w:val="18"/>
                 <w:szCs w:val="18"/>
               </w:rPr>
-              <w:t xml:space="preserve">1 + 1.</w:t>
+              <w:t xml:space="preserve">1 s_p + 1 t (follow-through on s; sign may be reported either way if direction is stated).</w:t>
             </w:r>
           </w:p>
         </w:tc>
@@ -2988,7 +3122,7 @@
         </w:trPr>
         <w:tc>
           <w:tcPr>
-            <w:tcW w:type="dxa" w:w="500"/>
+            <w:tcW w:type="dxa" w:w="700"/>
             <w:tcBorders>
               <w:top w:val="single" w:color="808080" w:sz="4"/>
               <w:left w:val="single" w:color="808080" w:sz="4"/>
@@ -3016,7 +3150,7 @@
                 <w:sz w:val="18"/>
                 <w:szCs w:val="18"/>
               </w:rPr>
-              <w:t xml:space="preserve">15</w:t>
+              <w:t xml:space="preserve">4c</w:t>
             </w:r>
           </w:p>
         </w:tc>
@@ -3050,41 +3184,41 @@
                 <w:sz w:val="18"/>
                 <w:szCs w:val="18"/>
               </w:rPr>
-              <w:t xml:space="preserve">LO5, LO6 · Cal</w:t>
-            </w:r>
-          </w:p>
-        </w:tc>
-        <w:tc>
-          <w:tcPr>
-            <w:tcW w:type="dxa" w:w="5700"/>
-            <w:tcBorders>
-              <w:top w:val="single" w:color="808080" w:sz="4"/>
-              <w:left w:val="single" w:color="808080" w:sz="4"/>
-              <w:bottom w:val="single" w:color="808080" w:sz="4"/>
-              <w:right w:val="single" w:color="808080" w:sz="4"/>
-            </w:tcBorders>
-            <w:tcMar>
-              <w:top w:type="dxa" w:w="40"/>
-              <w:left w:type="dxa" w:w="80"/>
-              <w:bottom w:type="dxa" w:w="40"/>
-              <w:right w:type="dxa" w:w="80"/>
-            </w:tcMar>
-            <w:vAlign w:val="center"/>
-          </w:tcPr>
-          <w:p>
-            <w:pPr>
-              <w:spacing w:after="0" w:before="0"/>
-              <w:jc w:val="left"/>
-            </w:pPr>
-            <w:r>
-              <w:rPr>
-                <w:rFonts w:ascii="Arial" w:cs="Arial" w:eastAsia="Arial" w:hAnsi="Arial"/>
-                <w:b w:val="false"/>
-                <w:bCs w:val="false"/>
-                <w:sz w:val="18"/>
-                <w:szCs w:val="18"/>
-              </w:rPr>
-              <w:t xml:space="preserve">Baseline: Aug 2 67.6, Aug 11 67.0, Aug 19 62.8, Sep 4 68.4. |errors|: baseline 12.4, 17.0, 1.8, 9.4 → </w:t>
+              <w:t xml:space="preserve">LO1, LO3, LO6 · Con</w:t>
+            </w:r>
+          </w:p>
+        </w:tc>
+        <w:tc>
+          <w:tcPr>
+            <w:tcW w:type="dxa" w:w="5500"/>
+            <w:tcBorders>
+              <w:top w:val="single" w:color="808080" w:sz="4"/>
+              <w:left w:val="single" w:color="808080" w:sz="4"/>
+              <w:bottom w:val="single" w:color="808080" w:sz="4"/>
+              <w:right w:val="single" w:color="808080" w:sz="4"/>
+            </w:tcBorders>
+            <w:tcMar>
+              <w:top w:type="dxa" w:w="40"/>
+              <w:left w:type="dxa" w:w="80"/>
+              <w:bottom w:type="dxa" w:w="40"/>
+              <w:right w:type="dxa" w:w="80"/>
+            </w:tcMar>
+            <w:vAlign w:val="center"/>
+          </w:tcPr>
+          <w:p>
+            <w:pPr>
+              <w:spacing w:after="0" w:before="0"/>
+              <w:jc w:val="left"/>
+            </w:pPr>
+            <w:r>
+              <w:rPr>
+                <w:rFonts w:ascii="Arial" w:cs="Arial" w:eastAsia="Arial" w:hAnsi="Arial"/>
+                <w:b w:val="false"/>
+                <w:bCs w:val="false"/>
+                <w:sz w:val="18"/>
+                <w:szCs w:val="18"/>
+              </w:rPr>
+              <w:t xml:space="preserve">(i) H₀: the price rise made no difference to mean daily pastry sales. (ii) p = 0.172 &gt; 0.05 (and |t| = 1.50 &lt; 2.31): </w:t>
             </w:r>
             <w:r>
               <w:rPr>
@@ -3094,57 +3228,17 @@
                 <w:sz w:val="18"/>
                 <w:szCs w:val="18"/>
               </w:rPr>
-              <w:t xml:space="preserve">MAE 10.1</w:t>
-            </w:r>
-            <w:r>
-              <w:rPr>
-                <w:rFonts w:ascii="Arial" w:cs="Arial" w:eastAsia="Arial" w:hAnsi="Arial"/>
-                <w:b w:val="false"/>
-                <w:bCs w:val="false"/>
-                <w:sz w:val="18"/>
-                <w:szCs w:val="18"/>
-              </w:rPr>
-              <w:t xml:space="preserve">; M3 6.4, 9.9, 2.7, 1.3 → </w:t>
-            </w:r>
-            <w:r>
-              <w:rPr>
-                <w:rFonts w:ascii="Arial" w:cs="Arial" w:eastAsia="Arial" w:hAnsi="Arial"/>
-                <w:b/>
-                <w:bCs/>
-                <w:sz w:val="18"/>
-                <w:szCs w:val="18"/>
-              </w:rPr>
-              <w:t xml:space="preserve">MAE 5.1</w:t>
-            </w:r>
-            <w:r>
-              <w:rPr>
-                <w:rFonts w:ascii="Arial" w:cs="Arial" w:eastAsia="Arial" w:hAnsi="Arial"/>
-                <w:b w:val="false"/>
-                <w:bCs w:val="false"/>
-                <w:sz w:val="18"/>
-                <w:szCs w:val="18"/>
-              </w:rPr>
-              <w:t xml:space="preserve">; M5 8.0, 5.3, 8.6, 0.1 → </w:t>
-            </w:r>
-            <w:r>
-              <w:rPr>
-                <w:rFonts w:ascii="Arial" w:cs="Arial" w:eastAsia="Arial" w:hAnsi="Arial"/>
-                <w:b/>
-                <w:bCs/>
-                <w:sz w:val="18"/>
-                <w:szCs w:val="18"/>
-              </w:rPr>
-              <w:t xml:space="preserve">MAE 5.5</w:t>
-            </w:r>
-            <w:r>
-              <w:rPr>
-                <w:rFonts w:ascii="Arial" w:cs="Arial" w:eastAsia="Arial" w:hAnsi="Arial"/>
-                <w:b w:val="false"/>
-                <w:bCs w:val="false"/>
-                <w:sz w:val="18"/>
-                <w:szCs w:val="18"/>
-              </w:rPr>
-              <w:t xml:space="preserve">.</w:t>
+              <w:t xml:space="preserve">not significant</w:t>
+            </w:r>
+            <w:r>
+              <w:rPr>
+                <w:rFonts w:ascii="Arial" w:cs="Arial" w:eastAsia="Arial" w:hAnsi="Arial"/>
+                <w:b w:val="false"/>
+                <w:bCs w:val="false"/>
+                <w:sz w:val="18"/>
+                <w:szCs w:val="18"/>
+              </w:rPr>
+              <w:t xml:space="preserve">: no clear evidence of a difference. (iii) No. “Not significant” means the data do not show a clear difference; it does not show there is none (absence of evidence is not evidence of absence). With only 5 + 5 days a real drop of a few pastries could be missed.</w:t>
             </w:r>
           </w:p>
         </w:tc>
@@ -3178,7 +3272,7 @@
                 <w:sz w:val="18"/>
                 <w:szCs w:val="18"/>
               </w:rPr>
-              <w:t xml:space="preserve">5</w:t>
+              <w:t xml:space="preserve">3</w:t>
             </w:r>
           </w:p>
         </w:tc>
@@ -3212,7 +3306,7 @@
                 <w:sz w:val="18"/>
                 <w:szCs w:val="18"/>
               </w:rPr>
-              <w:t xml:space="preserve">1 baseline + 2 errors (≥ 10 of 12 = 2, 7–9 = 1) + 2 MAEs (all three = 2, two = 1).</w:t>
+              <w:t xml:space="preserve">1 null hypothesis + 1 decision with p and t + 1 absence of evidence ≠ evidence of absence.</w:t>
             </w:r>
           </w:p>
         </w:tc>
@@ -3223,7 +3317,7 @@
         </w:trPr>
         <w:tc>
           <w:tcPr>
-            <w:tcW w:type="dxa" w:w="500"/>
+            <w:tcW w:type="dxa" w:w="700"/>
             <w:tcBorders>
               <w:top w:val="single" w:color="808080" w:sz="4"/>
               <w:left w:val="single" w:color="808080" w:sz="4"/>
@@ -3251,7 +3345,7 @@
                 <w:sz w:val="18"/>
                 <w:szCs w:val="18"/>
               </w:rPr>
-              <w:t xml:space="preserve">16</w:t>
+              <w:t xml:space="preserve">4d</w:t>
             </w:r>
           </w:p>
         </w:tc>
@@ -3291,35 +3385,35 @@
         </w:tc>
         <w:tc>
           <w:tcPr>
-            <w:tcW w:type="dxa" w:w="5700"/>
-            <w:tcBorders>
-              <w:top w:val="single" w:color="808080" w:sz="4"/>
-              <w:left w:val="single" w:color="808080" w:sz="4"/>
-              <w:bottom w:val="single" w:color="808080" w:sz="4"/>
-              <w:right w:val="single" w:color="808080" w:sz="4"/>
-            </w:tcBorders>
-            <w:tcMar>
-              <w:top w:type="dxa" w:w="40"/>
-              <w:left w:type="dxa" w:w="80"/>
-              <w:bottom w:type="dxa" w:w="40"/>
-              <w:right w:type="dxa" w:w="80"/>
-            </w:tcMar>
-            <w:vAlign w:val="center"/>
-          </w:tcPr>
-          <w:p>
-            <w:pPr>
-              <w:spacing w:after="0" w:before="0"/>
-              <w:jc w:val="left"/>
-            </w:pPr>
-            <w:r>
-              <w:rPr>
-                <w:rFonts w:ascii="Arial" w:cs="Arial" w:eastAsia="Arial" w:hAnsi="Arial"/>
-                <w:b w:val="false"/>
-                <w:bCs w:val="false"/>
-                <w:sz w:val="18"/>
-                <w:szCs w:val="18"/>
-              </w:rPr>
-              <w:t xml:space="preserve">(a) R² can only rise when variables are added; it measures fit to days already seen, noise included. (b) M3: its MAE is lower than M5’s here (5.1 vs 5.5; 6.9 vs 7.3 over all 56 unseen days) with fewer inputs. Both beat the baseline (8.9 over all 56 days), but the improvement over a weighted-average baseline is modest because the unexplained scatter (SE of y ≈ 8.6) is large relative to the signal.</w:t>
+            <w:tcW w:type="dxa" w:w="5500"/>
+            <w:tcBorders>
+              <w:top w:val="single" w:color="808080" w:sz="4"/>
+              <w:left w:val="single" w:color="808080" w:sz="4"/>
+              <w:bottom w:val="single" w:color="808080" w:sz="4"/>
+              <w:right w:val="single" w:color="808080" w:sz="4"/>
+            </w:tcBorders>
+            <w:tcMar>
+              <w:top w:type="dxa" w:w="40"/>
+              <w:left w:type="dxa" w:w="80"/>
+              <w:bottom w:type="dxa" w:w="40"/>
+              <w:right w:type="dxa" w:w="80"/>
+            </w:tcMar>
+            <w:vAlign w:val="center"/>
+          </w:tcPr>
+          <w:p>
+            <w:pPr>
+              <w:spacing w:after="0" w:before="0"/>
+              <w:jc w:val="left"/>
+            </w:pPr>
+            <w:r>
+              <w:rPr>
+                <w:rFonts w:ascii="Arial" w:cs="Arial" w:eastAsia="Arial" w:hAnsi="Arial"/>
+                <w:b w:val="false"/>
+                <w:bCs w:val="false"/>
+                <w:sz w:val="18"/>
+                <w:szCs w:val="18"/>
+              </w:rPr>
+              <w:t xml:space="preserve">More days; or put price with temperature and weekend in a LINEST model; or compare days with similar weather and weekday.</w:t>
             </w:r>
           </w:p>
         </w:tc>
@@ -3353,7 +3447,7 @@
                 <w:sz w:val="18"/>
                 <w:szCs w:val="18"/>
               </w:rPr>
-              <w:t xml:space="preserve">2</w:t>
+              <w:t xml:space="preserve">1</w:t>
             </w:r>
           </w:p>
         </w:tc>
@@ -3387,7 +3481,7 @@
                 <w:sz w:val="18"/>
                 <w:szCs w:val="18"/>
               </w:rPr>
-              <w:t xml:space="preserve">1 + 1 (choice, evidence, and the comparison with the baseline).</w:t>
+              <w:t xml:space="preserve">1 a relevant reason/idea.</w:t>
             </w:r>
           </w:p>
         </w:tc>
@@ -3398,7 +3492,7 @@
         </w:trPr>
         <w:tc>
           <w:tcPr>
-            <w:tcW w:type="dxa" w:w="500"/>
+            <w:tcW w:type="dxa" w:w="700"/>
             <w:tcBorders>
               <w:top w:val="single" w:color="808080" w:sz="4"/>
               <w:left w:val="single" w:color="808080" w:sz="4"/>
@@ -3426,7 +3520,7 @@
                 <w:sz w:val="18"/>
                 <w:szCs w:val="18"/>
               </w:rPr>
-              <w:t xml:space="preserve">17</w:t>
+              <w:t xml:space="preserve">5</w:t>
             </w:r>
           </w:p>
         </w:tc>
@@ -3466,35 +3560,35 @@
         </w:tc>
         <w:tc>
           <w:tcPr>
-            <w:tcW w:type="dxa" w:w="5700"/>
-            <w:tcBorders>
-              <w:top w:val="single" w:color="808080" w:sz="4"/>
-              <w:left w:val="single" w:color="808080" w:sz="4"/>
-              <w:bottom w:val="single" w:color="808080" w:sz="4"/>
-              <w:right w:val="single" w:color="808080" w:sz="4"/>
-            </w:tcBorders>
-            <w:tcMar>
-              <w:top w:type="dxa" w:w="40"/>
-              <w:left w:type="dxa" w:w="80"/>
-              <w:bottom w:type="dxa" w:w="40"/>
-              <w:right w:type="dxa" w:w="80"/>
-            </w:tcMar>
-            <w:vAlign w:val="center"/>
-          </w:tcPr>
-          <w:p>
-            <w:pPr>
-              <w:spacing w:after="0" w:before="0"/>
-              <w:jc w:val="left"/>
-            </w:pPr>
-            <w:r>
-              <w:rPr>
-                <w:rFonts w:ascii="Arial" w:cs="Arial" w:eastAsia="Arial" w:hAnsi="Arial"/>
-                <w:b w:val="false"/>
-                <w:bCs w:val="false"/>
-                <w:sz w:val="18"/>
-                <w:szCs w:val="18"/>
-              </w:rPr>
-              <w:t xml:space="preserve">Plain-language memo: recommends weekend, beach_event and temperature (negative) and why; states a typical error in pastries (SE of y ≈ 9, or MAE ≈ 7 on unseen days); one limitation (one season; weak predictors, R² only about 0.38; cannot foresee unusual days).</w:t>
+            <w:tcW w:type="dxa" w:w="5500"/>
+            <w:tcBorders>
+              <w:top w:val="single" w:color="808080" w:sz="4"/>
+              <w:left w:val="single" w:color="808080" w:sz="4"/>
+              <w:bottom w:val="single" w:color="808080" w:sz="4"/>
+              <w:right w:val="single" w:color="808080" w:sz="4"/>
+            </w:tcBorders>
+            <w:tcMar>
+              <w:top w:type="dxa" w:w="40"/>
+              <w:left w:type="dxa" w:w="80"/>
+              <w:bottom w:type="dxa" w:w="40"/>
+              <w:right w:type="dxa" w:w="80"/>
+            </w:tcMar>
+            <w:vAlign w:val="center"/>
+          </w:tcPr>
+          <w:p>
+            <w:pPr>
+              <w:spacing w:after="0" w:before="0"/>
+              <w:jc w:val="left"/>
+            </w:pPr>
+            <w:r>
+              <w:rPr>
+                <w:rFonts w:ascii="Arial" w:cs="Arial" w:eastAsia="Arial" w:hAnsi="Arial"/>
+                <w:b w:val="false"/>
+                <w:bCs w:val="false"/>
+                <w:sz w:val="18"/>
+                <w:szCs w:val="18"/>
+              </w:rPr>
+              <w:t xml:space="preserve">(i) The inputs recommended (e.g. weekend and events up, temperature down, wind weak) with the typical forecast error (about 9 pastries). (ii) The price test: pastry sales were a little lower after the price rise but the difference is not significant (about 3 pastries, p = 0.172). (iii) A caution (small samples, other changes, association not proof, forecasts can still miss by the typical error).</w:t>
             </w:r>
           </w:p>
         </w:tc>
@@ -3562,182 +3656,7 @@
                 <w:sz w:val="18"/>
                 <w:szCs w:val="18"/>
               </w:rPr>
-              <w:t xml:space="preserve">1 + 1 + 1.</w:t>
-            </w:r>
-          </w:p>
-        </w:tc>
-      </w:tr>
-      <w:tr>
-        <w:trPr>
-          <w:cantSplit/>
-        </w:trPr>
-        <w:tc>
-          <w:tcPr>
-            <w:tcW w:type="dxa" w:w="500"/>
-            <w:tcBorders>
-              <w:top w:val="single" w:color="808080" w:sz="4"/>
-              <w:left w:val="single" w:color="808080" w:sz="4"/>
-              <w:bottom w:val="single" w:color="808080" w:sz="4"/>
-              <w:right w:val="single" w:color="808080" w:sz="4"/>
-            </w:tcBorders>
-            <w:tcMar>
-              <w:top w:type="dxa" w:w="40"/>
-              <w:left w:type="dxa" w:w="80"/>
-              <w:bottom w:type="dxa" w:w="40"/>
-              <w:right w:type="dxa" w:w="80"/>
-            </w:tcMar>
-            <w:vAlign w:val="center"/>
-          </w:tcPr>
-          <w:p>
-            <w:pPr>
-              <w:spacing w:after="0" w:before="0"/>
-              <w:jc w:val="left"/>
-            </w:pPr>
-            <w:r>
-              <w:rPr>
-                <w:rFonts w:ascii="Arial" w:cs="Arial" w:eastAsia="Arial" w:hAnsi="Arial"/>
-                <w:b/>
-                <w:bCs/>
-                <w:sz w:val="18"/>
-                <w:szCs w:val="18"/>
-              </w:rPr>
-              <w:t xml:space="preserve">18</w:t>
-            </w:r>
-          </w:p>
-        </w:tc>
-        <w:tc>
-          <w:tcPr>
-            <w:tcW w:type="dxa" w:w="1500"/>
-            <w:tcBorders>
-              <w:top w:val="single" w:color="808080" w:sz="4"/>
-              <w:left w:val="single" w:color="808080" w:sz="4"/>
-              <w:bottom w:val="single" w:color="808080" w:sz="4"/>
-              <w:right w:val="single" w:color="808080" w:sz="4"/>
-            </w:tcBorders>
-            <w:tcMar>
-              <w:top w:type="dxa" w:w="40"/>
-              <w:left w:type="dxa" w:w="80"/>
-              <w:bottom w:type="dxa" w:w="40"/>
-              <w:right w:type="dxa" w:w="80"/>
-            </w:tcMar>
-            <w:vAlign w:val="center"/>
-          </w:tcPr>
-          <w:p>
-            <w:pPr>
-              <w:spacing w:after="0" w:before="0"/>
-              <w:jc w:val="left"/>
-            </w:pPr>
-            <w:r>
-              <w:rPr>
-                <w:rFonts w:ascii="Arial" w:cs="Arial" w:eastAsia="Arial" w:hAnsi="Arial"/>
-                <w:b w:val="false"/>
-                <w:bCs w:val="false"/>
-                <w:sz w:val="18"/>
-                <w:szCs w:val="18"/>
-              </w:rPr>
-              <w:t xml:space="preserve">LO1, LO6, LO7 · Con</w:t>
-            </w:r>
-          </w:p>
-        </w:tc>
-        <w:tc>
-          <w:tcPr>
-            <w:tcW w:type="dxa" w:w="5700"/>
-            <w:tcBorders>
-              <w:top w:val="single" w:color="808080" w:sz="4"/>
-              <w:left w:val="single" w:color="808080" w:sz="4"/>
-              <w:bottom w:val="single" w:color="808080" w:sz="4"/>
-              <w:right w:val="single" w:color="808080" w:sz="4"/>
-            </w:tcBorders>
-            <w:tcMar>
-              <w:top w:type="dxa" w:w="40"/>
-              <w:left w:type="dxa" w:w="80"/>
-              <w:bottom w:type="dxa" w:w="40"/>
-              <w:right w:type="dxa" w:w="80"/>
-            </w:tcMar>
-            <w:vAlign w:val="center"/>
-          </w:tcPr>
-          <w:p>
-            <w:pPr>
-              <w:spacing w:after="0" w:before="0"/>
-              <w:jc w:val="left"/>
-            </w:pPr>
-            <w:r>
-              <w:rPr>
-                <w:rFonts w:ascii="Arial" w:cs="Arial" w:eastAsia="Arial" w:hAnsi="Arial"/>
-                <w:b w:val="false"/>
-                <w:bCs w:val="false"/>
-                <w:sz w:val="18"/>
-                <w:szCs w:val="18"/>
-              </w:rPr>
-              <w:t xml:space="preserve">Two different explanations, e.g. real world: customers switch from pastries to cold items in the heat (substitution); data/other variable: the daily mean temperature may be a poor proxy for the morning hours when pastries sell, or temperature may be standing in for something else that changed over the summer (the 30 June price rise, the mix of customers); adding that variable and watching the temperature coefficient would show it. Plan: add the candidate to LINEST, check t, SE of y and the sign on unseen days; a result that would change the mind (e.g. coefficient near zero, unstable sign or no gain in unseen-day MAE).</w:t>
-            </w:r>
-          </w:p>
-        </w:tc>
-        <w:tc>
-          <w:tcPr>
-            <w:tcW w:type="dxa" w:w="500"/>
-            <w:tcBorders>
-              <w:top w:val="single" w:color="808080" w:sz="4"/>
-              <w:left w:val="single" w:color="808080" w:sz="4"/>
-              <w:bottom w:val="single" w:color="808080" w:sz="4"/>
-              <w:right w:val="single" w:color="808080" w:sz="4"/>
-            </w:tcBorders>
-            <w:tcMar>
-              <w:top w:type="dxa" w:w="40"/>
-              <w:left w:type="dxa" w:w="80"/>
-              <w:bottom w:type="dxa" w:w="40"/>
-              <w:right w:type="dxa" w:w="80"/>
-            </w:tcMar>
-            <w:vAlign w:val="center"/>
-          </w:tcPr>
-          <w:p>
-            <w:pPr>
-              <w:spacing w:after="0" w:before="0"/>
-              <w:jc w:val="center"/>
-            </w:pPr>
-            <w:r>
-              <w:rPr>
-                <w:rFonts w:ascii="Arial" w:cs="Arial" w:eastAsia="Arial" w:hAnsi="Arial"/>
-                <w:b w:val="false"/>
-                <w:bCs w:val="false"/>
-                <w:sz w:val="18"/>
-                <w:szCs w:val="18"/>
-              </w:rPr>
-              <w:t xml:space="preserve">4</w:t>
-            </w:r>
-          </w:p>
-        </w:tc>
-        <w:tc>
-          <w:tcPr>
-            <w:tcW w:type="dxa" w:w="2000"/>
-            <w:tcBorders>
-              <w:top w:val="single" w:color="808080" w:sz="4"/>
-              <w:left w:val="single" w:color="808080" w:sz="4"/>
-              <w:bottom w:val="single" w:color="808080" w:sz="4"/>
-              <w:right w:val="single" w:color="808080" w:sz="4"/>
-            </w:tcBorders>
-            <w:tcMar>
-              <w:top w:type="dxa" w:w="40"/>
-              <w:left w:type="dxa" w:w="80"/>
-              <w:bottom w:type="dxa" w:w="40"/>
-              <w:right w:type="dxa" w:w="80"/>
-            </w:tcMar>
-            <w:vAlign w:val="center"/>
-          </w:tcPr>
-          <w:p>
-            <w:pPr>
-              <w:spacing w:after="0" w:before="0"/>
-              <w:jc w:val="left"/>
-            </w:pPr>
-            <w:r>
-              <w:rPr>
-                <w:rFonts w:ascii="Arial" w:cs="Arial" w:eastAsia="Arial" w:hAnsi="Arial"/>
-                <w:b w:val="false"/>
-                <w:bCs w:val="false"/>
-                <w:sz w:val="18"/>
-                <w:szCs w:val="18"/>
-              </w:rPr>
-              <w:t xml:space="preserve">1 real-world explanation + 1 data/confounding explanation + 1 test plan + 1 falsifier.</w:t>
+              <w:t xml:space="preserve">1 inputs + main LINEST finding in plain words + 1 price test result in plain words + 1 a genuine caution.</w:t>
             </w:r>
           </w:p>
         </w:tc>
@@ -3778,20 +3697,12 @@
           <w:sz w:val="19"/>
           <w:szCs w:val="19"/>
         </w:rPr>
-        <w:t xml:space="preserve">Q15, hold-out days (Table 6).</w:t>
-      </w:r>
-      <w:r>
-        <w:rPr>
-          <w:rFonts w:ascii="Arial" w:cs="Arial" w:eastAsia="Arial" w:hAnsi="Arial"/>
-          <w:sz w:val="19"/>
-          <w:szCs w:val="19"/>
-        </w:rPr>
-        <w:t xml:space="preserve"> Baseline = 0.5 × (1 week ago) + 0.3 × (2 weeks ago) + 0.2 × (3 weeks ago).</w:t>
+        <w:t xml:space="preserve">Section 4 worksheet (Table 6).</w:t>
       </w:r>
     </w:p>
     <w:tbl>
       <w:tblPr>
-        <w:tblW w:type="dxa" w:w="10200"/>
+        <w:tblW w:type="dxa" w:w="10500"/>
         <w:jc w:val="center"/>
         <w:tblBorders>
           <w:top w:val="single" w:color="auto" w:sz="4"/>
@@ -3803,13 +3714,13 @@
         </w:tblBorders>
       </w:tblPr>
       <w:tblGrid>
-        <w:gridCol w:w="1300"/>
-        <w:gridCol w:w="900"/>
-        <w:gridCol w:w="2200"/>
+        <w:gridCol w:w="1100"/>
         <w:gridCol w:w="1500"/>
         <w:gridCol w:w="1500"/>
-        <w:gridCol w:w="1300"/>
+        <w:gridCol w:w="1700"/>
         <w:gridCol w:w="1500"/>
+        <w:gridCol w:w="1500"/>
+        <w:gridCol w:w="1700"/>
       </w:tblGrid>
       <w:tr>
         <w:trPr>
@@ -3817,7 +3728,7 @@
         </w:trPr>
         <w:tc>
           <w:tcPr>
-            <w:tcW w:type="dxa" w:w="1300"/>
+            <w:tcW w:type="dxa" w:w="1100"/>
             <w:tcBorders>
               <w:top w:val="single" w:color="808080" w:sz="4"/>
               <w:left w:val="single" w:color="808080" w:sz="4"/>
@@ -3852,7 +3763,7 @@
         </w:tc>
         <w:tc>
           <w:tcPr>
-            <w:tcW w:type="dxa" w:w="900"/>
+            <w:tcW w:type="dxa" w:w="1500"/>
             <w:tcBorders>
               <w:top w:val="single" w:color="808080" w:sz="4"/>
               <w:left w:val="single" w:color="808080" w:sz="4"/>
@@ -3881,13 +3792,13 @@
                 <w:sz w:val="18"/>
                 <w:szCs w:val="18"/>
               </w:rPr>
-              <w:t xml:space="preserve">Actual</w:t>
-            </w:r>
-          </w:p>
-        </w:tc>
-        <w:tc>
-          <w:tcPr>
-            <w:tcW w:type="dxa" w:w="2200"/>
+              <w:t xml:space="preserve">Before (x₁)</w:t>
+            </w:r>
+          </w:p>
+        </w:tc>
+        <w:tc>
+          <w:tcPr>
+            <w:tcW w:type="dxa" w:w="1500"/>
             <w:tcBorders>
               <w:top w:val="single" w:color="808080" w:sz="4"/>
               <w:left w:val="single" w:color="808080" w:sz="4"/>
@@ -3916,13 +3827,13 @@
                 <w:sz w:val="18"/>
                 <w:szCs w:val="18"/>
               </w:rPr>
-              <w:t xml:space="preserve">Baseline calculation</w:t>
-            </w:r>
-          </w:p>
-        </w:tc>
-        <w:tc>
-          <w:tcPr>
-            <w:tcW w:type="dxa" w:w="1500"/>
+              <w:t xml:space="preserve">x₁ − x̄₁</w:t>
+            </w:r>
+          </w:p>
+        </w:tc>
+        <w:tc>
+          <w:tcPr>
+            <w:tcW w:type="dxa" w:w="1700"/>
             <w:tcBorders>
               <w:top w:val="single" w:color="808080" w:sz="4"/>
               <w:left w:val="single" w:color="808080" w:sz="4"/>
@@ -3951,7 +3862,7 @@
                 <w:sz w:val="18"/>
                 <w:szCs w:val="18"/>
               </w:rPr>
-              <w:t xml:space="preserve">Baseline</w:t>
+              <w:t xml:space="preserve">(x₁ − x̄₁)²</w:t>
             </w:r>
           </w:p>
         </w:tc>
@@ -3986,13 +3897,13 @@
                 <w:sz w:val="18"/>
                 <w:szCs w:val="18"/>
               </w:rPr>
-              <w:t xml:space="preserve">M3</w:t>
-            </w:r>
-          </w:p>
-        </w:tc>
-        <w:tc>
-          <w:tcPr>
-            <w:tcW w:type="dxa" w:w="1300"/>
+              <w:t xml:space="preserve">After (x₂)</w:t>
+            </w:r>
+          </w:p>
+        </w:tc>
+        <w:tc>
+          <w:tcPr>
+            <w:tcW w:type="dxa" w:w="1500"/>
             <w:tcBorders>
               <w:top w:val="single" w:color="808080" w:sz="4"/>
               <w:left w:val="single" w:color="808080" w:sz="4"/>
@@ -4021,13 +3932,13 @@
                 <w:sz w:val="18"/>
                 <w:szCs w:val="18"/>
               </w:rPr>
-              <w:t xml:space="preserve">M5</w:t>
-            </w:r>
-          </w:p>
-        </w:tc>
-        <w:tc>
-          <w:tcPr>
-            <w:tcW w:type="dxa" w:w="1500"/>
+              <w:t xml:space="preserve">x₂ − x̄₂</w:t>
+            </w:r>
+          </w:p>
+        </w:tc>
+        <w:tc>
+          <w:tcPr>
+            <w:tcW w:type="dxa" w:w="1700"/>
             <w:tcBorders>
               <w:top w:val="single" w:color="808080" w:sz="4"/>
               <w:left w:val="single" w:color="808080" w:sz="4"/>
@@ -4056,7 +3967,7 @@
                 <w:sz w:val="18"/>
                 <w:szCs w:val="18"/>
               </w:rPr>
-              <w:t xml:space="preserve">|errors| (base / M3 / M5)</w:t>
+              <w:t xml:space="preserve">(x₂ − x̄₂)²</w:t>
             </w:r>
           </w:p>
         </w:tc>
@@ -4067,41 +3978,7 @@
         </w:trPr>
         <w:tc>
           <w:tcPr>
-            <w:tcW w:type="dxa" w:w="1300"/>
-            <w:tcBorders>
-              <w:top w:val="single" w:color="808080" w:sz="4"/>
-              <w:left w:val="single" w:color="808080" w:sz="4"/>
-              <w:bottom w:val="single" w:color="808080" w:sz="4"/>
-              <w:right w:val="single" w:color="808080" w:sz="4"/>
-            </w:tcBorders>
-            <w:tcMar>
-              <w:top w:type="dxa" w:w="40"/>
-              <w:left w:type="dxa" w:w="80"/>
-              <w:bottom w:type="dxa" w:w="40"/>
-              <w:right w:type="dxa" w:w="80"/>
-            </w:tcMar>
-            <w:vAlign w:val="center"/>
-          </w:tcPr>
-          <w:p>
-            <w:pPr>
-              <w:spacing w:after="0" w:before="0"/>
-              <w:jc w:val="left"/>
-            </w:pPr>
-            <w:r>
-              <w:rPr>
-                <w:rFonts w:ascii="Arial" w:cs="Arial" w:eastAsia="Arial" w:hAnsi="Arial"/>
-                <w:b w:val="false"/>
-                <w:bCs w:val="false"/>
-                <w:sz w:val="18"/>
-                <w:szCs w:val="18"/>
-              </w:rPr>
-              <w:t xml:space="preserve">Aug 2</w:t>
-            </w:r>
-          </w:p>
-        </w:tc>
-        <w:tc>
-          <w:tcPr>
-            <w:tcW w:type="dxa" w:w="900"/>
+            <w:tcW w:type="dxa" w:w="1100"/>
             <w:tcBorders>
               <w:top w:val="single" w:color="808080" w:sz="4"/>
               <w:left w:val="single" w:color="808080" w:sz="4"/>
@@ -4129,41 +4006,7 @@
                 <w:sz w:val="18"/>
                 <w:szCs w:val="18"/>
               </w:rPr>
-              <w:t xml:space="preserve">80</w:t>
-            </w:r>
-          </w:p>
-        </w:tc>
-        <w:tc>
-          <w:tcPr>
-            <w:tcW w:type="dxa" w:w="2200"/>
-            <w:tcBorders>
-              <w:top w:val="single" w:color="808080" w:sz="4"/>
-              <w:left w:val="single" w:color="808080" w:sz="4"/>
-              <w:bottom w:val="single" w:color="808080" w:sz="4"/>
-              <w:right w:val="single" w:color="808080" w:sz="4"/>
-            </w:tcBorders>
-            <w:tcMar>
-              <w:top w:type="dxa" w:w="40"/>
-              <w:left w:type="dxa" w:w="80"/>
-              <w:bottom w:type="dxa" w:w="40"/>
-              <w:right w:type="dxa" w:w="80"/>
-            </w:tcMar>
-            <w:vAlign w:val="center"/>
-          </w:tcPr>
-          <w:p>
-            <w:pPr>
-              <w:spacing w:after="0" w:before="0"/>
-              <w:jc w:val="left"/>
-            </w:pPr>
-            <w:r>
-              <w:rPr>
-                <w:rFonts w:ascii="Arial" w:cs="Arial" w:eastAsia="Arial" w:hAnsi="Arial"/>
-                <w:b w:val="false"/>
-                <w:bCs w:val="false"/>
-                <w:sz w:val="18"/>
-                <w:szCs w:val="18"/>
-              </w:rPr>
-              <w:t xml:space="preserve">0.5×61 + 0.3×83 + 0.2×61</w:t>
+              <w:t xml:space="preserve">1</w:t>
             </w:r>
           </w:p>
         </w:tc>
@@ -4197,7 +4040,7 @@
                 <w:sz w:val="18"/>
                 <w:szCs w:val="18"/>
               </w:rPr>
-              <w:t xml:space="preserve">67.6</w:t>
+              <w:t xml:space="preserve">66</w:t>
             </w:r>
           </w:p>
         </w:tc>
@@ -4231,13 +4074,13 @@
                 <w:sz w:val="18"/>
                 <w:szCs w:val="18"/>
               </w:rPr>
-              <w:t xml:space="preserve">73.6</w:t>
-            </w:r>
-          </w:p>
-        </w:tc>
-        <w:tc>
-          <w:tcPr>
-            <w:tcW w:type="dxa" w:w="1300"/>
+              <w:t xml:space="preserve">0</w:t>
+            </w:r>
+          </w:p>
+        </w:tc>
+        <w:tc>
+          <w:tcPr>
+            <w:tcW w:type="dxa" w:w="1700"/>
             <w:tcBorders>
               <w:top w:val="single" w:color="808080" w:sz="4"/>
               <w:left w:val="single" w:color="808080" w:sz="4"/>
@@ -4265,7 +4108,7 @@
                 <w:sz w:val="18"/>
                 <w:szCs w:val="18"/>
               </w:rPr>
-              <w:t xml:space="preserve">72.0</w:t>
+              <w:t xml:space="preserve">0</w:t>
             </w:r>
           </w:p>
         </w:tc>
@@ -4299,7 +4142,75 @@
                 <w:sz w:val="18"/>
                 <w:szCs w:val="18"/>
               </w:rPr>
-              <w:t xml:space="preserve">12.4 / 6.4 / 8.0</w:t>
+              <w:t xml:space="preserve">63</w:t>
+            </w:r>
+          </w:p>
+        </w:tc>
+        <w:tc>
+          <w:tcPr>
+            <w:tcW w:type="dxa" w:w="1500"/>
+            <w:tcBorders>
+              <w:top w:val="single" w:color="808080" w:sz="4"/>
+              <w:left w:val="single" w:color="808080" w:sz="4"/>
+              <w:bottom w:val="single" w:color="808080" w:sz="4"/>
+              <w:right w:val="single" w:color="808080" w:sz="4"/>
+            </w:tcBorders>
+            <w:tcMar>
+              <w:top w:type="dxa" w:w="40"/>
+              <w:left w:type="dxa" w:w="80"/>
+              <w:bottom w:type="dxa" w:w="40"/>
+              <w:right w:type="dxa" w:w="80"/>
+            </w:tcMar>
+            <w:vAlign w:val="center"/>
+          </w:tcPr>
+          <w:p>
+            <w:pPr>
+              <w:spacing w:after="0" w:before="0"/>
+              <w:jc w:val="center"/>
+            </w:pPr>
+            <w:r>
+              <w:rPr>
+                <w:rFonts w:ascii="Arial" w:cs="Arial" w:eastAsia="Arial" w:hAnsi="Arial"/>
+                <w:b w:val="false"/>
+                <w:bCs w:val="false"/>
+                <w:sz w:val="18"/>
+                <w:szCs w:val="18"/>
+              </w:rPr>
+              <w:t xml:space="preserve">0</w:t>
+            </w:r>
+          </w:p>
+        </w:tc>
+        <w:tc>
+          <w:tcPr>
+            <w:tcW w:type="dxa" w:w="1700"/>
+            <w:tcBorders>
+              <w:top w:val="single" w:color="808080" w:sz="4"/>
+              <w:left w:val="single" w:color="808080" w:sz="4"/>
+              <w:bottom w:val="single" w:color="808080" w:sz="4"/>
+              <w:right w:val="single" w:color="808080" w:sz="4"/>
+            </w:tcBorders>
+            <w:tcMar>
+              <w:top w:type="dxa" w:w="40"/>
+              <w:left w:type="dxa" w:w="80"/>
+              <w:bottom w:type="dxa" w:w="40"/>
+              <w:right w:type="dxa" w:w="80"/>
+            </w:tcMar>
+            <w:vAlign w:val="center"/>
+          </w:tcPr>
+          <w:p>
+            <w:pPr>
+              <w:spacing w:after="0" w:before="0"/>
+              <w:jc w:val="center"/>
+            </w:pPr>
+            <w:r>
+              <w:rPr>
+                <w:rFonts w:ascii="Arial" w:cs="Arial" w:eastAsia="Arial" w:hAnsi="Arial"/>
+                <w:b w:val="false"/>
+                <w:bCs w:val="false"/>
+                <w:sz w:val="18"/>
+                <w:szCs w:val="18"/>
+              </w:rPr>
+              <w:t xml:space="preserve">0</w:t>
             </w:r>
           </w:p>
         </w:tc>
@@ -4310,41 +4221,7 @@
         </w:trPr>
         <w:tc>
           <w:tcPr>
-            <w:tcW w:type="dxa" w:w="1300"/>
-            <w:tcBorders>
-              <w:top w:val="single" w:color="808080" w:sz="4"/>
-              <w:left w:val="single" w:color="808080" w:sz="4"/>
-              <w:bottom w:val="single" w:color="808080" w:sz="4"/>
-              <w:right w:val="single" w:color="808080" w:sz="4"/>
-            </w:tcBorders>
-            <w:tcMar>
-              <w:top w:type="dxa" w:w="40"/>
-              <w:left w:type="dxa" w:w="80"/>
-              <w:bottom w:type="dxa" w:w="40"/>
-              <w:right w:type="dxa" w:w="80"/>
-            </w:tcMar>
-            <w:vAlign w:val="center"/>
-          </w:tcPr>
-          <w:p>
-            <w:pPr>
-              <w:spacing w:after="0" w:before="0"/>
-              <w:jc w:val="left"/>
-            </w:pPr>
-            <w:r>
-              <w:rPr>
-                <w:rFonts w:ascii="Arial" w:cs="Arial" w:eastAsia="Arial" w:hAnsi="Arial"/>
-                <w:b w:val="false"/>
-                <w:bCs w:val="false"/>
-                <w:sz w:val="18"/>
-                <w:szCs w:val="18"/>
-              </w:rPr>
-              <w:t xml:space="preserve">Aug 11</w:t>
-            </w:r>
-          </w:p>
-        </w:tc>
-        <w:tc>
-          <w:tcPr>
-            <w:tcW w:type="dxa" w:w="900"/>
+            <w:tcW w:type="dxa" w:w="1100"/>
             <w:tcBorders>
               <w:top w:val="single" w:color="808080" w:sz="4"/>
               <w:left w:val="single" w:color="808080" w:sz="4"/>
@@ -4372,41 +4249,7 @@
                 <w:sz w:val="18"/>
                 <w:szCs w:val="18"/>
               </w:rPr>
-              <w:t xml:space="preserve">50</w:t>
-            </w:r>
-          </w:p>
-        </w:tc>
-        <w:tc>
-          <w:tcPr>
-            <w:tcW w:type="dxa" w:w="2200"/>
-            <w:tcBorders>
-              <w:top w:val="single" w:color="808080" w:sz="4"/>
-              <w:left w:val="single" w:color="808080" w:sz="4"/>
-              <w:bottom w:val="single" w:color="808080" w:sz="4"/>
-              <w:right w:val="single" w:color="808080" w:sz="4"/>
-            </w:tcBorders>
-            <w:tcMar>
-              <w:top w:type="dxa" w:w="40"/>
-              <w:left w:type="dxa" w:w="80"/>
-              <w:bottom w:type="dxa" w:w="40"/>
-              <w:right w:type="dxa" w:w="80"/>
-            </w:tcMar>
-            <w:vAlign w:val="center"/>
-          </w:tcPr>
-          <w:p>
-            <w:pPr>
-              <w:spacing w:after="0" w:before="0"/>
-              <w:jc w:val="left"/>
-            </w:pPr>
-            <w:r>
-              <w:rPr>
-                <w:rFonts w:ascii="Arial" w:cs="Arial" w:eastAsia="Arial" w:hAnsi="Arial"/>
-                <w:b w:val="false"/>
-                <w:bCs w:val="false"/>
-                <w:sz w:val="18"/>
-                <w:szCs w:val="18"/>
-              </w:rPr>
-              <w:t xml:space="preserve">0.5×77 + 0.3×59 + 0.2×54</w:t>
+              <w:t xml:space="preserve">2</w:t>
             </w:r>
           </w:p>
         </w:tc>
@@ -4440,7 +4283,7 @@
                 <w:sz w:val="18"/>
                 <w:szCs w:val="18"/>
               </w:rPr>
-              <w:t xml:space="preserve">67.0</w:t>
+              <w:t xml:space="preserve">70</w:t>
             </w:r>
           </w:p>
         </w:tc>
@@ -4474,13 +4317,13 @@
                 <w:sz w:val="18"/>
                 <w:szCs w:val="18"/>
               </w:rPr>
-              <w:t xml:space="preserve">59.9</w:t>
-            </w:r>
-          </w:p>
-        </w:tc>
-        <w:tc>
-          <w:tcPr>
-            <w:tcW w:type="dxa" w:w="1300"/>
+              <w:t xml:space="preserve">+4</w:t>
+            </w:r>
+          </w:p>
+        </w:tc>
+        <w:tc>
+          <w:tcPr>
+            <w:tcW w:type="dxa" w:w="1700"/>
             <w:tcBorders>
               <w:top w:val="single" w:color="808080" w:sz="4"/>
               <w:left w:val="single" w:color="808080" w:sz="4"/>
@@ -4508,7 +4351,7 @@
                 <w:sz w:val="18"/>
                 <w:szCs w:val="18"/>
               </w:rPr>
-              <w:t xml:space="preserve">55.3</w:t>
+              <w:t xml:space="preserve">16</w:t>
             </w:r>
           </w:p>
         </w:tc>
@@ -4542,7 +4385,75 @@
                 <w:sz w:val="18"/>
                 <w:szCs w:val="18"/>
               </w:rPr>
-              <w:t xml:space="preserve">17.0 / 9.9 / 5.3</w:t>
+              <w:t xml:space="preserve">67</w:t>
+            </w:r>
+          </w:p>
+        </w:tc>
+        <w:tc>
+          <w:tcPr>
+            <w:tcW w:type="dxa" w:w="1500"/>
+            <w:tcBorders>
+              <w:top w:val="single" w:color="808080" w:sz="4"/>
+              <w:left w:val="single" w:color="808080" w:sz="4"/>
+              <w:bottom w:val="single" w:color="808080" w:sz="4"/>
+              <w:right w:val="single" w:color="808080" w:sz="4"/>
+            </w:tcBorders>
+            <w:tcMar>
+              <w:top w:type="dxa" w:w="40"/>
+              <w:left w:type="dxa" w:w="80"/>
+              <w:bottom w:type="dxa" w:w="40"/>
+              <w:right w:type="dxa" w:w="80"/>
+            </w:tcMar>
+            <w:vAlign w:val="center"/>
+          </w:tcPr>
+          <w:p>
+            <w:pPr>
+              <w:spacing w:after="0" w:before="0"/>
+              <w:jc w:val="center"/>
+            </w:pPr>
+            <w:r>
+              <w:rPr>
+                <w:rFonts w:ascii="Arial" w:cs="Arial" w:eastAsia="Arial" w:hAnsi="Arial"/>
+                <w:b w:val="false"/>
+                <w:bCs w:val="false"/>
+                <w:sz w:val="18"/>
+                <w:szCs w:val="18"/>
+              </w:rPr>
+              <w:t xml:space="preserve">+4</w:t>
+            </w:r>
+          </w:p>
+        </w:tc>
+        <w:tc>
+          <w:tcPr>
+            <w:tcW w:type="dxa" w:w="1700"/>
+            <w:tcBorders>
+              <w:top w:val="single" w:color="808080" w:sz="4"/>
+              <w:left w:val="single" w:color="808080" w:sz="4"/>
+              <w:bottom w:val="single" w:color="808080" w:sz="4"/>
+              <w:right w:val="single" w:color="808080" w:sz="4"/>
+            </w:tcBorders>
+            <w:tcMar>
+              <w:top w:type="dxa" w:w="40"/>
+              <w:left w:type="dxa" w:w="80"/>
+              <w:bottom w:type="dxa" w:w="40"/>
+              <w:right w:type="dxa" w:w="80"/>
+            </w:tcMar>
+            <w:vAlign w:val="center"/>
+          </w:tcPr>
+          <w:p>
+            <w:pPr>
+              <w:spacing w:after="0" w:before="0"/>
+              <w:jc w:val="center"/>
+            </w:pPr>
+            <w:r>
+              <w:rPr>
+                <w:rFonts w:ascii="Arial" w:cs="Arial" w:eastAsia="Arial" w:hAnsi="Arial"/>
+                <w:b w:val="false"/>
+                <w:bCs w:val="false"/>
+                <w:sz w:val="18"/>
+                <w:szCs w:val="18"/>
+              </w:rPr>
+              <w:t xml:space="preserve">16</w:t>
             </w:r>
           </w:p>
         </w:tc>
@@ -4553,41 +4464,7 @@
         </w:trPr>
         <w:tc>
           <w:tcPr>
-            <w:tcW w:type="dxa" w:w="1300"/>
-            <w:tcBorders>
-              <w:top w:val="single" w:color="808080" w:sz="4"/>
-              <w:left w:val="single" w:color="808080" w:sz="4"/>
-              <w:bottom w:val="single" w:color="808080" w:sz="4"/>
-              <w:right w:val="single" w:color="808080" w:sz="4"/>
-            </w:tcBorders>
-            <w:tcMar>
-              <w:top w:type="dxa" w:w="40"/>
-              <w:left w:type="dxa" w:w="80"/>
-              <w:bottom w:type="dxa" w:w="40"/>
-              <w:right w:type="dxa" w:w="80"/>
-            </w:tcMar>
-            <w:vAlign w:val="center"/>
-          </w:tcPr>
-          <w:p>
-            <w:pPr>
-              <w:spacing w:after="0" w:before="0"/>
-              <w:jc w:val="left"/>
-            </w:pPr>
-            <w:r>
-              <w:rPr>
-                <w:rFonts w:ascii="Arial" w:cs="Arial" w:eastAsia="Arial" w:hAnsi="Arial"/>
-                <w:b w:val="false"/>
-                <w:bCs w:val="false"/>
-                <w:sz w:val="18"/>
-                <w:szCs w:val="18"/>
-              </w:rPr>
-              <w:t xml:space="preserve">Aug 19</w:t>
-            </w:r>
-          </w:p>
-        </w:tc>
-        <w:tc>
-          <w:tcPr>
-            <w:tcW w:type="dxa" w:w="900"/>
+            <w:tcW w:type="dxa" w:w="1100"/>
             <w:tcBorders>
               <w:top w:val="single" w:color="808080" w:sz="4"/>
               <w:left w:val="single" w:color="808080" w:sz="4"/>
@@ -4615,41 +4492,7 @@
                 <w:sz w:val="18"/>
                 <w:szCs w:val="18"/>
               </w:rPr>
-              <w:t xml:space="preserve">61</w:t>
-            </w:r>
-          </w:p>
-        </w:tc>
-        <w:tc>
-          <w:tcPr>
-            <w:tcW w:type="dxa" w:w="2200"/>
-            <w:tcBorders>
-              <w:top w:val="single" w:color="808080" w:sz="4"/>
-              <w:left w:val="single" w:color="808080" w:sz="4"/>
-              <w:bottom w:val="single" w:color="808080" w:sz="4"/>
-              <w:right w:val="single" w:color="808080" w:sz="4"/>
-            </w:tcBorders>
-            <w:tcMar>
-              <w:top w:type="dxa" w:w="40"/>
-              <w:left w:type="dxa" w:w="80"/>
-              <w:bottom w:type="dxa" w:w="40"/>
-              <w:right w:type="dxa" w:w="80"/>
-            </w:tcMar>
-            <w:vAlign w:val="center"/>
-          </w:tcPr>
-          <w:p>
-            <w:pPr>
-              <w:spacing w:after="0" w:before="0"/>
-              <w:jc w:val="left"/>
-            </w:pPr>
-            <w:r>
-              <w:rPr>
-                <w:rFonts w:ascii="Arial" w:cs="Arial" w:eastAsia="Arial" w:hAnsi="Arial"/>
-                <w:b w:val="false"/>
-                <w:bCs w:val="false"/>
-                <w:sz w:val="18"/>
-                <w:szCs w:val="18"/>
-              </w:rPr>
-              <w:t xml:space="preserve">0.5×71 + 0.3×57 + 0.2×51</w:t>
+              <w:t xml:space="preserve">3</w:t>
             </w:r>
           </w:p>
         </w:tc>
@@ -4683,7 +4526,7 @@
                 <w:sz w:val="18"/>
                 <w:szCs w:val="18"/>
               </w:rPr>
-              <w:t xml:space="preserve">62.8</w:t>
+              <w:t xml:space="preserve">62</w:t>
             </w:r>
           </w:p>
         </w:tc>
@@ -4717,13 +4560,13 @@
                 <w:sz w:val="18"/>
                 <w:szCs w:val="18"/>
               </w:rPr>
-              <w:t xml:space="preserve">58.3</w:t>
-            </w:r>
-          </w:p>
-        </w:tc>
-        <w:tc>
-          <w:tcPr>
-            <w:tcW w:type="dxa" w:w="1300"/>
+              <w:t xml:space="preserve">−4</w:t>
+            </w:r>
+          </w:p>
+        </w:tc>
+        <w:tc>
+          <w:tcPr>
+            <w:tcW w:type="dxa" w:w="1700"/>
             <w:tcBorders>
               <w:top w:val="single" w:color="808080" w:sz="4"/>
               <w:left w:val="single" w:color="808080" w:sz="4"/>
@@ -4751,7 +4594,7 @@
                 <w:sz w:val="18"/>
                 <w:szCs w:val="18"/>
               </w:rPr>
-              <w:t xml:space="preserve">52.4</w:t>
+              <w:t xml:space="preserve">16</w:t>
             </w:r>
           </w:p>
         </w:tc>
@@ -4785,7 +4628,75 @@
                 <w:sz w:val="18"/>
                 <w:szCs w:val="18"/>
               </w:rPr>
-              <w:t xml:space="preserve">1.8 / 2.7 / 8.6</w:t>
+              <w:t xml:space="preserve">59</w:t>
+            </w:r>
+          </w:p>
+        </w:tc>
+        <w:tc>
+          <w:tcPr>
+            <w:tcW w:type="dxa" w:w="1500"/>
+            <w:tcBorders>
+              <w:top w:val="single" w:color="808080" w:sz="4"/>
+              <w:left w:val="single" w:color="808080" w:sz="4"/>
+              <w:bottom w:val="single" w:color="808080" w:sz="4"/>
+              <w:right w:val="single" w:color="808080" w:sz="4"/>
+            </w:tcBorders>
+            <w:tcMar>
+              <w:top w:type="dxa" w:w="40"/>
+              <w:left w:type="dxa" w:w="80"/>
+              <w:bottom w:type="dxa" w:w="40"/>
+              <w:right w:type="dxa" w:w="80"/>
+            </w:tcMar>
+            <w:vAlign w:val="center"/>
+          </w:tcPr>
+          <w:p>
+            <w:pPr>
+              <w:spacing w:after="0" w:before="0"/>
+              <w:jc w:val="center"/>
+            </w:pPr>
+            <w:r>
+              <w:rPr>
+                <w:rFonts w:ascii="Arial" w:cs="Arial" w:eastAsia="Arial" w:hAnsi="Arial"/>
+                <w:b w:val="false"/>
+                <w:bCs w:val="false"/>
+                <w:sz w:val="18"/>
+                <w:szCs w:val="18"/>
+              </w:rPr>
+              <w:t xml:space="preserve">−4</w:t>
+            </w:r>
+          </w:p>
+        </w:tc>
+        <w:tc>
+          <w:tcPr>
+            <w:tcW w:type="dxa" w:w="1700"/>
+            <w:tcBorders>
+              <w:top w:val="single" w:color="808080" w:sz="4"/>
+              <w:left w:val="single" w:color="808080" w:sz="4"/>
+              <w:bottom w:val="single" w:color="808080" w:sz="4"/>
+              <w:right w:val="single" w:color="808080" w:sz="4"/>
+            </w:tcBorders>
+            <w:tcMar>
+              <w:top w:type="dxa" w:w="40"/>
+              <w:left w:type="dxa" w:w="80"/>
+              <w:bottom w:type="dxa" w:w="40"/>
+              <w:right w:type="dxa" w:w="80"/>
+            </w:tcMar>
+            <w:vAlign w:val="center"/>
+          </w:tcPr>
+          <w:p>
+            <w:pPr>
+              <w:spacing w:after="0" w:before="0"/>
+              <w:jc w:val="center"/>
+            </w:pPr>
+            <w:r>
+              <w:rPr>
+                <w:rFonts w:ascii="Arial" w:cs="Arial" w:eastAsia="Arial" w:hAnsi="Arial"/>
+                <w:b w:val="false"/>
+                <w:bCs w:val="false"/>
+                <w:sz w:val="18"/>
+                <w:szCs w:val="18"/>
+              </w:rPr>
+              <w:t xml:space="preserve">16</w:t>
             </w:r>
           </w:p>
         </w:tc>
@@ -4796,41 +4707,7 @@
         </w:trPr>
         <w:tc>
           <w:tcPr>
-            <w:tcW w:type="dxa" w:w="1300"/>
-            <w:tcBorders>
-              <w:top w:val="single" w:color="808080" w:sz="4"/>
-              <w:left w:val="single" w:color="808080" w:sz="4"/>
-              <w:bottom w:val="single" w:color="808080" w:sz="4"/>
-              <w:right w:val="single" w:color="808080" w:sz="4"/>
-            </w:tcBorders>
-            <w:tcMar>
-              <w:top w:type="dxa" w:w="40"/>
-              <w:left w:type="dxa" w:w="80"/>
-              <w:bottom w:type="dxa" w:w="40"/>
-              <w:right w:type="dxa" w:w="80"/>
-            </w:tcMar>
-            <w:vAlign w:val="center"/>
-          </w:tcPr>
-          <w:p>
-            <w:pPr>
-              <w:spacing w:after="0" w:before="0"/>
-              <w:jc w:val="left"/>
-            </w:pPr>
-            <w:r>
-              <w:rPr>
-                <w:rFonts w:ascii="Arial" w:cs="Arial" w:eastAsia="Arial" w:hAnsi="Arial"/>
-                <w:b w:val="false"/>
-                <w:bCs w:val="false"/>
-                <w:sz w:val="18"/>
-                <w:szCs w:val="18"/>
-              </w:rPr>
-              <w:t xml:space="preserve">Sep 4</w:t>
-            </w:r>
-          </w:p>
-        </w:tc>
-        <w:tc>
-          <w:tcPr>
-            <w:tcW w:type="dxa" w:w="900"/>
+            <w:tcW w:type="dxa" w:w="1100"/>
             <w:tcBorders>
               <w:top w:val="single" w:color="808080" w:sz="4"/>
               <w:left w:val="single" w:color="808080" w:sz="4"/>
@@ -4858,41 +4735,7 @@
                 <w:sz w:val="18"/>
                 <w:szCs w:val="18"/>
               </w:rPr>
-              <w:t xml:space="preserve">59</w:t>
-            </w:r>
-          </w:p>
-        </w:tc>
-        <w:tc>
-          <w:tcPr>
-            <w:tcW w:type="dxa" w:w="2200"/>
-            <w:tcBorders>
-              <w:top w:val="single" w:color="808080" w:sz="4"/>
-              <w:left w:val="single" w:color="808080" w:sz="4"/>
-              <w:bottom w:val="single" w:color="808080" w:sz="4"/>
-              <w:right w:val="single" w:color="808080" w:sz="4"/>
-            </w:tcBorders>
-            <w:tcMar>
-              <w:top w:type="dxa" w:w="40"/>
-              <w:left w:type="dxa" w:w="80"/>
-              <w:bottom w:type="dxa" w:w="40"/>
-              <w:right w:type="dxa" w:w="80"/>
-            </w:tcMar>
-            <w:vAlign w:val="center"/>
-          </w:tcPr>
-          <w:p>
-            <w:pPr>
-              <w:spacing w:after="0" w:before="0"/>
-              <w:jc w:val="left"/>
-            </w:pPr>
-            <w:r>
-              <w:rPr>
-                <w:rFonts w:ascii="Arial" w:cs="Arial" w:eastAsia="Arial" w:hAnsi="Arial"/>
-                <w:b w:val="false"/>
-                <w:bCs w:val="false"/>
-                <w:sz w:val="18"/>
-                <w:szCs w:val="18"/>
-              </w:rPr>
-              <w:t xml:space="preserve">0.5×70 + 0.3×62 + 0.2×74</w:t>
+              <w:t xml:space="preserve">4</w:t>
             </w:r>
           </w:p>
         </w:tc>
@@ -4926,7 +4769,7 @@
                 <w:sz w:val="18"/>
                 <w:szCs w:val="18"/>
               </w:rPr>
-              <w:t xml:space="preserve">68.4</w:t>
+              <w:t xml:space="preserve">68</w:t>
             </w:r>
           </w:p>
         </w:tc>
@@ -4960,13 +4803,13 @@
                 <w:sz w:val="18"/>
                 <w:szCs w:val="18"/>
               </w:rPr>
-              <w:t xml:space="preserve">60.3</w:t>
-            </w:r>
-          </w:p>
-        </w:tc>
-        <w:tc>
-          <w:tcPr>
-            <w:tcW w:type="dxa" w:w="1300"/>
+              <w:t xml:space="preserve">+2</w:t>
+            </w:r>
+          </w:p>
+        </w:tc>
+        <w:tc>
+          <w:tcPr>
+            <w:tcW w:type="dxa" w:w="1700"/>
             <w:tcBorders>
               <w:top w:val="single" w:color="808080" w:sz="4"/>
               <w:left w:val="single" w:color="808080" w:sz="4"/>
@@ -4994,7 +4837,7 @@
                 <w:sz w:val="18"/>
                 <w:szCs w:val="18"/>
               </w:rPr>
-              <w:t xml:space="preserve">59.1</w:t>
+              <w:t xml:space="preserve">4</w:t>
             </w:r>
           </w:p>
         </w:tc>
@@ -5028,7 +4871,75 @@
                 <w:sz w:val="18"/>
                 <w:szCs w:val="18"/>
               </w:rPr>
-              <w:t xml:space="preserve">9.4 / 1.3 / 0.1</w:t>
+              <w:t xml:space="preserve">65</w:t>
+            </w:r>
+          </w:p>
+        </w:tc>
+        <w:tc>
+          <w:tcPr>
+            <w:tcW w:type="dxa" w:w="1500"/>
+            <w:tcBorders>
+              <w:top w:val="single" w:color="808080" w:sz="4"/>
+              <w:left w:val="single" w:color="808080" w:sz="4"/>
+              <w:bottom w:val="single" w:color="808080" w:sz="4"/>
+              <w:right w:val="single" w:color="808080" w:sz="4"/>
+            </w:tcBorders>
+            <w:tcMar>
+              <w:top w:type="dxa" w:w="40"/>
+              <w:left w:type="dxa" w:w="80"/>
+              <w:bottom w:type="dxa" w:w="40"/>
+              <w:right w:type="dxa" w:w="80"/>
+            </w:tcMar>
+            <w:vAlign w:val="center"/>
+          </w:tcPr>
+          <w:p>
+            <w:pPr>
+              <w:spacing w:after="0" w:before="0"/>
+              <w:jc w:val="center"/>
+            </w:pPr>
+            <w:r>
+              <w:rPr>
+                <w:rFonts w:ascii="Arial" w:cs="Arial" w:eastAsia="Arial" w:hAnsi="Arial"/>
+                <w:b w:val="false"/>
+                <w:bCs w:val="false"/>
+                <w:sz w:val="18"/>
+                <w:szCs w:val="18"/>
+              </w:rPr>
+              <w:t xml:space="preserve">+2</w:t>
+            </w:r>
+          </w:p>
+        </w:tc>
+        <w:tc>
+          <w:tcPr>
+            <w:tcW w:type="dxa" w:w="1700"/>
+            <w:tcBorders>
+              <w:top w:val="single" w:color="808080" w:sz="4"/>
+              <w:left w:val="single" w:color="808080" w:sz="4"/>
+              <w:bottom w:val="single" w:color="808080" w:sz="4"/>
+              <w:right w:val="single" w:color="808080" w:sz="4"/>
+            </w:tcBorders>
+            <w:tcMar>
+              <w:top w:type="dxa" w:w="40"/>
+              <w:left w:type="dxa" w:w="80"/>
+              <w:bottom w:type="dxa" w:w="40"/>
+              <w:right w:type="dxa" w:w="80"/>
+            </w:tcMar>
+            <w:vAlign w:val="center"/>
+          </w:tcPr>
+          <w:p>
+            <w:pPr>
+              <w:spacing w:after="0" w:before="0"/>
+              <w:jc w:val="center"/>
+            </w:pPr>
+            <w:r>
+              <w:rPr>
+                <w:rFonts w:ascii="Arial" w:cs="Arial" w:eastAsia="Arial" w:hAnsi="Arial"/>
+                <w:b w:val="false"/>
+                <w:bCs w:val="false"/>
+                <w:sz w:val="18"/>
+                <w:szCs w:val="18"/>
+              </w:rPr>
+              <w:t xml:space="preserve">4</w:t>
             </w:r>
           </w:p>
         </w:tc>
@@ -5039,7 +4950,250 @@
         </w:trPr>
         <w:tc>
           <w:tcPr>
-            <w:tcW w:type="dxa" w:w="1300"/>
+            <w:tcW w:type="dxa" w:w="1100"/>
+            <w:tcBorders>
+              <w:top w:val="single" w:color="808080" w:sz="4"/>
+              <w:left w:val="single" w:color="808080" w:sz="4"/>
+              <w:bottom w:val="single" w:color="808080" w:sz="4"/>
+              <w:right w:val="single" w:color="808080" w:sz="4"/>
+            </w:tcBorders>
+            <w:tcMar>
+              <w:top w:type="dxa" w:w="40"/>
+              <w:left w:type="dxa" w:w="80"/>
+              <w:bottom w:type="dxa" w:w="40"/>
+              <w:right w:type="dxa" w:w="80"/>
+            </w:tcMar>
+            <w:vAlign w:val="center"/>
+          </w:tcPr>
+          <w:p>
+            <w:pPr>
+              <w:spacing w:after="0" w:before="0"/>
+              <w:jc w:val="center"/>
+            </w:pPr>
+            <w:r>
+              <w:rPr>
+                <w:rFonts w:ascii="Arial" w:cs="Arial" w:eastAsia="Arial" w:hAnsi="Arial"/>
+                <w:b w:val="false"/>
+                <w:bCs w:val="false"/>
+                <w:sz w:val="18"/>
+                <w:szCs w:val="18"/>
+              </w:rPr>
+              <w:t xml:space="preserve">5</w:t>
+            </w:r>
+          </w:p>
+        </w:tc>
+        <w:tc>
+          <w:tcPr>
+            <w:tcW w:type="dxa" w:w="1500"/>
+            <w:tcBorders>
+              <w:top w:val="single" w:color="808080" w:sz="4"/>
+              <w:left w:val="single" w:color="808080" w:sz="4"/>
+              <w:bottom w:val="single" w:color="808080" w:sz="4"/>
+              <w:right w:val="single" w:color="808080" w:sz="4"/>
+            </w:tcBorders>
+            <w:tcMar>
+              <w:top w:type="dxa" w:w="40"/>
+              <w:left w:type="dxa" w:w="80"/>
+              <w:bottom w:type="dxa" w:w="40"/>
+              <w:right w:type="dxa" w:w="80"/>
+            </w:tcMar>
+            <w:vAlign w:val="center"/>
+          </w:tcPr>
+          <w:p>
+            <w:pPr>
+              <w:spacing w:after="0" w:before="0"/>
+              <w:jc w:val="center"/>
+            </w:pPr>
+            <w:r>
+              <w:rPr>
+                <w:rFonts w:ascii="Arial" w:cs="Arial" w:eastAsia="Arial" w:hAnsi="Arial"/>
+                <w:b w:val="false"/>
+                <w:bCs w:val="false"/>
+                <w:sz w:val="18"/>
+                <w:szCs w:val="18"/>
+              </w:rPr>
+              <w:t xml:space="preserve">64</w:t>
+            </w:r>
+          </w:p>
+        </w:tc>
+        <w:tc>
+          <w:tcPr>
+            <w:tcW w:type="dxa" w:w="1500"/>
+            <w:tcBorders>
+              <w:top w:val="single" w:color="808080" w:sz="4"/>
+              <w:left w:val="single" w:color="808080" w:sz="4"/>
+              <w:bottom w:val="single" w:color="808080" w:sz="4"/>
+              <w:right w:val="single" w:color="808080" w:sz="4"/>
+            </w:tcBorders>
+            <w:tcMar>
+              <w:top w:type="dxa" w:w="40"/>
+              <w:left w:type="dxa" w:w="80"/>
+              <w:bottom w:type="dxa" w:w="40"/>
+              <w:right w:type="dxa" w:w="80"/>
+            </w:tcMar>
+            <w:vAlign w:val="center"/>
+          </w:tcPr>
+          <w:p>
+            <w:pPr>
+              <w:spacing w:after="0" w:before="0"/>
+              <w:jc w:val="center"/>
+            </w:pPr>
+            <w:r>
+              <w:rPr>
+                <w:rFonts w:ascii="Arial" w:cs="Arial" w:eastAsia="Arial" w:hAnsi="Arial"/>
+                <w:b w:val="false"/>
+                <w:bCs w:val="false"/>
+                <w:sz w:val="18"/>
+                <w:szCs w:val="18"/>
+              </w:rPr>
+              <w:t xml:space="preserve">−2</w:t>
+            </w:r>
+          </w:p>
+        </w:tc>
+        <w:tc>
+          <w:tcPr>
+            <w:tcW w:type="dxa" w:w="1700"/>
+            <w:tcBorders>
+              <w:top w:val="single" w:color="808080" w:sz="4"/>
+              <w:left w:val="single" w:color="808080" w:sz="4"/>
+              <w:bottom w:val="single" w:color="808080" w:sz="4"/>
+              <w:right w:val="single" w:color="808080" w:sz="4"/>
+            </w:tcBorders>
+            <w:tcMar>
+              <w:top w:type="dxa" w:w="40"/>
+              <w:left w:type="dxa" w:w="80"/>
+              <w:bottom w:type="dxa" w:w="40"/>
+              <w:right w:type="dxa" w:w="80"/>
+            </w:tcMar>
+            <w:vAlign w:val="center"/>
+          </w:tcPr>
+          <w:p>
+            <w:pPr>
+              <w:spacing w:after="0" w:before="0"/>
+              <w:jc w:val="center"/>
+            </w:pPr>
+            <w:r>
+              <w:rPr>
+                <w:rFonts w:ascii="Arial" w:cs="Arial" w:eastAsia="Arial" w:hAnsi="Arial"/>
+                <w:b w:val="false"/>
+                <w:bCs w:val="false"/>
+                <w:sz w:val="18"/>
+                <w:szCs w:val="18"/>
+              </w:rPr>
+              <w:t xml:space="preserve">4</w:t>
+            </w:r>
+          </w:p>
+        </w:tc>
+        <w:tc>
+          <w:tcPr>
+            <w:tcW w:type="dxa" w:w="1500"/>
+            <w:tcBorders>
+              <w:top w:val="single" w:color="808080" w:sz="4"/>
+              <w:left w:val="single" w:color="808080" w:sz="4"/>
+              <w:bottom w:val="single" w:color="808080" w:sz="4"/>
+              <w:right w:val="single" w:color="808080" w:sz="4"/>
+            </w:tcBorders>
+            <w:tcMar>
+              <w:top w:type="dxa" w:w="40"/>
+              <w:left w:type="dxa" w:w="80"/>
+              <w:bottom w:type="dxa" w:w="40"/>
+              <w:right w:type="dxa" w:w="80"/>
+            </w:tcMar>
+            <w:vAlign w:val="center"/>
+          </w:tcPr>
+          <w:p>
+            <w:pPr>
+              <w:spacing w:after="0" w:before="0"/>
+              <w:jc w:val="center"/>
+            </w:pPr>
+            <w:r>
+              <w:rPr>
+                <w:rFonts w:ascii="Arial" w:cs="Arial" w:eastAsia="Arial" w:hAnsi="Arial"/>
+                <w:b w:val="false"/>
+                <w:bCs w:val="false"/>
+                <w:sz w:val="18"/>
+                <w:szCs w:val="18"/>
+              </w:rPr>
+              <w:t xml:space="preserve">61</w:t>
+            </w:r>
+          </w:p>
+        </w:tc>
+        <w:tc>
+          <w:tcPr>
+            <w:tcW w:type="dxa" w:w="1500"/>
+            <w:tcBorders>
+              <w:top w:val="single" w:color="808080" w:sz="4"/>
+              <w:left w:val="single" w:color="808080" w:sz="4"/>
+              <w:bottom w:val="single" w:color="808080" w:sz="4"/>
+              <w:right w:val="single" w:color="808080" w:sz="4"/>
+            </w:tcBorders>
+            <w:tcMar>
+              <w:top w:type="dxa" w:w="40"/>
+              <w:left w:type="dxa" w:w="80"/>
+              <w:bottom w:type="dxa" w:w="40"/>
+              <w:right w:type="dxa" w:w="80"/>
+            </w:tcMar>
+            <w:vAlign w:val="center"/>
+          </w:tcPr>
+          <w:p>
+            <w:pPr>
+              <w:spacing w:after="0" w:before="0"/>
+              <w:jc w:val="center"/>
+            </w:pPr>
+            <w:r>
+              <w:rPr>
+                <w:rFonts w:ascii="Arial" w:cs="Arial" w:eastAsia="Arial" w:hAnsi="Arial"/>
+                <w:b w:val="false"/>
+                <w:bCs w:val="false"/>
+                <w:sz w:val="18"/>
+                <w:szCs w:val="18"/>
+              </w:rPr>
+              <w:t xml:space="preserve">−2</w:t>
+            </w:r>
+          </w:p>
+        </w:tc>
+        <w:tc>
+          <w:tcPr>
+            <w:tcW w:type="dxa" w:w="1700"/>
+            <w:tcBorders>
+              <w:top w:val="single" w:color="808080" w:sz="4"/>
+              <w:left w:val="single" w:color="808080" w:sz="4"/>
+              <w:bottom w:val="single" w:color="808080" w:sz="4"/>
+              <w:right w:val="single" w:color="808080" w:sz="4"/>
+            </w:tcBorders>
+            <w:tcMar>
+              <w:top w:type="dxa" w:w="40"/>
+              <w:left w:type="dxa" w:w="80"/>
+              <w:bottom w:type="dxa" w:w="40"/>
+              <w:right w:type="dxa" w:w="80"/>
+            </w:tcMar>
+            <w:vAlign w:val="center"/>
+          </w:tcPr>
+          <w:p>
+            <w:pPr>
+              <w:spacing w:after="0" w:before="0"/>
+              <w:jc w:val="center"/>
+            </w:pPr>
+            <w:r>
+              <w:rPr>
+                <w:rFonts w:ascii="Arial" w:cs="Arial" w:eastAsia="Arial" w:hAnsi="Arial"/>
+                <w:b w:val="false"/>
+                <w:bCs w:val="false"/>
+                <w:sz w:val="18"/>
+                <w:szCs w:val="18"/>
+              </w:rPr>
+              <w:t xml:space="preserve">4</w:t>
+            </w:r>
+          </w:p>
+        </w:tc>
+      </w:tr>
+      <w:tr>
+        <w:trPr>
+          <w:cantSplit/>
+        </w:trPr>
+        <w:tc>
+          <w:tcPr>
+            <w:tcW w:type="dxa" w:w="1100"/>
             <w:tcBorders>
               <w:top w:val="single" w:color="808080" w:sz="4"/>
               <w:left w:val="single" w:color="808080" w:sz="4"/>
@@ -5067,56 +5221,8 @@
                 <w:sz w:val="18"/>
                 <w:szCs w:val="18"/>
               </w:rPr>
-              <w:t xml:space="preserve">MAE</w:t>
-            </w:r>
-          </w:p>
-        </w:tc>
-        <w:tc>
-          <w:tcPr>
-            <w:tcW w:type="dxa" w:w="900"/>
-            <w:tcBorders>
-              <w:top w:val="single" w:color="808080" w:sz="4"/>
-              <w:left w:val="single" w:color="808080" w:sz="4"/>
-              <w:bottom w:val="single" w:color="808080" w:sz="4"/>
-              <w:right w:val="single" w:color="808080" w:sz="4"/>
-            </w:tcBorders>
-            <w:tcMar>
-              <w:top w:type="dxa" w:w="40"/>
-              <w:left w:type="dxa" w:w="80"/>
-              <w:bottom w:type="dxa" w:w="40"/>
-              <w:right w:type="dxa" w:w="80"/>
-            </w:tcMar>
-            <w:vAlign w:val="center"/>
-          </w:tcPr>
-          <w:p>
-            <w:pPr>
-              <w:spacing w:after="0" w:before="0"/>
-              <w:jc w:val="left"/>
-            </w:pPr>
-          </w:p>
-        </w:tc>
-        <w:tc>
-          <w:tcPr>
-            <w:tcW w:type="dxa" w:w="2200"/>
-            <w:tcBorders>
-              <w:top w:val="single" w:color="808080" w:sz="4"/>
-              <w:left w:val="single" w:color="808080" w:sz="4"/>
-              <w:bottom w:val="single" w:color="808080" w:sz="4"/>
-              <w:right w:val="single" w:color="808080" w:sz="4"/>
-            </w:tcBorders>
-            <w:tcMar>
-              <w:top w:type="dxa" w:w="40"/>
-              <w:left w:type="dxa" w:w="80"/>
-              <w:bottom w:type="dxa" w:w="40"/>
-              <w:right w:type="dxa" w:w="80"/>
-            </w:tcMar>
-            <w:vAlign w:val="center"/>
-          </w:tcPr>
-          <w:p>
-            <w:pPr>
-              <w:spacing w:after="0" w:before="0"/>
-              <w:jc w:val="left"/>
-            </w:pPr>
+              <w:t xml:space="preserve">Sum</w:t>
+            </w:r>
           </w:p>
         </w:tc>
         <w:tc>
@@ -5139,8 +5245,18 @@
           <w:p>
             <w:pPr>
               <w:spacing w:after="0" w:before="0"/>
-              <w:jc w:val="left"/>
-            </w:pPr>
+              <w:jc w:val="center"/>
+            </w:pPr>
+            <w:r>
+              <w:rPr>
+                <w:rFonts w:ascii="Arial" w:cs="Arial" w:eastAsia="Arial" w:hAnsi="Arial"/>
+                <w:b w:val="false"/>
+                <w:bCs w:val="false"/>
+                <w:sz w:val="18"/>
+                <w:szCs w:val="18"/>
+              </w:rPr>
+              <w:t xml:space="preserve">330</w:t>
+            </w:r>
           </w:p>
         </w:tc>
         <w:tc>
@@ -5163,37 +5279,23 @@
           <w:p>
             <w:pPr>
               <w:spacing w:after="0" w:before="0"/>
-              <w:jc w:val="left"/>
-            </w:pPr>
-          </w:p>
-        </w:tc>
-        <w:tc>
-          <w:tcPr>
-            <w:tcW w:type="dxa" w:w="1300"/>
-            <w:tcBorders>
-              <w:top w:val="single" w:color="808080" w:sz="4"/>
-              <w:left w:val="single" w:color="808080" w:sz="4"/>
-              <w:bottom w:val="single" w:color="808080" w:sz="4"/>
-              <w:right w:val="single" w:color="808080" w:sz="4"/>
-            </w:tcBorders>
-            <w:tcMar>
-              <w:top w:type="dxa" w:w="40"/>
-              <w:left w:type="dxa" w:w="80"/>
-              <w:bottom w:type="dxa" w:w="40"/>
-              <w:right w:type="dxa" w:w="80"/>
-            </w:tcMar>
-            <w:vAlign w:val="center"/>
-          </w:tcPr>
-          <w:p>
-            <w:pPr>
-              <w:spacing w:after="0" w:before="0"/>
-              <w:jc w:val="left"/>
-            </w:pPr>
-          </w:p>
-        </w:tc>
-        <w:tc>
-          <w:tcPr>
-            <w:tcW w:type="dxa" w:w="1500"/>
+              <w:jc w:val="center"/>
+            </w:pPr>
+            <w:r>
+              <w:rPr>
+                <w:rFonts w:ascii="Arial" w:cs="Arial" w:eastAsia="Arial" w:hAnsi="Arial"/>
+                <w:b w:val="false"/>
+                <w:bCs w:val="false"/>
+                <w:sz w:val="18"/>
+                <w:szCs w:val="18"/>
+              </w:rPr>
+              <w:t xml:space="preserve">0</w:t>
+            </w:r>
+          </w:p>
+        </w:tc>
+        <w:tc>
+          <w:tcPr>
+            <w:tcW w:type="dxa" w:w="1700"/>
             <w:tcBorders>
               <w:top w:val="single" w:color="808080" w:sz="4"/>
               <w:left w:val="single" w:color="808080" w:sz="4"/>
@@ -5221,8 +5323,516 @@
                 <w:sz w:val="18"/>
                 <w:szCs w:val="18"/>
               </w:rPr>
-              <w:t xml:space="preserve">10.1 / 5.1 / 5.5</w:t>
-            </w:r>
+              <w:t xml:space="preserve">40</w:t>
+            </w:r>
+          </w:p>
+        </w:tc>
+        <w:tc>
+          <w:tcPr>
+            <w:tcW w:type="dxa" w:w="1500"/>
+            <w:tcBorders>
+              <w:top w:val="single" w:color="808080" w:sz="4"/>
+              <w:left w:val="single" w:color="808080" w:sz="4"/>
+              <w:bottom w:val="single" w:color="808080" w:sz="4"/>
+              <w:right w:val="single" w:color="808080" w:sz="4"/>
+            </w:tcBorders>
+            <w:tcMar>
+              <w:top w:type="dxa" w:w="40"/>
+              <w:left w:type="dxa" w:w="80"/>
+              <w:bottom w:type="dxa" w:w="40"/>
+              <w:right w:type="dxa" w:w="80"/>
+            </w:tcMar>
+            <w:vAlign w:val="center"/>
+          </w:tcPr>
+          <w:p>
+            <w:pPr>
+              <w:spacing w:after="0" w:before="0"/>
+              <w:jc w:val="center"/>
+            </w:pPr>
+            <w:r>
+              <w:rPr>
+                <w:rFonts w:ascii="Arial" w:cs="Arial" w:eastAsia="Arial" w:hAnsi="Arial"/>
+                <w:b w:val="false"/>
+                <w:bCs w:val="false"/>
+                <w:sz w:val="18"/>
+                <w:szCs w:val="18"/>
+              </w:rPr>
+              <w:t xml:space="preserve">315</w:t>
+            </w:r>
+          </w:p>
+        </w:tc>
+        <w:tc>
+          <w:tcPr>
+            <w:tcW w:type="dxa" w:w="1500"/>
+            <w:tcBorders>
+              <w:top w:val="single" w:color="808080" w:sz="4"/>
+              <w:left w:val="single" w:color="808080" w:sz="4"/>
+              <w:bottom w:val="single" w:color="808080" w:sz="4"/>
+              <w:right w:val="single" w:color="808080" w:sz="4"/>
+            </w:tcBorders>
+            <w:tcMar>
+              <w:top w:type="dxa" w:w="40"/>
+              <w:left w:type="dxa" w:w="80"/>
+              <w:bottom w:type="dxa" w:w="40"/>
+              <w:right w:type="dxa" w:w="80"/>
+            </w:tcMar>
+            <w:vAlign w:val="center"/>
+          </w:tcPr>
+          <w:p>
+            <w:pPr>
+              <w:spacing w:after="0" w:before="0"/>
+              <w:jc w:val="center"/>
+            </w:pPr>
+            <w:r>
+              <w:rPr>
+                <w:rFonts w:ascii="Arial" w:cs="Arial" w:eastAsia="Arial" w:hAnsi="Arial"/>
+                <w:b w:val="false"/>
+                <w:bCs w:val="false"/>
+                <w:sz w:val="18"/>
+                <w:szCs w:val="18"/>
+              </w:rPr>
+              <w:t xml:space="preserve">0</w:t>
+            </w:r>
+          </w:p>
+        </w:tc>
+        <w:tc>
+          <w:tcPr>
+            <w:tcW w:type="dxa" w:w="1700"/>
+            <w:tcBorders>
+              <w:top w:val="single" w:color="808080" w:sz="4"/>
+              <w:left w:val="single" w:color="808080" w:sz="4"/>
+              <w:bottom w:val="single" w:color="808080" w:sz="4"/>
+              <w:right w:val="single" w:color="808080" w:sz="4"/>
+            </w:tcBorders>
+            <w:tcMar>
+              <w:top w:type="dxa" w:w="40"/>
+              <w:left w:type="dxa" w:w="80"/>
+              <w:bottom w:type="dxa" w:w="40"/>
+              <w:right w:type="dxa" w:w="80"/>
+            </w:tcMar>
+            <w:vAlign w:val="center"/>
+          </w:tcPr>
+          <w:p>
+            <w:pPr>
+              <w:spacing w:after="0" w:before="0"/>
+              <w:jc w:val="center"/>
+            </w:pPr>
+            <w:r>
+              <w:rPr>
+                <w:rFonts w:ascii="Arial" w:cs="Arial" w:eastAsia="Arial" w:hAnsi="Arial"/>
+                <w:b/>
+                <w:bCs/>
+                <w:sz w:val="18"/>
+                <w:szCs w:val="18"/>
+              </w:rPr>
+              <w:t xml:space="preserve">40</w:t>
+            </w:r>
+          </w:p>
+        </w:tc>
+      </w:tr>
+      <w:tr>
+        <w:trPr>
+          <w:cantSplit/>
+        </w:trPr>
+        <w:tc>
+          <w:tcPr>
+            <w:tcW w:type="dxa" w:w="1100"/>
+            <w:tcBorders>
+              <w:top w:val="single" w:color="808080" w:sz="4"/>
+              <w:left w:val="single" w:color="808080" w:sz="4"/>
+              <w:bottom w:val="single" w:color="808080" w:sz="4"/>
+              <w:right w:val="single" w:color="808080" w:sz="4"/>
+            </w:tcBorders>
+            <w:tcMar>
+              <w:top w:type="dxa" w:w="40"/>
+              <w:left w:type="dxa" w:w="80"/>
+              <w:bottom w:type="dxa" w:w="40"/>
+              <w:right w:type="dxa" w:w="80"/>
+            </w:tcMar>
+            <w:vAlign w:val="center"/>
+          </w:tcPr>
+          <w:p>
+            <w:pPr>
+              <w:spacing w:after="0" w:before="0"/>
+              <w:jc w:val="left"/>
+            </w:pPr>
+            <w:r>
+              <w:rPr>
+                <w:rFonts w:ascii="Arial" w:cs="Arial" w:eastAsia="Arial" w:hAnsi="Arial"/>
+                <w:b/>
+                <w:bCs/>
+                <w:sz w:val="18"/>
+                <w:szCs w:val="18"/>
+              </w:rPr>
+              <w:t xml:space="preserve">Mean x̄</w:t>
+            </w:r>
+          </w:p>
+        </w:tc>
+        <w:tc>
+          <w:tcPr>
+            <w:tcW w:type="dxa" w:w="1500"/>
+            <w:tcBorders>
+              <w:top w:val="single" w:color="808080" w:sz="4"/>
+              <w:left w:val="single" w:color="808080" w:sz="4"/>
+              <w:bottom w:val="single" w:color="808080" w:sz="4"/>
+              <w:right w:val="single" w:color="808080" w:sz="4"/>
+            </w:tcBorders>
+            <w:tcMar>
+              <w:top w:type="dxa" w:w="40"/>
+              <w:left w:type="dxa" w:w="80"/>
+              <w:bottom w:type="dxa" w:w="40"/>
+              <w:right w:type="dxa" w:w="80"/>
+            </w:tcMar>
+            <w:vAlign w:val="center"/>
+          </w:tcPr>
+          <w:p>
+            <w:pPr>
+              <w:spacing w:after="0" w:before="0"/>
+              <w:jc w:val="center"/>
+            </w:pPr>
+            <w:r>
+              <w:rPr>
+                <w:rFonts w:ascii="Arial" w:cs="Arial" w:eastAsia="Arial" w:hAnsi="Arial"/>
+                <w:b/>
+                <w:bCs/>
+                <w:sz w:val="18"/>
+                <w:szCs w:val="18"/>
+              </w:rPr>
+              <w:t xml:space="preserve">66</w:t>
+            </w:r>
+          </w:p>
+        </w:tc>
+        <w:tc>
+          <w:tcPr>
+            <w:tcW w:type="dxa" w:w="1500"/>
+            <w:tcBorders>
+              <w:top w:val="single" w:color="808080" w:sz="4"/>
+              <w:left w:val="single" w:color="808080" w:sz="4"/>
+              <w:bottom w:val="single" w:color="808080" w:sz="4"/>
+              <w:right w:val="single" w:color="808080" w:sz="4"/>
+            </w:tcBorders>
+            <w:tcMar>
+              <w:top w:type="dxa" w:w="40"/>
+              <w:left w:type="dxa" w:w="80"/>
+              <w:bottom w:type="dxa" w:w="40"/>
+              <w:right w:type="dxa" w:w="80"/>
+            </w:tcMar>
+            <w:vAlign w:val="center"/>
+          </w:tcPr>
+          <w:p>
+            <w:pPr>
+              <w:spacing w:after="0" w:before="0"/>
+              <w:jc w:val="left"/>
+            </w:pPr>
+          </w:p>
+        </w:tc>
+        <w:tc>
+          <w:tcPr>
+            <w:tcW w:type="dxa" w:w="1700"/>
+            <w:tcBorders>
+              <w:top w:val="single" w:color="808080" w:sz="4"/>
+              <w:left w:val="single" w:color="808080" w:sz="4"/>
+              <w:bottom w:val="single" w:color="808080" w:sz="4"/>
+              <w:right w:val="single" w:color="808080" w:sz="4"/>
+            </w:tcBorders>
+            <w:tcMar>
+              <w:top w:type="dxa" w:w="40"/>
+              <w:left w:type="dxa" w:w="80"/>
+              <w:bottom w:type="dxa" w:w="40"/>
+              <w:right w:type="dxa" w:w="80"/>
+            </w:tcMar>
+            <w:vAlign w:val="center"/>
+          </w:tcPr>
+          <w:p>
+            <w:pPr>
+              <w:spacing w:after="0" w:before="0"/>
+              <w:jc w:val="left"/>
+            </w:pPr>
+          </w:p>
+        </w:tc>
+        <w:tc>
+          <w:tcPr>
+            <w:tcW w:type="dxa" w:w="1500"/>
+            <w:tcBorders>
+              <w:top w:val="single" w:color="808080" w:sz="4"/>
+              <w:left w:val="single" w:color="808080" w:sz="4"/>
+              <w:bottom w:val="single" w:color="808080" w:sz="4"/>
+              <w:right w:val="single" w:color="808080" w:sz="4"/>
+            </w:tcBorders>
+            <w:tcMar>
+              <w:top w:type="dxa" w:w="40"/>
+              <w:left w:type="dxa" w:w="80"/>
+              <w:bottom w:type="dxa" w:w="40"/>
+              <w:right w:type="dxa" w:w="80"/>
+            </w:tcMar>
+            <w:vAlign w:val="center"/>
+          </w:tcPr>
+          <w:p>
+            <w:pPr>
+              <w:spacing w:after="0" w:before="0"/>
+              <w:jc w:val="center"/>
+            </w:pPr>
+            <w:r>
+              <w:rPr>
+                <w:rFonts w:ascii="Arial" w:cs="Arial" w:eastAsia="Arial" w:hAnsi="Arial"/>
+                <w:b/>
+                <w:bCs/>
+                <w:sz w:val="18"/>
+                <w:szCs w:val="18"/>
+              </w:rPr>
+              <w:t xml:space="preserve">63</w:t>
+            </w:r>
+          </w:p>
+        </w:tc>
+        <w:tc>
+          <w:tcPr>
+            <w:tcW w:type="dxa" w:w="1500"/>
+            <w:tcBorders>
+              <w:top w:val="single" w:color="808080" w:sz="4"/>
+              <w:left w:val="single" w:color="808080" w:sz="4"/>
+              <w:bottom w:val="single" w:color="808080" w:sz="4"/>
+              <w:right w:val="single" w:color="808080" w:sz="4"/>
+            </w:tcBorders>
+            <w:tcMar>
+              <w:top w:type="dxa" w:w="40"/>
+              <w:left w:type="dxa" w:w="80"/>
+              <w:bottom w:type="dxa" w:w="40"/>
+              <w:right w:type="dxa" w:w="80"/>
+            </w:tcMar>
+            <w:vAlign w:val="center"/>
+          </w:tcPr>
+          <w:p>
+            <w:pPr>
+              <w:spacing w:after="0" w:before="0"/>
+              <w:jc w:val="left"/>
+            </w:pPr>
+          </w:p>
+        </w:tc>
+        <w:tc>
+          <w:tcPr>
+            <w:tcW w:type="dxa" w:w="1700"/>
+            <w:tcBorders>
+              <w:top w:val="single" w:color="808080" w:sz="4"/>
+              <w:left w:val="single" w:color="808080" w:sz="4"/>
+              <w:bottom w:val="single" w:color="808080" w:sz="4"/>
+              <w:right w:val="single" w:color="808080" w:sz="4"/>
+            </w:tcBorders>
+            <w:tcMar>
+              <w:top w:type="dxa" w:w="40"/>
+              <w:left w:type="dxa" w:w="80"/>
+              <w:bottom w:type="dxa" w:w="40"/>
+              <w:right w:type="dxa" w:w="80"/>
+            </w:tcMar>
+            <w:vAlign w:val="center"/>
+          </w:tcPr>
+          <w:p>
+            <w:pPr>
+              <w:spacing w:after="0" w:before="0"/>
+              <w:jc w:val="left"/>
+            </w:pPr>
+          </w:p>
+        </w:tc>
+      </w:tr>
+      <w:tr>
+        <w:trPr>
+          <w:cantSplit/>
+        </w:trPr>
+        <w:tc>
+          <w:tcPr>
+            <w:tcW w:type="dxa" w:w="1100"/>
+            <w:tcBorders>
+              <w:top w:val="single" w:color="808080" w:sz="4"/>
+              <w:left w:val="single" w:color="808080" w:sz="4"/>
+              <w:bottom w:val="single" w:color="808080" w:sz="4"/>
+              <w:right w:val="single" w:color="808080" w:sz="4"/>
+            </w:tcBorders>
+            <w:tcMar>
+              <w:top w:type="dxa" w:w="40"/>
+              <w:left w:type="dxa" w:w="80"/>
+              <w:bottom w:type="dxa" w:w="40"/>
+              <w:right w:type="dxa" w:w="80"/>
+            </w:tcMar>
+            <w:vAlign w:val="center"/>
+          </w:tcPr>
+          <w:p>
+            <w:pPr>
+              <w:spacing w:after="0" w:before="0"/>
+              <w:jc w:val="left"/>
+            </w:pPr>
+            <w:r>
+              <w:rPr>
+                <w:rFonts w:ascii="Arial" w:cs="Arial" w:eastAsia="Arial" w:hAnsi="Arial"/>
+                <w:b/>
+                <w:bCs/>
+                <w:sz w:val="18"/>
+                <w:szCs w:val="18"/>
+              </w:rPr>
+              <w:t xml:space="preserve">s</w:t>
+            </w:r>
+          </w:p>
+        </w:tc>
+        <w:tc>
+          <w:tcPr>
+            <w:tcW w:type="dxa" w:w="1500"/>
+            <w:tcBorders>
+              <w:top w:val="single" w:color="808080" w:sz="4"/>
+              <w:left w:val="single" w:color="808080" w:sz="4"/>
+              <w:bottom w:val="single" w:color="808080" w:sz="4"/>
+              <w:right w:val="single" w:color="808080" w:sz="4"/>
+            </w:tcBorders>
+            <w:tcMar>
+              <w:top w:type="dxa" w:w="40"/>
+              <w:left w:type="dxa" w:w="80"/>
+              <w:bottom w:type="dxa" w:w="40"/>
+              <w:right w:type="dxa" w:w="80"/>
+            </w:tcMar>
+            <w:vAlign w:val="center"/>
+          </w:tcPr>
+          <w:p>
+            <w:pPr>
+              <w:spacing w:after="0" w:before="0"/>
+              <w:jc w:val="center"/>
+            </w:pPr>
+            <w:r>
+              <w:rPr>
+                <w:rFonts w:ascii="Arial" w:cs="Arial" w:eastAsia="Arial" w:hAnsi="Arial"/>
+                <w:b/>
+                <w:bCs/>
+                <w:sz w:val="18"/>
+                <w:szCs w:val="18"/>
+              </w:rPr>
+              <w:t xml:space="preserve">3.16</w:t>
+            </w:r>
+          </w:p>
+        </w:tc>
+        <w:tc>
+          <w:tcPr>
+            <w:tcW w:type="dxa" w:w="1500"/>
+            <w:tcBorders>
+              <w:top w:val="single" w:color="808080" w:sz="4"/>
+              <w:left w:val="single" w:color="808080" w:sz="4"/>
+              <w:bottom w:val="single" w:color="808080" w:sz="4"/>
+              <w:right w:val="single" w:color="808080" w:sz="4"/>
+            </w:tcBorders>
+            <w:tcMar>
+              <w:top w:type="dxa" w:w="40"/>
+              <w:left w:type="dxa" w:w="80"/>
+              <w:bottom w:type="dxa" w:w="40"/>
+              <w:right w:type="dxa" w:w="80"/>
+            </w:tcMar>
+            <w:vAlign w:val="center"/>
+          </w:tcPr>
+          <w:p>
+            <w:pPr>
+              <w:spacing w:after="0" w:before="0"/>
+              <w:jc w:val="left"/>
+            </w:pPr>
+          </w:p>
+        </w:tc>
+        <w:tc>
+          <w:tcPr>
+            <w:tcW w:type="dxa" w:w="1700"/>
+            <w:tcBorders>
+              <w:top w:val="single" w:color="808080" w:sz="4"/>
+              <w:left w:val="single" w:color="808080" w:sz="4"/>
+              <w:bottom w:val="single" w:color="808080" w:sz="4"/>
+              <w:right w:val="single" w:color="808080" w:sz="4"/>
+            </w:tcBorders>
+            <w:tcMar>
+              <w:top w:type="dxa" w:w="40"/>
+              <w:left w:type="dxa" w:w="80"/>
+              <w:bottom w:type="dxa" w:w="40"/>
+              <w:right w:type="dxa" w:w="80"/>
+            </w:tcMar>
+            <w:vAlign w:val="center"/>
+          </w:tcPr>
+          <w:p>
+            <w:pPr>
+              <w:spacing w:after="0" w:before="0"/>
+              <w:jc w:val="left"/>
+            </w:pPr>
+          </w:p>
+        </w:tc>
+        <w:tc>
+          <w:tcPr>
+            <w:tcW w:type="dxa" w:w="1500"/>
+            <w:tcBorders>
+              <w:top w:val="single" w:color="808080" w:sz="4"/>
+              <w:left w:val="single" w:color="808080" w:sz="4"/>
+              <w:bottom w:val="single" w:color="808080" w:sz="4"/>
+              <w:right w:val="single" w:color="808080" w:sz="4"/>
+            </w:tcBorders>
+            <w:tcMar>
+              <w:top w:type="dxa" w:w="40"/>
+              <w:left w:type="dxa" w:w="80"/>
+              <w:bottom w:type="dxa" w:w="40"/>
+              <w:right w:type="dxa" w:w="80"/>
+            </w:tcMar>
+            <w:vAlign w:val="center"/>
+          </w:tcPr>
+          <w:p>
+            <w:pPr>
+              <w:spacing w:after="0" w:before="0"/>
+              <w:jc w:val="center"/>
+            </w:pPr>
+            <w:r>
+              <w:rPr>
+                <w:rFonts w:ascii="Arial" w:cs="Arial" w:eastAsia="Arial" w:hAnsi="Arial"/>
+                <w:b/>
+                <w:bCs/>
+                <w:sz w:val="18"/>
+                <w:szCs w:val="18"/>
+              </w:rPr>
+              <w:t xml:space="preserve">3.16</w:t>
+            </w:r>
+          </w:p>
+        </w:tc>
+        <w:tc>
+          <w:tcPr>
+            <w:tcW w:type="dxa" w:w="1500"/>
+            <w:tcBorders>
+              <w:top w:val="single" w:color="808080" w:sz="4"/>
+              <w:left w:val="single" w:color="808080" w:sz="4"/>
+              <w:bottom w:val="single" w:color="808080" w:sz="4"/>
+              <w:right w:val="single" w:color="808080" w:sz="4"/>
+            </w:tcBorders>
+            <w:tcMar>
+              <w:top w:type="dxa" w:w="40"/>
+              <w:left w:type="dxa" w:w="80"/>
+              <w:bottom w:type="dxa" w:w="40"/>
+              <w:right w:type="dxa" w:w="80"/>
+            </w:tcMar>
+            <w:vAlign w:val="center"/>
+          </w:tcPr>
+          <w:p>
+            <w:pPr>
+              <w:spacing w:after="0" w:before="0"/>
+              <w:jc w:val="left"/>
+            </w:pPr>
+          </w:p>
+        </w:tc>
+        <w:tc>
+          <w:tcPr>
+            <w:tcW w:type="dxa" w:w="1700"/>
+            <w:tcBorders>
+              <w:top w:val="single" w:color="808080" w:sz="4"/>
+              <w:left w:val="single" w:color="808080" w:sz="4"/>
+              <w:bottom w:val="single" w:color="808080" w:sz="4"/>
+              <w:right w:val="single" w:color="808080" w:sz="4"/>
+            </w:tcBorders>
+            <w:tcMar>
+              <w:top w:type="dxa" w:w="40"/>
+              <w:left w:type="dxa" w:w="80"/>
+              <w:bottom w:type="dxa" w:w="40"/>
+              <w:right w:type="dxa" w:w="80"/>
+            </w:tcMar>
+            <w:vAlign w:val="center"/>
+          </w:tcPr>
+          <w:p>
+            <w:pPr>
+              <w:spacing w:after="0" w:before="0"/>
+              <w:jc w:val="left"/>
+            </w:pPr>
           </w:p>
         </w:tc>
       </w:tr>
@@ -5231,6 +5841,30 @@
       <w:pPr>
         <w:spacing w:after="80" w:before="0"/>
       </w:pPr>
+    </w:p>
+    <w:p>
+      <w:pPr>
+        <w:keepLines/>
+        <w:spacing w:after="60" w:before="40"/>
+      </w:pPr>
+      <w:r>
+        <w:rPr>
+          <w:rFonts w:ascii="Arial" w:cs="Arial" w:eastAsia="Arial" w:hAnsi="Arial"/>
+          <w:b/>
+          <w:bCs/>
+          <w:sz w:val="19"/>
+          <w:szCs w:val="19"/>
+        </w:rPr>
+        <w:t xml:space="preserve">Check against Sheets:</w:t>
+      </w:r>
+      <w:r>
+        <w:rPr>
+          <w:rFonts w:ascii="Arial" w:cs="Arial" w:eastAsia="Arial" w:hAnsi="Arial"/>
+          <w:sz w:val="19"/>
+          <w:szCs w:val="19"/>
+        </w:rPr>
+        <w:t xml:space="preserve"> =T.TEST gives p = 0.1720 (df = 8, |t| = 1.500, two-tailed critical value 2.306).</w:t>
+      </w:r>
     </w:p>
     <w:p>
       <w:pPr>
@@ -5267,7 +5901,7 @@
           <w:sz w:val="19"/>
           <w:szCs w:val="19"/>
         </w:rPr>
-        <w:t xml:space="preserve">Reading LINEST Row 1 in the order of the X columns</w:t>
+        <w:t xml:space="preserve">Reading the LINEST table backwards</w:t>
       </w:r>
       <w:r>
         <w:rPr>
@@ -5275,7 +5909,25 @@
           <w:sz w:val="19"/>
           <w:szCs w:val="19"/>
         </w:rPr>
-        <w:t xml:space="preserve"> (Q10): it is reversed.</w:t>
+        <w:t xml:space="preserve"> (2a): Col A is the </w:t>
+      </w:r>
+      <w:r>
+        <w:rPr>
+          <w:rFonts w:ascii="Arial" w:cs="Arial" w:eastAsia="Arial" w:hAnsi="Arial"/>
+          <w:b/>
+          <w:bCs/>
+          <w:sz w:val="19"/>
+          <w:szCs w:val="19"/>
+        </w:rPr>
+        <w:t xml:space="preserve">last</w:t>
+      </w:r>
+      <w:r>
+        <w:rPr>
+          <w:rFonts w:ascii="Arial" w:cs="Arial" w:eastAsia="Arial" w:hAnsi="Arial"/>
+          <w:sz w:val="19"/>
+          <w:szCs w:val="19"/>
+        </w:rPr>
+        <w:t xml:space="preserve"> X column and Col D the intercept. The layout table is printed on the paper, so give no credit for guessing the order; apply follow-through if the order is wrong but the method is right.</w:t>
       </w:r>
     </w:p>
     <w:p>
@@ -5296,7 +5948,7 @@
           <w:sz w:val="19"/>
           <w:szCs w:val="19"/>
         </w:rPr>
-        <w:t xml:space="preserve">“Temperature must be positive”</w:t>
+        <w:t xml:space="preserve">“Per customer” and “causes”</w:t>
       </w:r>
       <w:r>
         <w:rPr>
@@ -5304,7 +5956,43 @@
           <w:sz w:val="19"/>
           <w:szCs w:val="19"/>
         </w:rPr>
-        <w:t xml:space="preserve"> (Q10): the data say otherwise; mark the reasoning, not agreement with intuition.</w:t>
+        <w:t xml:space="preserve"> (2b): the coefficients describe the </w:t>
+      </w:r>
+      <w:r>
+        <w:rPr>
+          <w:rFonts w:ascii="Arial" w:cs="Arial" w:eastAsia="Arial" w:hAnsi="Arial"/>
+          <w:b/>
+          <w:bCs/>
+          <w:sz w:val="19"/>
+          <w:szCs w:val="19"/>
+        </w:rPr>
+        <w:t xml:space="preserve">daily total</w:t>
+      </w:r>
+      <w:r>
+        <w:rPr>
+          <w:rFonts w:ascii="Arial" w:cs="Arial" w:eastAsia="Arial" w:hAnsi="Arial"/>
+          <w:sz w:val="19"/>
+          <w:szCs w:val="19"/>
+        </w:rPr>
+        <w:t xml:space="preserve"> and an </w:t>
+      </w:r>
+      <w:r>
+        <w:rPr>
+          <w:rFonts w:ascii="Arial" w:cs="Arial" w:eastAsia="Arial" w:hAnsi="Arial"/>
+          <w:b/>
+          <w:bCs/>
+          <w:sz w:val="19"/>
+          <w:szCs w:val="19"/>
+        </w:rPr>
+        <w:t xml:space="preserve">association</w:t>
+      </w:r>
+      <w:r>
+        <w:rPr>
+          <w:rFonts w:ascii="Arial" w:cs="Arial" w:eastAsia="Arial" w:hAnsi="Arial"/>
+          <w:sz w:val="19"/>
+          <w:szCs w:val="19"/>
+        </w:rPr>
+        <w:t xml:space="preserve">.</w:t>
       </w:r>
     </w:p>
     <w:p>
@@ -5325,7 +6013,7 @@
           <w:sz w:val="19"/>
           <w:szCs w:val="19"/>
         </w:rPr>
-        <w:t xml:space="preserve">Reading “not significant” as “no effect”</w:t>
+        <w:t xml:space="preserve">Reading R² as “percent correct”</w:t>
       </w:r>
       <w:r>
         <w:rPr>
@@ -5333,7 +6021,7 @@
           <w:sz w:val="19"/>
           <w:szCs w:val="19"/>
         </w:rPr>
-        <w:t xml:space="preserve"> (Q12).</w:t>
+        <w:t xml:space="preserve"> (2b): R² is the share of variation explained.</w:t>
       </w:r>
     </w:p>
     <w:p>
@@ -5354,7 +6042,7 @@
           <w:sz w:val="19"/>
           <w:szCs w:val="19"/>
         </w:rPr>
-        <w:t xml:space="preserve">“M5 is best because R² is higher”</w:t>
+        <w:t xml:space="preserve">Using absolute values</w:t>
       </w:r>
       <w:r>
         <w:rPr>
@@ -5362,7 +6050,7 @@
           <w:sz w:val="19"/>
           <w:szCs w:val="19"/>
         </w:rPr>
-        <w:t xml:space="preserve"> (Q16).</w:t>
+        <w:t xml:space="preserve"> (3a-ii): MAE averages the sizes of the errors, so signs must not cancel.</w:t>
       </w:r>
     </w:p>
     <w:p>
@@ -5383,7 +6071,7 @@
           <w:sz w:val="19"/>
           <w:szCs w:val="19"/>
         </w:rPr>
-        <w:t xml:space="preserve">Keeping or deleting the extreme day without looking at the residual</w:t>
+        <w:t xml:space="preserve">Reading p as the probability that H₀ is true</w:t>
       </w:r>
       <w:r>
         <w:rPr>
@@ -5391,7 +6079,7 @@
           <w:sz w:val="19"/>
           <w:szCs w:val="19"/>
         </w:rPr>
-        <w:t xml:space="preserve"> (Q6).</w:t>
+        <w:t xml:space="preserve"> (4c). Credit “if there were no real effect, a result this extreme would be rare”.</w:t>
       </w:r>
     </w:p>
     <w:sectPr>
@@ -5541,7 +6229,7 @@
         <w:sz w:val="16"/>
         <w:szCs w:val="16"/>
       </w:rPr>
-      <w:t xml:space="preserve">MAT282 · Practice Midterm · ANSWER KEY</w:t>
+      <w:t xml:space="preserve">MAT282 · Practice Midterm · Form P · Practice · ANSWER KEY</w:t>
     </w:r>
     <w:r>
       <w:rPr>

</xml_diff>